<commit_message>
Phase 2 complete: status layer, bubbles, animations, boot sequence, Conjuration Chamber
</commit_message>
<xml_diff>
--- a/Referentia/luminarious_build_journal.docx
+++ b/Referentia/luminarious_build_journal.docx
@@ -1375,7 +1375,85 @@
             </w:pPr>
             <w:r>
               <w:rPr/>
-              <w:t>Undecided</w:t>
+              <w:t>gpt-5.2</w:t>
+            </w:r>
+          </w:p>
+        </w:tc>
+      </w:tr>
+    </w:tbl>
+    <w:p>
+      <w:pPr>
+        <w:pStyle w:val="Normal"/>
+        <w:spacing w:before="80" w:after="0"/>
+        <w:rPr/>
+      </w:pPr>
+      <w:r>
+        <w:rPr/>
+      </w:r>
+    </w:p>
+    <w:tbl>
+      <w:tblPr>
+        <w:tblW w:w="9360" w:type="dxa"/>
+        <w:jc w:val="left"/>
+        <w:tblInd w:w="0" w:type="dxa"/>
+        <w:tblLayout w:type="fixed"/>
+        <w:tblCellMar>
+          <w:top w:w="40" w:type="dxa"/>
+          <w:left w:w="0" w:type="dxa"/>
+          <w:bottom w:w="40" w:type="dxa"/>
+          <w:right w:w="120" w:type="dxa"/>
+        </w:tblCellMar>
+      </w:tblPr>
+      <w:tblGrid>
+        <w:gridCol w:w="3023"/>
+        <w:gridCol w:w="6336"/>
+      </w:tblGrid>
+      <w:tr>
+        <w:trPr/>
+        <w:tc>
+          <w:tcPr>
+            <w:tcW w:w="3023" w:type="dxa"/>
+            <w:tcBorders>
+              <w:bottom w:val="single" w:sz="2" w:space="0" w:color="AAAAAA"/>
+            </w:tcBorders>
+          </w:tcPr>
+          <w:p>
+            <w:pPr>
+              <w:pStyle w:val="Normal"/>
+              <w:rPr/>
+            </w:pPr>
+            <w:r>
+              <w:rPr>
+                <w:rFonts w:eastAsia="Georgia" w:cs="Georgia"/>
+                <w:b/>
+                <w:bCs/>
+                <w:color w:val="5A6070"/>
+                <w:sz w:val="19"/>
+                <w:szCs w:val="19"/>
+              </w:rPr>
+              <w:t>Model — Smart:</w:t>
+            </w:r>
+          </w:p>
+        </w:tc>
+        <w:tc>
+          <w:tcPr>
+            <w:tcW w:w="6336" w:type="dxa"/>
+            <w:tcBorders>
+              <w:bottom w:val="single" w:sz="2" w:space="0" w:color="AAAAAA"/>
+            </w:tcBorders>
+            <w:tcMar>
+              <w:left w:w="60" w:type="dxa"/>
+              <w:right w:w="0" w:type="dxa"/>
+            </w:tcMar>
+          </w:tcPr>
+          <w:p>
+            <w:pPr>
+              <w:pStyle w:val="Normal"/>
+              <w:rPr/>
+            </w:pPr>
+            <w:r>
+              <w:rPr/>
+              <w:t>gpt-5-mini</w:t>
             </w:r>
           </w:p>
         </w:tc>
@@ -1431,7 +1509,7 @@
                 <w:sz w:val="19"/>
                 <w:szCs w:val="19"/>
               </w:rPr>
-              <w:t>Model — Smart:</w:t>
+              <w:t>API key env var:</w:t>
             </w:r>
           </w:p>
         </w:tc>
@@ -1453,7 +1531,7 @@
             </w:pPr>
             <w:r>
               <w:rPr/>
-              <w:t>Undecided</w:t>
+              <w:t>OPENAI_API_KEY</w:t>
             </w:r>
           </w:p>
         </w:tc>
@@ -1509,7 +1587,7 @@
                 <w:sz w:val="19"/>
                 <w:szCs w:val="19"/>
               </w:rPr>
-              <w:t>API key env var:</w:t>
+              <w:t>Base URL (if custom):</w:t>
             </w:r>
           </w:p>
         </w:tc>
@@ -1531,7 +1609,6 @@
             </w:pPr>
             <w:r>
               <w:rPr/>
-              <w:t>OPENAI_API_KEY</w:t>
             </w:r>
           </w:p>
         </w:tc>
@@ -1545,6 +1622,126 @@
       </w:pPr>
       <w:r>
         <w:rPr/>
+      </w:r>
+    </w:p>
+    <w:p>
+      <w:pPr>
+        <w:pStyle w:val="Normal"/>
+        <w:spacing w:before="120" w:after="0"/>
+        <w:rPr/>
+      </w:pPr>
+      <w:r>
+        <w:rPr/>
+      </w:r>
+    </w:p>
+    <w:p>
+      <w:pPr>
+        <w:pStyle w:val="Normal"/>
+        <w:rPr/>
+      </w:pPr>
+      <w:r>
+        <w:rPr/>
+      </w:r>
+      <w:r>
+        <w:br w:type="page"/>
+      </w:r>
+    </w:p>
+    <w:p>
+      <w:pPr>
+        <w:pStyle w:val="Normal"/>
+        <w:spacing w:before="0" w:after="0"/>
+        <w:jc w:val="center"/>
+        <w:rPr/>
+      </w:pPr>
+      <w:r>
+        <w:rPr>
+          <w:rFonts w:eastAsia="Georgia" w:cs="Georgia"/>
+          <w:b/>
+          <w:bCs/>
+          <w:caps/>
+          <w:color w:val="B8860B"/>
+          <w:sz w:val="40"/>
+          <w:szCs w:val="40"/>
+        </w:rPr>
+        <w:t>PHASE 1</w:t>
+      </w:r>
+    </w:p>
+    <w:p>
+      <w:pPr>
+        <w:pStyle w:val="Normal"/>
+        <w:spacing w:before="30" w:after="0"/>
+        <w:jc w:val="center"/>
+        <w:rPr/>
+      </w:pPr>
+      <w:r>
+        <w:rPr>
+          <w:rFonts w:eastAsia="Georgia" w:cs="Georgia"/>
+          <w:i/>
+          <w:iCs/>
+          <w:color w:val="C68B2A"/>
+          <w:sz w:val="28"/>
+          <w:szCs w:val="28"/>
+        </w:rPr>
+        <w:t>The Naming Pass</w:t>
+      </w:r>
+    </w:p>
+    <w:p>
+      <w:pPr>
+        <w:pStyle w:val="Normal"/>
+        <w:spacing w:before="40" w:after="0"/>
+        <w:rPr/>
+      </w:pPr>
+      <w:r>
+        <w:rPr/>
+      </w:r>
+    </w:p>
+    <w:p>
+      <w:pPr>
+        <w:pStyle w:val="Normal"/>
+        <w:jc w:val="center"/>
+        <w:rPr/>
+      </w:pPr>
+      <w:r>
+        <w:rPr>
+          <w:rFonts w:eastAsia="Georgia" w:cs="Georgia"/>
+          <w:i/>
+          <w:iCs/>
+          <w:color w:val="5A6070"/>
+          <w:sz w:val="18"/>
+          <w:szCs w:val="18"/>
+        </w:rPr>
+        <w:t>Rename modules. Populate module stubs. Establish lore names throughout.</w:t>
+      </w:r>
+    </w:p>
+    <w:p>
+      <w:pPr>
+        <w:pStyle w:val="Normal"/>
+        <w:pBdr>
+          <w:bottom w:val="single" w:sz="4" w:space="4" w:color="C9A84C"/>
+        </w:pBdr>
+        <w:spacing w:before="160" w:after="160"/>
+        <w:rPr/>
+      </w:pPr>
+      <w:r>
+        <w:rPr/>
+      </w:r>
+    </w:p>
+    <w:p>
+      <w:pPr>
+        <w:pStyle w:val="Heading2"/>
+        <w:spacing w:before="320" w:after="100"/>
+        <w:rPr/>
+      </w:pPr>
+      <w:r>
+        <w:rPr>
+          <w:rFonts w:eastAsia="Georgia" w:cs="Georgia" w:ascii="Georgia" w:hAnsi="Georgia"/>
+          <w:b/>
+          <w:bCs/>
+          <w:color w:val="C68B2A"/>
+          <w:sz w:val="28"/>
+          <w:szCs w:val="28"/>
+        </w:rPr>
+        <w:t>Pre-Build State</w:t>
       </w:r>
     </w:p>
     <w:tbl>
@@ -1587,7 +1784,7 @@
                 <w:sz w:val="19"/>
                 <w:szCs w:val="19"/>
               </w:rPr>
-              <w:t>Base URL (if custom):</w:t>
+              <w:t>Date started:</w:t>
             </w:r>
           </w:p>
         </w:tc>
@@ -1609,6 +1806,7 @@
             </w:pPr>
             <w:r>
               <w:rPr/>
+              <w:t>03 March 2026</w:t>
             </w:r>
           </w:p>
         </w:tc>
@@ -1622,126 +1820,6 @@
       </w:pPr>
       <w:r>
         <w:rPr/>
-      </w:r>
-    </w:p>
-    <w:p>
-      <w:pPr>
-        <w:pStyle w:val="Normal"/>
-        <w:spacing w:before="120" w:after="0"/>
-        <w:rPr/>
-      </w:pPr>
-      <w:r>
-        <w:rPr/>
-      </w:r>
-    </w:p>
-    <w:p>
-      <w:pPr>
-        <w:pStyle w:val="Normal"/>
-        <w:rPr/>
-      </w:pPr>
-      <w:r>
-        <w:rPr/>
-      </w:r>
-      <w:r>
-        <w:br w:type="page"/>
-      </w:r>
-    </w:p>
-    <w:p>
-      <w:pPr>
-        <w:pStyle w:val="Normal"/>
-        <w:spacing w:before="0" w:after="0"/>
-        <w:jc w:val="center"/>
-        <w:rPr/>
-      </w:pPr>
-      <w:r>
-        <w:rPr>
-          <w:rFonts w:eastAsia="Georgia" w:cs="Georgia"/>
-          <w:b/>
-          <w:bCs/>
-          <w:caps/>
-          <w:color w:val="B8860B"/>
-          <w:sz w:val="40"/>
-          <w:szCs w:val="40"/>
-        </w:rPr>
-        <w:t>PHASE 1</w:t>
-      </w:r>
-    </w:p>
-    <w:p>
-      <w:pPr>
-        <w:pStyle w:val="Normal"/>
-        <w:spacing w:before="30" w:after="0"/>
-        <w:jc w:val="center"/>
-        <w:rPr/>
-      </w:pPr>
-      <w:r>
-        <w:rPr>
-          <w:rFonts w:eastAsia="Georgia" w:cs="Georgia"/>
-          <w:i/>
-          <w:iCs/>
-          <w:color w:val="C68B2A"/>
-          <w:sz w:val="28"/>
-          <w:szCs w:val="28"/>
-        </w:rPr>
-        <w:t>The Naming Pass</w:t>
-      </w:r>
-    </w:p>
-    <w:p>
-      <w:pPr>
-        <w:pStyle w:val="Normal"/>
-        <w:spacing w:before="40" w:after="0"/>
-        <w:rPr/>
-      </w:pPr>
-      <w:r>
-        <w:rPr/>
-      </w:r>
-    </w:p>
-    <w:p>
-      <w:pPr>
-        <w:pStyle w:val="Normal"/>
-        <w:jc w:val="center"/>
-        <w:rPr/>
-      </w:pPr>
-      <w:r>
-        <w:rPr>
-          <w:rFonts w:eastAsia="Georgia" w:cs="Georgia"/>
-          <w:i/>
-          <w:iCs/>
-          <w:color w:val="5A6070"/>
-          <w:sz w:val="18"/>
-          <w:szCs w:val="18"/>
-        </w:rPr>
-        <w:t>Rename modules. Populate module stubs. Establish lore names throughout.</w:t>
-      </w:r>
-    </w:p>
-    <w:p>
-      <w:pPr>
-        <w:pStyle w:val="Normal"/>
-        <w:pBdr>
-          <w:bottom w:val="single" w:sz="4" w:space="4" w:color="C9A84C"/>
-        </w:pBdr>
-        <w:spacing w:before="160" w:after="160"/>
-        <w:rPr/>
-      </w:pPr>
-      <w:r>
-        <w:rPr/>
-      </w:r>
-    </w:p>
-    <w:p>
-      <w:pPr>
-        <w:pStyle w:val="Heading2"/>
-        <w:spacing w:before="320" w:after="100"/>
-        <w:rPr/>
-      </w:pPr>
-      <w:r>
-        <w:rPr>
-          <w:rFonts w:eastAsia="Georgia" w:cs="Georgia" w:ascii="Georgia" w:hAnsi="Georgia"/>
-          <w:b/>
-          <w:bCs/>
-          <w:color w:val="C68B2A"/>
-          <w:sz w:val="28"/>
-          <w:szCs w:val="28"/>
-        </w:rPr>
-        <w:t>Pre-Build State</w:t>
       </w:r>
     </w:p>
     <w:tbl>
@@ -1784,7 +1862,7 @@
                 <w:sz w:val="19"/>
                 <w:szCs w:val="19"/>
               </w:rPr>
-              <w:t>Date started:</w:t>
+              <w:t>Git branch:</w:t>
             </w:r>
           </w:p>
         </w:tc>
@@ -1806,7 +1884,7 @@
             </w:pPr>
             <w:r>
               <w:rPr/>
-              <w:t>03 March 2026</w:t>
+              <w:t>phase-1-naming-pass</w:t>
             </w:r>
           </w:p>
         </w:tc>
@@ -1862,7 +1940,7 @@
                 <w:sz w:val="19"/>
                 <w:szCs w:val="19"/>
               </w:rPr>
-              <w:t>Git branch:</w:t>
+              <w:t>Tests passing at start:</w:t>
             </w:r>
           </w:p>
         </w:tc>
@@ -1884,7 +1962,7 @@
             </w:pPr>
             <w:r>
               <w:rPr/>
-              <w:t>phase-1-naming-pass</w:t>
+              <w:t>NA</w:t>
             </w:r>
           </w:p>
         </w:tc>
@@ -1898,6 +1976,1748 @@
       </w:pPr>
       <w:r>
         <w:rPr/>
+      </w:r>
+    </w:p>
+    <w:p>
+      <w:pPr>
+        <w:pStyle w:val="Normal"/>
+        <w:spacing w:before="60" w:after="0"/>
+        <w:rPr/>
+      </w:pPr>
+      <w:r>
+        <w:rPr/>
+      </w:r>
+    </w:p>
+    <w:tbl>
+      <w:tblPr>
+        <w:tblW w:w="9360" w:type="dxa"/>
+        <w:jc w:val="left"/>
+        <w:tblInd w:w="0" w:type="dxa"/>
+        <w:tblLayout w:type="fixed"/>
+        <w:tblCellMar>
+          <w:top w:w="60" w:type="dxa"/>
+          <w:left w:w="120" w:type="dxa"/>
+          <w:bottom w:w="60" w:type="dxa"/>
+          <w:right w:w="120" w:type="dxa"/>
+        </w:tblCellMar>
+      </w:tblPr>
+      <w:tblGrid>
+        <w:gridCol w:w="9360"/>
+      </w:tblGrid>
+      <w:tr>
+        <w:trPr/>
+        <w:tc>
+          <w:tcPr>
+            <w:tcW w:w="9360" w:type="dxa"/>
+            <w:tcBorders>
+              <w:top w:val="single" w:sz="2" w:space="0" w:color="AAAAAA"/>
+              <w:left w:val="single" w:sz="2" w:space="0" w:color="AAAAAA"/>
+              <w:bottom w:val="single" w:sz="2" w:space="0" w:color="AAAAAA"/>
+              <w:right w:val="single" w:sz="2" w:space="0" w:color="AAAAAA"/>
+            </w:tcBorders>
+          </w:tcPr>
+          <w:p>
+            <w:pPr>
+              <w:pStyle w:val="Normal"/>
+              <w:rPr/>
+            </w:pPr>
+            <w:r>
+              <w:rPr>
+                <w:rFonts w:eastAsia="Georgia" w:cs="Georgia"/>
+                <w:b/>
+                <w:bCs/>
+                <w:color w:val="5A6070"/>
+                <w:sz w:val="18"/>
+                <w:szCs w:val="18"/>
+              </w:rPr>
+              <w:t>What I understand about this phase before starting:</w:t>
+            </w:r>
+          </w:p>
+        </w:tc>
+      </w:tr>
+      <w:tr>
+        <w:trPr/>
+        <w:tc>
+          <w:tcPr>
+            <w:tcW w:w="9360" w:type="dxa"/>
+            <w:tcBorders>
+              <w:left w:val="single" w:sz="2" w:space="0" w:color="AAAAAA"/>
+              <w:bottom w:val="single" w:sz="2" w:space="0" w:color="AAAAAA"/>
+              <w:right w:val="single" w:sz="2" w:space="0" w:color="AAAAAA"/>
+            </w:tcBorders>
+          </w:tcPr>
+          <w:p>
+            <w:pPr>
+              <w:pStyle w:val="Normal"/>
+              <w:rPr/>
+            </w:pPr>
+            <w:r>
+              <w:rPr/>
+              <w:t>I have developed a considerable bank of philosophy, lore, and build content.</w:t>
+            </w:r>
+          </w:p>
+        </w:tc>
+      </w:tr>
+      <w:tr>
+        <w:trPr/>
+        <w:tc>
+          <w:tcPr>
+            <w:tcW w:w="9360" w:type="dxa"/>
+            <w:tcBorders>
+              <w:left w:val="single" w:sz="2" w:space="0" w:color="AAAAAA"/>
+              <w:bottom w:val="single" w:sz="2" w:space="0" w:color="AAAAAA"/>
+              <w:right w:val="single" w:sz="2" w:space="0" w:color="AAAAAA"/>
+            </w:tcBorders>
+          </w:tcPr>
+          <w:p>
+            <w:pPr>
+              <w:pStyle w:val="Normal"/>
+              <w:rPr/>
+            </w:pPr>
+            <w:r>
+              <w:rPr/>
+              <w:t>Now, on the first day of the Mercurial Retrograde, I am  commencing phase 1.</w:t>
+            </w:r>
+          </w:p>
+        </w:tc>
+      </w:tr>
+      <w:tr>
+        <w:trPr/>
+        <w:tc>
+          <w:tcPr>
+            <w:tcW w:w="9360" w:type="dxa"/>
+            <w:tcBorders>
+              <w:left w:val="single" w:sz="2" w:space="0" w:color="AAAAAA"/>
+              <w:bottom w:val="single" w:sz="2" w:space="0" w:color="AAAAAA"/>
+              <w:right w:val="single" w:sz="2" w:space="0" w:color="AAAAAA"/>
+            </w:tcBorders>
+          </w:tcPr>
+          <w:p>
+            <w:pPr>
+              <w:pStyle w:val="Normal"/>
+              <w:rPr/>
+            </w:pPr>
+            <w:r>
+              <w:rPr/>
+              <w:t>This phase simply eases in by renaming some conventions.</w:t>
+            </w:r>
+          </w:p>
+        </w:tc>
+      </w:tr>
+    </w:tbl>
+    <w:p>
+      <w:pPr>
+        <w:pStyle w:val="Normal"/>
+        <w:spacing w:before="120" w:after="0"/>
+        <w:rPr/>
+      </w:pPr>
+      <w:r>
+        <w:rPr/>
+      </w:r>
+    </w:p>
+    <w:p>
+      <w:pPr>
+        <w:pStyle w:val="Heading2"/>
+        <w:spacing w:before="320" w:after="100"/>
+        <w:rPr/>
+      </w:pPr>
+      <w:r>
+        <w:rPr>
+          <w:rFonts w:eastAsia="Georgia" w:cs="Georgia" w:ascii="Georgia" w:hAnsi="Georgia"/>
+          <w:b/>
+          <w:bCs/>
+          <w:color w:val="C68B2A"/>
+          <w:sz w:val="28"/>
+          <w:szCs w:val="28"/>
+        </w:rPr>
+        <w:t>Decisions Made</w:t>
+      </w:r>
+    </w:p>
+    <w:p>
+      <w:pPr>
+        <w:pStyle w:val="Normal"/>
+        <w:pBdr>
+          <w:left w:val="single" w:sz="12" w:space="8" w:color="4E8B6F"/>
+        </w:pBdr>
+        <w:spacing w:before="100" w:after="100"/>
+        <w:ind w:left="360"/>
+        <w:rPr/>
+      </w:pPr>
+      <w:r>
+        <w:rPr>
+          <w:rFonts w:eastAsia="Georgia" w:cs="Georgia"/>
+          <w:i/>
+          <w:iCs/>
+          <w:color w:val="4E8B6F"/>
+          <w:sz w:val="21"/>
+          <w:szCs w:val="21"/>
+        </w:rPr>
+        <w:t xml:space="preserve">◆  </w:t>
+      </w:r>
+      <w:r>
+        <w:rPr>
+          <w:rFonts w:eastAsia="Georgia" w:cs="Georgia"/>
+          <w:i/>
+          <w:iCs/>
+          <w:color w:val="4E8B6F"/>
+          <w:sz w:val="21"/>
+          <w:szCs w:val="21"/>
+        </w:rPr>
+        <w:t>Record choices here as you make them — not at the end. One line per decision is enough.</w:t>
+      </w:r>
+    </w:p>
+    <w:p>
+      <w:pPr>
+        <w:pStyle w:val="Normal"/>
+        <w:spacing w:before="60" w:after="0"/>
+        <w:rPr/>
+      </w:pPr>
+      <w:r>
+        <w:rPr/>
+      </w:r>
+    </w:p>
+    <w:tbl>
+      <w:tblPr>
+        <w:tblW w:w="9360" w:type="dxa"/>
+        <w:jc w:val="left"/>
+        <w:tblInd w:w="0" w:type="dxa"/>
+        <w:tblLayout w:type="fixed"/>
+        <w:tblCellMar>
+          <w:top w:w="60" w:type="dxa"/>
+          <w:left w:w="120" w:type="dxa"/>
+          <w:bottom w:w="60" w:type="dxa"/>
+          <w:right w:w="120" w:type="dxa"/>
+        </w:tblCellMar>
+      </w:tblPr>
+      <w:tblGrid>
+        <w:gridCol w:w="9360"/>
+      </w:tblGrid>
+      <w:tr>
+        <w:trPr/>
+        <w:tc>
+          <w:tcPr>
+            <w:tcW w:w="9360" w:type="dxa"/>
+            <w:tcBorders>
+              <w:top w:val="single" w:sz="2" w:space="0" w:color="AAAAAA"/>
+              <w:left w:val="single" w:sz="2" w:space="0" w:color="AAAAAA"/>
+              <w:bottom w:val="single" w:sz="2" w:space="0" w:color="AAAAAA"/>
+              <w:right w:val="single" w:sz="2" w:space="0" w:color="AAAAAA"/>
+            </w:tcBorders>
+          </w:tcPr>
+          <w:p>
+            <w:pPr>
+              <w:pStyle w:val="Normal"/>
+              <w:rPr/>
+            </w:pPr>
+            <w:r>
+              <w:rPr>
+                <w:rFonts w:eastAsia="Georgia" w:cs="Georgia"/>
+                <w:b/>
+                <w:bCs/>
+                <w:color w:val="5A6070"/>
+                <w:sz w:val="18"/>
+                <w:szCs w:val="18"/>
+              </w:rPr>
+              <w:t>Decision log — one per line:</w:t>
+            </w:r>
+          </w:p>
+        </w:tc>
+      </w:tr>
+      <w:tr>
+        <w:trPr/>
+        <w:tc>
+          <w:tcPr>
+            <w:tcW w:w="9360" w:type="dxa"/>
+            <w:tcBorders>
+              <w:left w:val="single" w:sz="2" w:space="0" w:color="AAAAAA"/>
+              <w:bottom w:val="single" w:sz="2" w:space="0" w:color="AAAAAA"/>
+              <w:right w:val="single" w:sz="2" w:space="0" w:color="AAAAAA"/>
+            </w:tcBorders>
+          </w:tcPr>
+          <w:p>
+            <w:pPr>
+              <w:pStyle w:val="Normal"/>
+              <w:rPr/>
+            </w:pPr>
+            <w:r>
+              <w:rPr>
+                <w:rStyle w:val="Emphasis"/>
+              </w:rPr>
+              <w:t>Model names: spec referenced gpt-4.x series. Codebase uses gpt-5 series. Retained as-is.</w:t>
+            </w:r>
+            <w:r>
+              <w:rPr/>
+              <w:t xml:space="preserve"> </w:t>
+            </w:r>
+            <w:r>
+              <w:rPr>
+                <w:rStyle w:val="Emphasis"/>
+              </w:rPr>
+              <w:t>Model tiers: spec describes smart/fast only. Codebase has nano, summary, code tiers. Retained as-is.</w:t>
+            </w:r>
+          </w:p>
+        </w:tc>
+      </w:tr>
+      <w:tr>
+        <w:trPr/>
+        <w:tc>
+          <w:tcPr>
+            <w:tcW w:w="9360" w:type="dxa"/>
+            <w:tcBorders>
+              <w:left w:val="single" w:sz="2" w:space="0" w:color="AAAAAA"/>
+              <w:bottom w:val="single" w:sz="2" w:space="0" w:color="AAAAAA"/>
+              <w:right w:val="single" w:sz="2" w:space="0" w:color="AAAAAA"/>
+            </w:tcBorders>
+          </w:tcPr>
+          <w:p>
+            <w:pPr>
+              <w:pStyle w:val="Normal"/>
+              <w:rPr/>
+            </w:pPr>
+            <w:r>
+              <w:rPr>
+                <w:rStyle w:val="SourceText"/>
+              </w:rPr>
+              <w:t>vector_store.py</w:t>
+            </w:r>
+            <w:r>
+              <w:rPr/>
+              <w:t xml:space="preserve"> → </w:t>
+            </w:r>
+            <w:r>
+              <w:rPr>
+                <w:rStyle w:val="SourceText"/>
+              </w:rPr>
+              <w:t>chronicle.py</w:t>
+            </w:r>
+            <w:r>
+              <w:rPr/>
+              <w:t xml:space="preserve">, class </w:t>
+            </w:r>
+            <w:r>
+              <w:rPr>
+                <w:rStyle w:val="SourceText"/>
+              </w:rPr>
+              <w:t>VectorStore</w:t>
+            </w:r>
+            <w:r>
+              <w:rPr/>
+              <w:t xml:space="preserve"> → </w:t>
+            </w:r>
+            <w:r>
+              <w:rPr>
+                <w:rStyle w:val="SourceText"/>
+              </w:rPr>
+              <w:t>Chronicle</w:t>
+            </w:r>
+          </w:p>
+        </w:tc>
+      </w:tr>
+      <w:tr>
+        <w:trPr/>
+        <w:tc>
+          <w:tcPr>
+            <w:tcW w:w="9360" w:type="dxa"/>
+            <w:tcBorders>
+              <w:left w:val="single" w:sz="2" w:space="0" w:color="AAAAAA"/>
+              <w:bottom w:val="single" w:sz="2" w:space="0" w:color="AAAAAA"/>
+              <w:right w:val="single" w:sz="2" w:space="0" w:color="AAAAAA"/>
+            </w:tcBorders>
+          </w:tcPr>
+          <w:p>
+            <w:pPr>
+              <w:pStyle w:val="Normal"/>
+              <w:rPr/>
+            </w:pPr>
+            <w:r>
+              <w:rPr>
+                <w:rStyle w:val="SourceText"/>
+              </w:rPr>
+              <w:t>summarizer.py</w:t>
+            </w:r>
+            <w:r>
+              <w:rPr/>
+              <w:t xml:space="preserve"> → </w:t>
+            </w:r>
+            <w:r>
+              <w:rPr>
+                <w:rStyle w:val="SourceText"/>
+              </w:rPr>
+              <w:t>distillation.py</w:t>
+            </w:r>
+            <w:r>
+              <w:rPr/>
+              <w:t xml:space="preserve">, class </w:t>
+            </w:r>
+            <w:r>
+              <w:rPr>
+                <w:rStyle w:val="SourceText"/>
+              </w:rPr>
+              <w:t>Summarizer</w:t>
+            </w:r>
+            <w:r>
+              <w:rPr/>
+              <w:t xml:space="preserve"> → </w:t>
+            </w:r>
+            <w:r>
+              <w:rPr>
+                <w:rStyle w:val="SourceText"/>
+              </w:rPr>
+              <w:t>Distillation</w:t>
+            </w:r>
+          </w:p>
+        </w:tc>
+      </w:tr>
+      <w:tr>
+        <w:trPr/>
+        <w:tc>
+          <w:tcPr>
+            <w:tcW w:w="9360" w:type="dxa"/>
+            <w:tcBorders>
+              <w:left w:val="single" w:sz="2" w:space="0" w:color="AAAAAA"/>
+              <w:bottom w:val="single" w:sz="2" w:space="0" w:color="AAAAAA"/>
+              <w:right w:val="single" w:sz="2" w:space="0" w:color="AAAAAA"/>
+            </w:tcBorders>
+          </w:tcPr>
+          <w:p>
+            <w:pPr>
+              <w:pStyle w:val="Normal"/>
+              <w:rPr/>
+            </w:pPr>
+            <w:r>
+              <w:rPr>
+                <w:rStyle w:val="SourceText"/>
+              </w:rPr>
+              <w:t>analytics.py</w:t>
+            </w:r>
+            <w:r>
+              <w:rPr/>
+              <w:t xml:space="preserve"> → </w:t>
+            </w:r>
+            <w:r>
+              <w:rPr>
+                <w:rStyle w:val="SourceText"/>
+              </w:rPr>
+              <w:t>reflection.py</w:t>
+            </w:r>
+            <w:r>
+              <w:rPr/>
+              <w:t xml:space="preserve">, class </w:t>
+            </w:r>
+            <w:r>
+              <w:rPr>
+                <w:rStyle w:val="SourceText"/>
+              </w:rPr>
+              <w:t>AnalyticsEngine</w:t>
+            </w:r>
+            <w:r>
+              <w:rPr/>
+              <w:t xml:space="preserve"> → </w:t>
+            </w:r>
+            <w:r>
+              <w:rPr>
+                <w:rStyle w:val="SourceText"/>
+              </w:rPr>
+              <w:t>Reflection</w:t>
+            </w:r>
+          </w:p>
+        </w:tc>
+      </w:tr>
+      <w:tr>
+        <w:trPr/>
+        <w:tc>
+          <w:tcPr>
+            <w:tcW w:w="9360" w:type="dxa"/>
+            <w:tcBorders>
+              <w:left w:val="single" w:sz="2" w:space="0" w:color="AAAAAA"/>
+              <w:bottom w:val="single" w:sz="2" w:space="0" w:color="AAAAAA"/>
+              <w:right w:val="single" w:sz="2" w:space="0" w:color="AAAAAA"/>
+            </w:tcBorders>
+          </w:tcPr>
+          <w:p>
+            <w:pPr>
+              <w:pStyle w:val="Normal"/>
+              <w:rPr/>
+            </w:pPr>
+            <w:r>
+              <w:rPr/>
+              <w:t>All imports, instantiations, config keys updated throughout</w:t>
+            </w:r>
+          </w:p>
+        </w:tc>
+      </w:tr>
+      <w:tr>
+        <w:trPr/>
+        <w:tc>
+          <w:tcPr>
+            <w:tcW w:w="9360" w:type="dxa"/>
+            <w:tcBorders>
+              <w:left w:val="single" w:sz="2" w:space="0" w:color="AAAAAA"/>
+              <w:bottom w:val="single" w:sz="2" w:space="0" w:color="AAAAAA"/>
+              <w:right w:val="single" w:sz="2" w:space="0" w:color="AAAAAA"/>
+            </w:tcBorders>
+          </w:tcPr>
+          <w:p>
+            <w:pPr>
+              <w:pStyle w:val="Normal"/>
+              <w:rPr/>
+            </w:pPr>
+            <w:r>
+              <w:rPr>
+                <w:rStyle w:val="SourceText"/>
+              </w:rPr>
+              <w:t>config.yaml</w:t>
+            </w:r>
+            <w:r>
+              <w:rPr/>
+              <w:t xml:space="preserve">: name → </w:t>
+            </w:r>
+            <w:r>
+              <w:rPr>
+                <w:rStyle w:val="SourceText"/>
+              </w:rPr>
+              <w:t>Luminarious</w:t>
+            </w:r>
+            <w:r>
+              <w:rPr/>
+              <w:t xml:space="preserve">, </w:t>
+            </w:r>
+            <w:r>
+              <w:rPr>
+                <w:rStyle w:val="SourceText"/>
+              </w:rPr>
+              <w:t>analytics</w:t>
+            </w:r>
+            <w:r>
+              <w:rPr/>
+              <w:t xml:space="preserve"> block → </w:t>
+            </w:r>
+            <w:r>
+              <w:rPr>
+                <w:rStyle w:val="SourceText"/>
+              </w:rPr>
+              <w:t>reflection</w:t>
+            </w:r>
+          </w:p>
+        </w:tc>
+      </w:tr>
+      <w:tr>
+        <w:trPr/>
+        <w:tc>
+          <w:tcPr>
+            <w:tcW w:w="9360" w:type="dxa"/>
+            <w:tcBorders>
+              <w:left w:val="single" w:sz="2" w:space="0" w:color="AAAAAA"/>
+              <w:bottom w:val="single" w:sz="2" w:space="0" w:color="AAAAAA"/>
+              <w:right w:val="single" w:sz="2" w:space="0" w:color="AAAAAA"/>
+            </w:tcBorders>
+          </w:tcPr>
+          <w:p>
+            <w:pPr>
+              <w:pStyle w:val="Normal"/>
+              <w:rPr/>
+            </w:pPr>
+            <w:r>
+              <w:rPr>
+                <w:rStyle w:val="SourceText"/>
+              </w:rPr>
+              <w:t>conftest.py</w:t>
+            </w:r>
+            <w:r>
+              <w:rPr/>
+              <w:t xml:space="preserve"> created for pytest path resolution</w:t>
+            </w:r>
+          </w:p>
+        </w:tc>
+      </w:tr>
+      <w:tr>
+        <w:trPr/>
+        <w:tc>
+          <w:tcPr>
+            <w:tcW w:w="9360" w:type="dxa"/>
+            <w:tcBorders>
+              <w:left w:val="single" w:sz="2" w:space="0" w:color="AAAAAA"/>
+              <w:bottom w:val="single" w:sz="2" w:space="0" w:color="AAAAAA"/>
+              <w:right w:val="single" w:sz="2" w:space="0" w:color="AAAAAA"/>
+            </w:tcBorders>
+          </w:tcPr>
+          <w:p>
+            <w:pPr>
+              <w:pStyle w:val="Normal"/>
+              <w:rPr/>
+            </w:pPr>
+            <w:r>
+              <w:rPr/>
+              <w:t>14/14 tests passing</w:t>
+            </w:r>
+          </w:p>
+        </w:tc>
+      </w:tr>
+    </w:tbl>
+    <w:p>
+      <w:pPr>
+        <w:pStyle w:val="Normal"/>
+        <w:spacing w:before="120" w:after="0"/>
+        <w:rPr/>
+      </w:pPr>
+      <w:r>
+        <w:rPr/>
+      </w:r>
+    </w:p>
+    <w:p>
+      <w:pPr>
+        <w:pStyle w:val="Heading2"/>
+        <w:spacing w:before="320" w:after="100"/>
+        <w:rPr/>
+      </w:pPr>
+      <w:r>
+        <w:rPr>
+          <w:rFonts w:eastAsia="Georgia" w:cs="Georgia" w:ascii="Georgia" w:hAnsi="Georgia"/>
+          <w:b/>
+          <w:bCs/>
+          <w:color w:val="C68B2A"/>
+          <w:sz w:val="28"/>
+          <w:szCs w:val="28"/>
+        </w:rPr>
+        <w:t>Deviations from Spec</w:t>
+      </w:r>
+    </w:p>
+    <w:p>
+      <w:pPr>
+        <w:pStyle w:val="Normal"/>
+        <w:spacing w:before="70" w:after="90"/>
+        <w:rPr/>
+      </w:pPr>
+      <w:r>
+        <w:rPr>
+          <w:rFonts w:eastAsia="Georgia" w:cs="Georgia"/>
+          <w:b w:val="false"/>
+          <w:bCs w:val="false"/>
+          <w:i w:val="false"/>
+          <w:iCs w:val="false"/>
+          <w:color w:val="1A1A2E"/>
+          <w:sz w:val="22"/>
+          <w:szCs w:val="22"/>
+        </w:rPr>
+        <w:t>The spec is a blueprint, not a contract. Record every place you deviated, why, and whether the deviation is permanent or temporary.</w:t>
+      </w:r>
+    </w:p>
+    <w:p>
+      <w:pPr>
+        <w:pStyle w:val="Normal"/>
+        <w:spacing w:before="60" w:after="0"/>
+        <w:rPr/>
+      </w:pPr>
+      <w:r>
+        <w:rPr/>
+      </w:r>
+    </w:p>
+    <w:tbl>
+      <w:tblPr>
+        <w:tblW w:w="12058" w:type="dxa"/>
+        <w:jc w:val="left"/>
+        <w:tblInd w:w="-1012" w:type="dxa"/>
+        <w:shd w:fill="FFFFA6" w:val="clear"/>
+        <w:tblLayout w:type="fixed"/>
+        <w:tblCellMar>
+          <w:top w:w="80" w:type="dxa"/>
+          <w:left w:w="120" w:type="dxa"/>
+          <w:bottom w:w="80" w:type="dxa"/>
+          <w:right w:w="120" w:type="dxa"/>
+        </w:tblCellMar>
+      </w:tblPr>
+      <w:tblGrid>
+        <w:gridCol w:w="2100"/>
+        <w:gridCol w:w="2250"/>
+        <w:gridCol w:w="2331"/>
+        <w:gridCol w:w="5377"/>
+      </w:tblGrid>
+      <w:tr>
+        <w:trPr>
+          <w:tblHeader w:val="true"/>
+        </w:trPr>
+        <w:tc>
+          <w:tcPr>
+            <w:tcW w:w="2100" w:type="dxa"/>
+            <w:tcBorders>
+              <w:top w:val="single" w:sz="2" w:space="0" w:color="AAAAAA"/>
+              <w:left w:val="single" w:sz="2" w:space="0" w:color="AAAAAA"/>
+              <w:bottom w:val="single" w:sz="2" w:space="0" w:color="AAAAAA"/>
+              <w:right w:val="single" w:sz="2" w:space="0" w:color="AAAAAA"/>
+            </w:tcBorders>
+            <w:shd w:fill="FFE994" w:val="clear"/>
+          </w:tcPr>
+          <w:p>
+            <w:pPr>
+              <w:pStyle w:val="Normal"/>
+              <w:rPr/>
+            </w:pPr>
+            <w:r>
+              <w:rPr>
+                <w:rFonts w:eastAsia="Georgia" w:cs="Georgia"/>
+                <w:b/>
+                <w:bCs/>
+                <w:color w:val="B8860B"/>
+                <w:sz w:val="19"/>
+                <w:szCs w:val="19"/>
+              </w:rPr>
+              <w:t>Section</w:t>
+            </w:r>
+          </w:p>
+        </w:tc>
+        <w:tc>
+          <w:tcPr>
+            <w:tcW w:w="2250" w:type="dxa"/>
+            <w:tcBorders>
+              <w:top w:val="single" w:sz="2" w:space="0" w:color="AAAAAA"/>
+              <w:left w:val="single" w:sz="2" w:space="0" w:color="AAAAAA"/>
+              <w:bottom w:val="single" w:sz="2" w:space="0" w:color="AAAAAA"/>
+              <w:right w:val="single" w:sz="2" w:space="0" w:color="AAAAAA"/>
+            </w:tcBorders>
+            <w:shd w:fill="FFE994" w:val="clear"/>
+          </w:tcPr>
+          <w:p>
+            <w:pPr>
+              <w:pStyle w:val="Normal"/>
+              <w:rPr/>
+            </w:pPr>
+            <w:r>
+              <w:rPr>
+                <w:rFonts w:eastAsia="Georgia" w:cs="Georgia"/>
+                <w:b/>
+                <w:bCs/>
+                <w:color w:val="B8860B"/>
+                <w:sz w:val="19"/>
+                <w:szCs w:val="19"/>
+              </w:rPr>
+              <w:t>What Spec Said</w:t>
+            </w:r>
+          </w:p>
+        </w:tc>
+        <w:tc>
+          <w:tcPr>
+            <w:tcW w:w="2331" w:type="dxa"/>
+            <w:tcBorders>
+              <w:top w:val="single" w:sz="2" w:space="0" w:color="AAAAAA"/>
+              <w:left w:val="single" w:sz="2" w:space="0" w:color="AAAAAA"/>
+              <w:bottom w:val="single" w:sz="2" w:space="0" w:color="AAAAAA"/>
+              <w:right w:val="single" w:sz="2" w:space="0" w:color="AAAAAA"/>
+            </w:tcBorders>
+            <w:shd w:fill="FFE994" w:val="clear"/>
+          </w:tcPr>
+          <w:p>
+            <w:pPr>
+              <w:pStyle w:val="Normal"/>
+              <w:rPr/>
+            </w:pPr>
+            <w:r>
+              <w:rPr>
+                <w:rFonts w:eastAsia="Georgia" w:cs="Georgia"/>
+                <w:b/>
+                <w:bCs/>
+                <w:color w:val="B8860B"/>
+                <w:sz w:val="19"/>
+                <w:szCs w:val="19"/>
+              </w:rPr>
+              <w:t>What I Did Instead</w:t>
+            </w:r>
+          </w:p>
+        </w:tc>
+        <w:tc>
+          <w:tcPr>
+            <w:tcW w:w="5377" w:type="dxa"/>
+            <w:tcBorders>
+              <w:top w:val="single" w:sz="2" w:space="0" w:color="AAAAAA"/>
+              <w:left w:val="single" w:sz="2" w:space="0" w:color="AAAAAA"/>
+              <w:bottom w:val="single" w:sz="2" w:space="0" w:color="AAAAAA"/>
+              <w:right w:val="single" w:sz="2" w:space="0" w:color="AAAAAA"/>
+            </w:tcBorders>
+            <w:shd w:fill="FFE994" w:val="clear"/>
+          </w:tcPr>
+          <w:p>
+            <w:pPr>
+              <w:pStyle w:val="Normal"/>
+              <w:rPr/>
+            </w:pPr>
+            <w:r>
+              <w:rPr>
+                <w:rFonts w:eastAsia="Georgia" w:cs="Georgia"/>
+                <w:b/>
+                <w:bCs/>
+                <w:color w:val="B8860B"/>
+                <w:sz w:val="19"/>
+                <w:szCs w:val="19"/>
+              </w:rPr>
+              <w:t>Why / Status</w:t>
+            </w:r>
+          </w:p>
+        </w:tc>
+      </w:tr>
+      <w:tr>
+        <w:trPr/>
+        <w:tc>
+          <w:tcPr>
+            <w:tcW w:w="2100" w:type="dxa"/>
+            <w:tcBorders>
+              <w:top w:val="single" w:sz="2" w:space="0" w:color="AAAAAA"/>
+              <w:left w:val="single" w:sz="2" w:space="0" w:color="AAAAAA"/>
+              <w:bottom w:val="single" w:sz="2" w:space="0" w:color="AAAAAA"/>
+              <w:right w:val="single" w:sz="2" w:space="0" w:color="AAAAAA"/>
+            </w:tcBorders>
+            <w:shd w:fill="FFE994" w:val="clear"/>
+          </w:tcPr>
+          <w:p>
+            <w:pPr>
+              <w:pStyle w:val="Normal"/>
+              <w:rPr>
+                <w:b w:val="false"/>
+                <w:bCs w:val="false"/>
+                <w:i w:val="false"/>
+                <w:iCs w:val="false"/>
+                <w:sz w:val="24"/>
+                <w:szCs w:val="24"/>
+              </w:rPr>
+            </w:pPr>
+            <w:r>
+              <w:rPr>
+                <w:bCs w:val="false"/>
+                <w:iCs w:val="false"/>
+                <w:szCs w:val="24"/>
+              </w:rPr>
+              <w:t>Testing</w:t>
+            </w:r>
+          </w:p>
+        </w:tc>
+        <w:tc>
+          <w:tcPr>
+            <w:tcW w:w="2250" w:type="dxa"/>
+            <w:tcBorders>
+              <w:top w:val="single" w:sz="2" w:space="0" w:color="AAAAAA"/>
+              <w:left w:val="single" w:sz="2" w:space="0" w:color="AAAAAA"/>
+              <w:bottom w:val="single" w:sz="2" w:space="0" w:color="AAAAAA"/>
+              <w:right w:val="single" w:sz="2" w:space="0" w:color="AAAAAA"/>
+            </w:tcBorders>
+            <w:shd w:fill="FFE994" w:val="clear"/>
+          </w:tcPr>
+          <w:p>
+            <w:pPr>
+              <w:pStyle w:val="Normal"/>
+              <w:rPr>
+                <w:b w:val="false"/>
+                <w:bCs w:val="false"/>
+                <w:i w:val="false"/>
+                <w:iCs w:val="false"/>
+                <w:sz w:val="24"/>
+                <w:szCs w:val="24"/>
+              </w:rPr>
+            </w:pPr>
+            <w:r>
+              <w:rPr>
+                <w:bCs w:val="false"/>
+                <w:iCs w:val="false"/>
+                <w:szCs w:val="24"/>
+              </w:rPr>
+              <w:t>Test first</w:t>
+            </w:r>
+          </w:p>
+        </w:tc>
+        <w:tc>
+          <w:tcPr>
+            <w:tcW w:w="2331" w:type="dxa"/>
+            <w:tcBorders>
+              <w:top w:val="single" w:sz="2" w:space="0" w:color="AAAAAA"/>
+              <w:left w:val="single" w:sz="2" w:space="0" w:color="AAAAAA"/>
+              <w:bottom w:val="single" w:sz="2" w:space="0" w:color="AAAAAA"/>
+              <w:right w:val="single" w:sz="2" w:space="0" w:color="AAAAAA"/>
+            </w:tcBorders>
+            <w:shd w:fill="FFE994" w:val="clear"/>
+          </w:tcPr>
+          <w:p>
+            <w:pPr>
+              <w:pStyle w:val="Normal"/>
+              <w:rPr>
+                <w:b w:val="false"/>
+                <w:bCs w:val="false"/>
+                <w:i w:val="false"/>
+                <w:iCs w:val="false"/>
+                <w:sz w:val="24"/>
+                <w:szCs w:val="24"/>
+              </w:rPr>
+            </w:pPr>
+            <w:r>
+              <w:rPr>
+                <w:bCs w:val="false"/>
+                <w:iCs w:val="false"/>
+                <w:szCs w:val="24"/>
+              </w:rPr>
+              <w:t>didn’t</w:t>
+            </w:r>
+          </w:p>
+        </w:tc>
+        <w:tc>
+          <w:tcPr>
+            <w:tcW w:w="5377" w:type="dxa"/>
+            <w:tcBorders>
+              <w:top w:val="single" w:sz="2" w:space="0" w:color="AAAAAA"/>
+              <w:left w:val="single" w:sz="2" w:space="0" w:color="AAAAAA"/>
+              <w:bottom w:val="single" w:sz="2" w:space="0" w:color="AAAAAA"/>
+              <w:right w:val="single" w:sz="2" w:space="0" w:color="AAAAAA"/>
+            </w:tcBorders>
+            <w:shd w:fill="FFE994" w:val="clear"/>
+          </w:tcPr>
+          <w:p>
+            <w:pPr>
+              <w:pStyle w:val="Normal"/>
+              <w:rPr>
+                <w:b w:val="false"/>
+                <w:bCs w:val="false"/>
+                <w:i w:val="false"/>
+                <w:iCs w:val="false"/>
+                <w:sz w:val="24"/>
+                <w:szCs w:val="24"/>
+              </w:rPr>
+            </w:pPr>
+            <w:r>
+              <w:rPr>
+                <w:bCs w:val="false"/>
+                <w:iCs w:val="false"/>
+                <w:szCs w:val="24"/>
+              </w:rPr>
+              <w:t>Inexperience</w:t>
+            </w:r>
+          </w:p>
+        </w:tc>
+      </w:tr>
+      <w:tr>
+        <w:trPr/>
+        <w:tc>
+          <w:tcPr>
+            <w:tcW w:w="2100" w:type="dxa"/>
+            <w:tcBorders>
+              <w:top w:val="single" w:sz="2" w:space="0" w:color="AAAAAA"/>
+              <w:left w:val="single" w:sz="2" w:space="0" w:color="AAAAAA"/>
+              <w:bottom w:val="single" w:sz="2" w:space="0" w:color="AAAAAA"/>
+              <w:right w:val="single" w:sz="2" w:space="0" w:color="AAAAAA"/>
+            </w:tcBorders>
+            <w:shd w:fill="FFE994" w:val="clear"/>
+          </w:tcPr>
+          <w:p>
+            <w:pPr>
+              <w:pStyle w:val="Normal"/>
+              <w:rPr>
+                <w:b w:val="false"/>
+                <w:bCs w:val="false"/>
+                <w:i w:val="false"/>
+                <w:iCs w:val="false"/>
+                <w:sz w:val="24"/>
+                <w:szCs w:val="24"/>
+              </w:rPr>
+            </w:pPr>
+            <w:r>
+              <w:rPr>
+                <w:bCs w:val="false"/>
+                <w:iCs w:val="false"/>
+                <w:szCs w:val="24"/>
+              </w:rPr>
+              <w:t>Data Directory</w:t>
+            </w:r>
+          </w:p>
+        </w:tc>
+        <w:tc>
+          <w:tcPr>
+            <w:tcW w:w="2250" w:type="dxa"/>
+            <w:tcBorders>
+              <w:top w:val="single" w:sz="2" w:space="0" w:color="AAAAAA"/>
+              <w:left w:val="single" w:sz="2" w:space="0" w:color="AAAAAA"/>
+              <w:bottom w:val="single" w:sz="2" w:space="0" w:color="AAAAAA"/>
+              <w:right w:val="single" w:sz="2" w:space="0" w:color="AAAAAA"/>
+            </w:tcBorders>
+            <w:shd w:fill="FFE994" w:val="clear"/>
+          </w:tcPr>
+          <w:p>
+            <w:pPr>
+              <w:pStyle w:val="Normal"/>
+              <w:rPr>
+                <w:b w:val="false"/>
+                <w:bCs w:val="false"/>
+                <w:i w:val="false"/>
+                <w:iCs w:val="false"/>
+                <w:sz w:val="24"/>
+                <w:szCs w:val="24"/>
+              </w:rPr>
+            </w:pPr>
+            <w:r>
+              <w:rPr>
+                <w:bCs w:val="false"/>
+                <w:iCs w:val="false"/>
+                <w:szCs w:val="24"/>
+              </w:rPr>
+              <w:t>data/</w:t>
+            </w:r>
+          </w:p>
+        </w:tc>
+        <w:tc>
+          <w:tcPr>
+            <w:tcW w:w="2331" w:type="dxa"/>
+            <w:tcBorders>
+              <w:top w:val="single" w:sz="2" w:space="0" w:color="AAAAAA"/>
+              <w:left w:val="single" w:sz="2" w:space="0" w:color="AAAAAA"/>
+              <w:bottom w:val="single" w:sz="2" w:space="0" w:color="AAAAAA"/>
+              <w:right w:val="single" w:sz="2" w:space="0" w:color="AAAAAA"/>
+            </w:tcBorders>
+            <w:shd w:fill="FFE994" w:val="clear"/>
+          </w:tcPr>
+          <w:p>
+            <w:pPr>
+              <w:pStyle w:val="Normal"/>
+              <w:rPr>
+                <w:b w:val="false"/>
+                <w:bCs w:val="false"/>
+                <w:i w:val="false"/>
+                <w:iCs w:val="false"/>
+                <w:sz w:val="24"/>
+                <w:szCs w:val="24"/>
+              </w:rPr>
+            </w:pPr>
+            <w:r>
+              <w:rPr>
+                <w:bCs w:val="false"/>
+                <w:iCs w:val="false"/>
+                <w:szCs w:val="24"/>
+              </w:rPr>
+              <w:t>storage/</w:t>
+            </w:r>
+          </w:p>
+        </w:tc>
+        <w:tc>
+          <w:tcPr>
+            <w:tcW w:w="5377" w:type="dxa"/>
+            <w:tcBorders>
+              <w:top w:val="single" w:sz="2" w:space="0" w:color="AAAAAA"/>
+              <w:left w:val="single" w:sz="2" w:space="0" w:color="AAAAAA"/>
+              <w:bottom w:val="single" w:sz="2" w:space="0" w:color="AAAAAA"/>
+              <w:right w:val="single" w:sz="2" w:space="0" w:color="AAAAAA"/>
+            </w:tcBorders>
+            <w:shd w:fill="FFE994" w:val="clear"/>
+          </w:tcPr>
+          <w:p>
+            <w:pPr>
+              <w:pStyle w:val="Normal"/>
+              <w:rPr/>
+            </w:pPr>
+            <w:r>
+              <w:rPr/>
+              <w:t>Already named this way in working codebase. Retained as-is. Permanent.</w:t>
+            </w:r>
+          </w:p>
+        </w:tc>
+      </w:tr>
+      <w:tr>
+        <w:trPr/>
+        <w:tc>
+          <w:tcPr>
+            <w:tcW w:w="2100" w:type="dxa"/>
+            <w:tcBorders>
+              <w:top w:val="single" w:sz="2" w:space="0" w:color="AAAAAA"/>
+              <w:left w:val="single" w:sz="2" w:space="0" w:color="AAAAAA"/>
+              <w:bottom w:val="single" w:sz="2" w:space="0" w:color="AAAAAA"/>
+              <w:right w:val="single" w:sz="2" w:space="0" w:color="AAAAAA"/>
+            </w:tcBorders>
+            <w:shd w:fill="FFE994" w:val="clear"/>
+          </w:tcPr>
+          <w:p>
+            <w:pPr>
+              <w:pStyle w:val="Normal"/>
+              <w:rPr/>
+            </w:pPr>
+            <w:r>
+              <w:rPr/>
+              <w:t>Model names</w:t>
+            </w:r>
+          </w:p>
+        </w:tc>
+        <w:tc>
+          <w:tcPr>
+            <w:tcW w:w="2250" w:type="dxa"/>
+            <w:tcBorders>
+              <w:top w:val="single" w:sz="2" w:space="0" w:color="AAAAAA"/>
+              <w:left w:val="single" w:sz="2" w:space="0" w:color="AAAAAA"/>
+              <w:bottom w:val="single" w:sz="2" w:space="0" w:color="AAAAAA"/>
+              <w:right w:val="single" w:sz="2" w:space="0" w:color="AAAAAA"/>
+            </w:tcBorders>
+            <w:shd w:fill="FFE994" w:val="clear"/>
+          </w:tcPr>
+          <w:p>
+            <w:pPr>
+              <w:pStyle w:val="Normal"/>
+              <w:rPr/>
+            </w:pPr>
+            <w:r>
+              <w:rPr/>
+              <w:t>gpt-4.x series</w:t>
+            </w:r>
+          </w:p>
+        </w:tc>
+        <w:tc>
+          <w:tcPr>
+            <w:tcW w:w="2331" w:type="dxa"/>
+            <w:tcBorders>
+              <w:top w:val="single" w:sz="2" w:space="0" w:color="AAAAAA"/>
+              <w:left w:val="single" w:sz="2" w:space="0" w:color="AAAAAA"/>
+              <w:bottom w:val="single" w:sz="2" w:space="0" w:color="AAAAAA"/>
+              <w:right w:val="single" w:sz="2" w:space="0" w:color="AAAAAA"/>
+            </w:tcBorders>
+            <w:shd w:fill="FFE994" w:val="clear"/>
+          </w:tcPr>
+          <w:p>
+            <w:pPr>
+              <w:pStyle w:val="Normal"/>
+              <w:rPr/>
+            </w:pPr>
+            <w:r>
+              <w:rPr/>
+              <w:t>gpt-5 series</w:t>
+            </w:r>
+          </w:p>
+        </w:tc>
+        <w:tc>
+          <w:tcPr>
+            <w:tcW w:w="5377" w:type="dxa"/>
+            <w:tcBorders>
+              <w:top w:val="single" w:sz="2" w:space="0" w:color="AAAAAA"/>
+              <w:left w:val="single" w:sz="2" w:space="0" w:color="AAAAAA"/>
+              <w:bottom w:val="single" w:sz="2" w:space="0" w:color="AAAAAA"/>
+              <w:right w:val="single" w:sz="2" w:space="0" w:color="AAAAAA"/>
+            </w:tcBorders>
+            <w:shd w:fill="FFE994" w:val="clear"/>
+          </w:tcPr>
+          <w:p>
+            <w:pPr>
+              <w:pStyle w:val="Normal"/>
+              <w:rPr/>
+            </w:pPr>
+            <w:r>
+              <w:rPr/>
+              <w:t>Codebase already running newer models. Retained as-is. Permanent.</w:t>
+            </w:r>
+          </w:p>
+        </w:tc>
+      </w:tr>
+      <w:tr>
+        <w:trPr/>
+        <w:tc>
+          <w:tcPr>
+            <w:tcW w:w="2100" w:type="dxa"/>
+            <w:tcBorders>
+              <w:top w:val="single" w:sz="2" w:space="0" w:color="AAAAAA"/>
+              <w:left w:val="single" w:sz="2" w:space="0" w:color="AAAAAA"/>
+              <w:bottom w:val="single" w:sz="2" w:space="0" w:color="AAAAAA"/>
+              <w:right w:val="single" w:sz="2" w:space="0" w:color="AAAAAA"/>
+            </w:tcBorders>
+            <w:shd w:fill="FFE994" w:val="clear"/>
+          </w:tcPr>
+          <w:p>
+            <w:pPr>
+              <w:pStyle w:val="Normal"/>
+              <w:rPr/>
+            </w:pPr>
+            <w:r>
+              <w:rPr/>
+              <w:t>Model tiers</w:t>
+            </w:r>
+          </w:p>
+        </w:tc>
+        <w:tc>
+          <w:tcPr>
+            <w:tcW w:w="2250" w:type="dxa"/>
+            <w:tcBorders>
+              <w:top w:val="single" w:sz="2" w:space="0" w:color="AAAAAA"/>
+              <w:left w:val="single" w:sz="2" w:space="0" w:color="AAAAAA"/>
+              <w:bottom w:val="single" w:sz="2" w:space="0" w:color="AAAAAA"/>
+              <w:right w:val="single" w:sz="2" w:space="0" w:color="AAAAAA"/>
+            </w:tcBorders>
+            <w:shd w:fill="FFE994" w:val="clear"/>
+          </w:tcPr>
+          <w:p>
+            <w:pPr>
+              <w:pStyle w:val="Normal"/>
+              <w:rPr/>
+            </w:pPr>
+            <w:r>
+              <w:rPr/>
+              <w:t>smart / fast only</w:t>
+            </w:r>
+          </w:p>
+        </w:tc>
+        <w:tc>
+          <w:tcPr>
+            <w:tcW w:w="2331" w:type="dxa"/>
+            <w:tcBorders>
+              <w:top w:val="single" w:sz="2" w:space="0" w:color="AAAAAA"/>
+              <w:left w:val="single" w:sz="2" w:space="0" w:color="AAAAAA"/>
+              <w:bottom w:val="single" w:sz="2" w:space="0" w:color="AAAAAA"/>
+              <w:right w:val="single" w:sz="2" w:space="0" w:color="AAAAAA"/>
+            </w:tcBorders>
+            <w:shd w:fill="FFE994" w:val="clear"/>
+          </w:tcPr>
+          <w:p>
+            <w:pPr>
+              <w:pStyle w:val="Normal"/>
+              <w:rPr/>
+            </w:pPr>
+            <w:r>
+              <w:rPr/>
+              <w:t>smart, fast, nano, summary, code</w:t>
+            </w:r>
+          </w:p>
+        </w:tc>
+        <w:tc>
+          <w:tcPr>
+            <w:tcW w:w="5377" w:type="dxa"/>
+            <w:tcBorders>
+              <w:top w:val="single" w:sz="2" w:space="0" w:color="AAAAAA"/>
+              <w:left w:val="single" w:sz="2" w:space="0" w:color="AAAAAA"/>
+              <w:bottom w:val="single" w:sz="2" w:space="0" w:color="AAAAAA"/>
+              <w:right w:val="single" w:sz="2" w:space="0" w:color="AAAAAA"/>
+            </w:tcBorders>
+            <w:shd w:fill="FFE994" w:val="clear"/>
+          </w:tcPr>
+          <w:p>
+            <w:pPr>
+              <w:pStyle w:val="Normal"/>
+              <w:rPr/>
+            </w:pPr>
+            <w:r>
+              <w:rPr/>
+              <w:t>Codebase had already grown beyond spec. Retained as-is. Permanent.</w:t>
+            </w:r>
+          </w:p>
+        </w:tc>
+      </w:tr>
+      <w:tr>
+        <w:trPr/>
+        <w:tc>
+          <w:tcPr>
+            <w:tcW w:w="2100" w:type="dxa"/>
+            <w:tcBorders>
+              <w:left w:val="single" w:sz="2" w:space="0" w:color="AAAAAA"/>
+              <w:bottom w:val="single" w:sz="2" w:space="0" w:color="AAAAAA"/>
+              <w:right w:val="single" w:sz="2" w:space="0" w:color="AAAAAA"/>
+            </w:tcBorders>
+            <w:shd w:fill="FFE994" w:val="clear"/>
+          </w:tcPr>
+          <w:p>
+            <w:pPr>
+              <w:pStyle w:val="Normal"/>
+              <w:rPr/>
+            </w:pPr>
+            <w:r>
+              <w:rPr/>
+              <w:t>File separation</w:t>
+            </w:r>
+          </w:p>
+        </w:tc>
+        <w:tc>
+          <w:tcPr>
+            <w:tcW w:w="2250" w:type="dxa"/>
+            <w:tcBorders>
+              <w:left w:val="single" w:sz="2" w:space="0" w:color="AAAAAA"/>
+              <w:bottom w:val="single" w:sz="2" w:space="0" w:color="AAAAAA"/>
+              <w:right w:val="single" w:sz="2" w:space="0" w:color="AAAAAA"/>
+            </w:tcBorders>
+            <w:shd w:fill="FFE994" w:val="clear"/>
+          </w:tcPr>
+          <w:p>
+            <w:pPr>
+              <w:pStyle w:val="Normal"/>
+              <w:rPr/>
+            </w:pPr>
+            <w:r>
+              <w:rPr/>
+              <w:t>analytics.py renamed to reflection.py</w:t>
+            </w:r>
+          </w:p>
+        </w:tc>
+        <w:tc>
+          <w:tcPr>
+            <w:tcW w:w="2331" w:type="dxa"/>
+            <w:tcBorders>
+              <w:left w:val="single" w:sz="2" w:space="0" w:color="AAAAAA"/>
+              <w:bottom w:val="single" w:sz="2" w:space="0" w:color="AAAAAA"/>
+              <w:right w:val="single" w:sz="2" w:space="0" w:color="AAAAAA"/>
+            </w:tcBorders>
+            <w:shd w:fill="FFE994" w:val="clear"/>
+          </w:tcPr>
+          <w:p>
+            <w:pPr>
+              <w:pStyle w:val="Normal"/>
+              <w:rPr/>
+            </w:pPr>
+            <w:r>
+              <w:rPr/>
+              <w:t>reflection.py contained two classes on rename — required manual separation</w:t>
+            </w:r>
+          </w:p>
+        </w:tc>
+        <w:tc>
+          <w:tcPr>
+            <w:tcW w:w="5377" w:type="dxa"/>
+            <w:tcBorders>
+              <w:left w:val="single" w:sz="2" w:space="0" w:color="AAAAAA"/>
+              <w:bottom w:val="single" w:sz="2" w:space="0" w:color="AAAAAA"/>
+              <w:right w:val="single" w:sz="2" w:space="0" w:color="AAAAAA"/>
+            </w:tcBorders>
+            <w:shd w:fill="FFE994" w:val="clear"/>
+          </w:tcPr>
+          <w:p>
+            <w:pPr>
+              <w:pStyle w:val="Normal"/>
+              <w:rPr/>
+            </w:pPr>
+            <w:r>
+              <w:rPr/>
+              <w:t>Incomplete rename state discovered during pass. Resolved during Phase 1.</w:t>
+            </w:r>
+          </w:p>
+        </w:tc>
+      </w:tr>
+      <w:tr>
+        <w:trPr/>
+        <w:tc>
+          <w:tcPr>
+            <w:tcW w:w="2100" w:type="dxa"/>
+            <w:tcBorders>
+              <w:left w:val="single" w:sz="2" w:space="0" w:color="AAAAAA"/>
+              <w:bottom w:val="single" w:sz="2" w:space="0" w:color="AAAAAA"/>
+              <w:right w:val="single" w:sz="2" w:space="0" w:color="AAAAAA"/>
+            </w:tcBorders>
+            <w:shd w:fill="FFE994" w:val="clear"/>
+          </w:tcPr>
+          <w:p>
+            <w:pPr>
+              <w:pStyle w:val="Normal"/>
+              <w:rPr/>
+            </w:pPr>
+            <w:r>
+              <w:rPr/>
+              <w:t>Test suite</w:t>
+            </w:r>
+          </w:p>
+        </w:tc>
+        <w:tc>
+          <w:tcPr>
+            <w:tcW w:w="2250" w:type="dxa"/>
+            <w:tcBorders>
+              <w:left w:val="single" w:sz="2" w:space="0" w:color="AAAAAA"/>
+              <w:bottom w:val="single" w:sz="2" w:space="0" w:color="AAAAAA"/>
+              <w:right w:val="single" w:sz="2" w:space="0" w:color="AAAAAA"/>
+            </w:tcBorders>
+            <w:shd w:fill="FFE994" w:val="clear"/>
+          </w:tcPr>
+          <w:p>
+            <w:pPr>
+              <w:pStyle w:val="Normal"/>
+              <w:rPr/>
+            </w:pPr>
+            <w:r>
+              <w:rPr/>
+              <w:t>Pre-existing suite assumed</w:t>
+            </w:r>
+          </w:p>
+        </w:tc>
+        <w:tc>
+          <w:tcPr>
+            <w:tcW w:w="2331" w:type="dxa"/>
+            <w:tcBorders>
+              <w:left w:val="single" w:sz="2" w:space="0" w:color="AAAAAA"/>
+              <w:bottom w:val="single" w:sz="2" w:space="0" w:color="AAAAAA"/>
+              <w:right w:val="single" w:sz="2" w:space="0" w:color="AAAAAA"/>
+            </w:tcBorders>
+            <w:shd w:fill="FFE994" w:val="clear"/>
+          </w:tcPr>
+          <w:p>
+            <w:pPr>
+              <w:pStyle w:val="Normal"/>
+              <w:rPr/>
+            </w:pPr>
+            <w:r>
+              <w:rPr/>
+              <w:t>No suite existed — written from scratch during Phase 1</w:t>
+            </w:r>
+          </w:p>
+        </w:tc>
+        <w:tc>
+          <w:tcPr>
+            <w:tcW w:w="5377" w:type="dxa"/>
+            <w:tcBorders>
+              <w:left w:val="single" w:sz="2" w:space="0" w:color="AAAAAA"/>
+              <w:bottom w:val="single" w:sz="2" w:space="0" w:color="AAAAAA"/>
+              <w:right w:val="single" w:sz="2" w:space="0" w:color="AAAAAA"/>
+            </w:tcBorders>
+            <w:shd w:fill="FFE994" w:val="clear"/>
+          </w:tcPr>
+          <w:p>
+            <w:pPr>
+              <w:pStyle w:val="Normal"/>
+              <w:rPr/>
+            </w:pPr>
+            <w:r>
+              <w:rPr/>
+              <w:t>Tests written against spec intent, then corrected to match actual class APIs.</w:t>
+            </w:r>
+          </w:p>
+        </w:tc>
+      </w:tr>
+      <w:tr>
+        <w:trPr/>
+        <w:tc>
+          <w:tcPr>
+            <w:tcW w:w="2100" w:type="dxa"/>
+            <w:tcBorders>
+              <w:left w:val="single" w:sz="2" w:space="0" w:color="AAAAAA"/>
+              <w:bottom w:val="single" w:sz="2" w:space="0" w:color="AAAAAA"/>
+              <w:right w:val="single" w:sz="2" w:space="0" w:color="AAAAAA"/>
+            </w:tcBorders>
+            <w:shd w:fill="FFE994" w:val="clear"/>
+          </w:tcPr>
+          <w:p>
+            <w:pPr>
+              <w:pStyle w:val="Normal"/>
+              <w:rPr/>
+            </w:pPr>
+            <w:r>
+              <w:rPr/>
+              <w:t>conftest.py</w:t>
+            </w:r>
+          </w:p>
+        </w:tc>
+        <w:tc>
+          <w:tcPr>
+            <w:tcW w:w="2250" w:type="dxa"/>
+            <w:tcBorders>
+              <w:left w:val="single" w:sz="2" w:space="0" w:color="AAAAAA"/>
+              <w:bottom w:val="single" w:sz="2" w:space="0" w:color="AAAAAA"/>
+              <w:right w:val="single" w:sz="2" w:space="0" w:color="AAAAAA"/>
+            </w:tcBorders>
+            <w:shd w:fill="FFE994" w:val="clear"/>
+          </w:tcPr>
+          <w:p>
+            <w:pPr>
+              <w:pStyle w:val="Normal"/>
+              <w:rPr/>
+            </w:pPr>
+            <w:r>
+              <w:rPr/>
+              <w:t>Not mentioned</w:t>
+            </w:r>
+          </w:p>
+        </w:tc>
+        <w:tc>
+          <w:tcPr>
+            <w:tcW w:w="2331" w:type="dxa"/>
+            <w:tcBorders>
+              <w:left w:val="single" w:sz="2" w:space="0" w:color="AAAAAA"/>
+              <w:bottom w:val="single" w:sz="2" w:space="0" w:color="AAAAAA"/>
+              <w:right w:val="single" w:sz="2" w:space="0" w:color="AAAAAA"/>
+            </w:tcBorders>
+            <w:shd w:fill="FFE994" w:val="clear"/>
+          </w:tcPr>
+          <w:p>
+            <w:pPr>
+              <w:pStyle w:val="Normal"/>
+              <w:rPr/>
+            </w:pPr>
+            <w:r>
+              <w:rPr/>
+              <w:t>Created to fix pytest module path resolution</w:t>
+            </w:r>
+          </w:p>
+        </w:tc>
+        <w:tc>
+          <w:tcPr>
+            <w:tcW w:w="5377" w:type="dxa"/>
+            <w:tcBorders>
+              <w:left w:val="single" w:sz="2" w:space="0" w:color="AAAAAA"/>
+              <w:bottom w:val="single" w:sz="2" w:space="0" w:color="AAAAAA"/>
+              <w:right w:val="single" w:sz="2" w:space="0" w:color="AAAAAA"/>
+            </w:tcBorders>
+            <w:shd w:fill="FFE994" w:val="clear"/>
+          </w:tcPr>
+          <w:p>
+            <w:pPr>
+              <w:pStyle w:val="Normal"/>
+              <w:rPr/>
+            </w:pPr>
+            <w:r>
+              <w:rPr/>
+              <w:t xml:space="preserve">pytest could not find </w:t>
+            </w:r>
+            <w:r>
+              <w:rPr>
+                <w:rStyle w:val="SourceText"/>
+              </w:rPr>
+              <w:t>memory/</w:t>
+            </w:r>
+            <w:r>
+              <w:rPr/>
+              <w:t xml:space="preserve"> or </w:t>
+            </w:r>
+            <w:r>
+              <w:rPr>
+                <w:rStyle w:val="SourceText"/>
+              </w:rPr>
+              <w:t>client/</w:t>
+            </w:r>
+            <w:r>
+              <w:rPr/>
+              <w:t xml:space="preserve"> modules without it. Permanent.</w:t>
+            </w:r>
+          </w:p>
+        </w:tc>
+      </w:tr>
+    </w:tbl>
+    <w:p>
+      <w:pPr>
+        <w:pStyle w:val="Normal"/>
+        <w:spacing w:before="120" w:after="0"/>
+        <w:rPr/>
+      </w:pPr>
+      <w:r>
+        <w:rPr/>
+      </w:r>
+    </w:p>
+    <w:p>
+      <w:pPr>
+        <w:pStyle w:val="Heading2"/>
+        <w:spacing w:before="320" w:after="100"/>
+        <w:rPr/>
+      </w:pPr>
+      <w:r>
+        <w:rPr>
+          <w:rFonts w:eastAsia="Georgia" w:cs="Georgia" w:ascii="Georgia" w:hAnsi="Georgia"/>
+          <w:b/>
+          <w:bCs/>
+          <w:color w:val="C68B2A"/>
+          <w:sz w:val="28"/>
+          <w:szCs w:val="28"/>
+        </w:rPr>
+        <w:t>Friction Points</w:t>
+      </w:r>
+    </w:p>
+    <w:p>
+      <w:pPr>
+        <w:pStyle w:val="Normal"/>
+        <w:spacing w:before="70" w:after="90"/>
+        <w:rPr/>
+      </w:pPr>
+      <w:r>
+        <w:rPr>
+          <w:rFonts w:eastAsia="Georgia" w:cs="Georgia"/>
+          <w:b w:val="false"/>
+          <w:bCs w:val="false"/>
+          <w:i w:val="false"/>
+          <w:iCs w:val="false"/>
+          <w:color w:val="1A1A2E"/>
+          <w:sz w:val="22"/>
+          <w:szCs w:val="22"/>
+        </w:rPr>
+        <w:t>What was harder than expected? What took longer? What confused you? Be specific.</w:t>
+      </w:r>
+    </w:p>
+    <w:p>
+      <w:pPr>
+        <w:pStyle w:val="Normal"/>
+        <w:spacing w:before="60" w:after="0"/>
+        <w:rPr/>
+      </w:pPr>
+      <w:r>
+        <w:rPr/>
+      </w:r>
+    </w:p>
+    <w:tbl>
+      <w:tblPr>
+        <w:tblW w:w="9360" w:type="dxa"/>
+        <w:jc w:val="left"/>
+        <w:tblInd w:w="0" w:type="dxa"/>
+        <w:tblLayout w:type="fixed"/>
+        <w:tblCellMar>
+          <w:top w:w="60" w:type="dxa"/>
+          <w:left w:w="120" w:type="dxa"/>
+          <w:bottom w:w="60" w:type="dxa"/>
+          <w:right w:w="120" w:type="dxa"/>
+        </w:tblCellMar>
+      </w:tblPr>
+      <w:tblGrid>
+        <w:gridCol w:w="9360"/>
+      </w:tblGrid>
+      <w:tr>
+        <w:trPr/>
+        <w:tc>
+          <w:tcPr>
+            <w:tcW w:w="9360" w:type="dxa"/>
+            <w:tcBorders>
+              <w:top w:val="single" w:sz="2" w:space="0" w:color="AAAAAA"/>
+              <w:left w:val="single" w:sz="2" w:space="0" w:color="AAAAAA"/>
+              <w:bottom w:val="single" w:sz="2" w:space="0" w:color="AAAAAA"/>
+              <w:right w:val="single" w:sz="2" w:space="0" w:color="AAAAAA"/>
+            </w:tcBorders>
+          </w:tcPr>
+          <w:p>
+            <w:pPr>
+              <w:pStyle w:val="Normal"/>
+              <w:rPr/>
+            </w:pPr>
+            <w:r>
+              <w:rPr>
+                <w:rFonts w:eastAsia="Georgia" w:cs="Georgia"/>
+                <w:b/>
+                <w:bCs/>
+                <w:color w:val="5A6070"/>
+                <w:sz w:val="18"/>
+                <w:szCs w:val="18"/>
+              </w:rPr>
+              <w:t>Friction points encountered:</w:t>
+            </w:r>
+          </w:p>
+        </w:tc>
+      </w:tr>
+      <w:tr>
+        <w:trPr/>
+        <w:tc>
+          <w:tcPr>
+            <w:tcW w:w="9360" w:type="dxa"/>
+            <w:tcBorders>
+              <w:left w:val="single" w:sz="2" w:space="0" w:color="AAAAAA"/>
+              <w:bottom w:val="single" w:sz="2" w:space="0" w:color="AAAAAA"/>
+              <w:right w:val="single" w:sz="2" w:space="0" w:color="AAAAAA"/>
+            </w:tcBorders>
+          </w:tcPr>
+          <w:p>
+            <w:pPr>
+              <w:pStyle w:val="Normal"/>
+              <w:rPr/>
+            </w:pPr>
+            <w:r>
+              <w:rPr/>
+            </w:r>
+          </w:p>
+        </w:tc>
+      </w:tr>
+      <w:tr>
+        <w:trPr/>
+        <w:tc>
+          <w:tcPr>
+            <w:tcW w:w="9360" w:type="dxa"/>
+            <w:tcBorders>
+              <w:left w:val="single" w:sz="2" w:space="0" w:color="AAAAAA"/>
+              <w:bottom w:val="single" w:sz="2" w:space="0" w:color="AAAAAA"/>
+              <w:right w:val="single" w:sz="2" w:space="0" w:color="AAAAAA"/>
+            </w:tcBorders>
+          </w:tcPr>
+          <w:p>
+            <w:pPr>
+              <w:pStyle w:val="Normal"/>
+              <w:rPr/>
+            </w:pPr>
+            <w:r>
+              <w:rPr/>
+            </w:r>
+          </w:p>
+        </w:tc>
+      </w:tr>
+      <w:tr>
+        <w:trPr/>
+        <w:tc>
+          <w:tcPr>
+            <w:tcW w:w="9360" w:type="dxa"/>
+            <w:tcBorders>
+              <w:left w:val="single" w:sz="2" w:space="0" w:color="AAAAAA"/>
+              <w:bottom w:val="single" w:sz="2" w:space="0" w:color="AAAAAA"/>
+              <w:right w:val="single" w:sz="2" w:space="0" w:color="AAAAAA"/>
+            </w:tcBorders>
+          </w:tcPr>
+          <w:p>
+            <w:pPr>
+              <w:pStyle w:val="Normal"/>
+              <w:rPr/>
+            </w:pPr>
+            <w:r>
+              <w:rPr/>
+            </w:r>
+          </w:p>
+        </w:tc>
+      </w:tr>
+      <w:tr>
+        <w:trPr/>
+        <w:tc>
+          <w:tcPr>
+            <w:tcW w:w="9360" w:type="dxa"/>
+            <w:tcBorders>
+              <w:left w:val="single" w:sz="2" w:space="0" w:color="AAAAAA"/>
+              <w:bottom w:val="single" w:sz="2" w:space="0" w:color="AAAAAA"/>
+              <w:right w:val="single" w:sz="2" w:space="0" w:color="AAAAAA"/>
+            </w:tcBorders>
+          </w:tcPr>
+          <w:p>
+            <w:pPr>
+              <w:pStyle w:val="Normal"/>
+              <w:rPr/>
+            </w:pPr>
+            <w:r>
+              <w:rPr/>
+            </w:r>
+          </w:p>
+        </w:tc>
+      </w:tr>
+      <w:tr>
+        <w:trPr/>
+        <w:tc>
+          <w:tcPr>
+            <w:tcW w:w="9360" w:type="dxa"/>
+            <w:tcBorders>
+              <w:left w:val="single" w:sz="2" w:space="0" w:color="AAAAAA"/>
+              <w:bottom w:val="single" w:sz="2" w:space="0" w:color="AAAAAA"/>
+              <w:right w:val="single" w:sz="2" w:space="0" w:color="AAAAAA"/>
+            </w:tcBorders>
+          </w:tcPr>
+          <w:p>
+            <w:pPr>
+              <w:pStyle w:val="Normal"/>
+              <w:rPr/>
+            </w:pPr>
+            <w:r>
+              <w:rPr/>
+            </w:r>
+          </w:p>
+        </w:tc>
+      </w:tr>
+    </w:tbl>
+    <w:p>
+      <w:pPr>
+        <w:pStyle w:val="Normal"/>
+        <w:spacing w:before="120" w:after="0"/>
+        <w:rPr/>
+      </w:pPr>
+      <w:r>
+        <w:rPr/>
+      </w:r>
+    </w:p>
+    <w:p>
+      <w:pPr>
+        <w:pStyle w:val="Heading2"/>
+        <w:spacing w:before="320" w:after="100"/>
+        <w:rPr/>
+      </w:pPr>
+      <w:r>
+        <w:rPr>
+          <w:rFonts w:eastAsia="Georgia" w:cs="Georgia" w:ascii="Georgia" w:hAnsi="Georgia"/>
+          <w:b/>
+          <w:bCs/>
+          <w:color w:val="C68B2A"/>
+          <w:sz w:val="28"/>
+          <w:szCs w:val="28"/>
+        </w:rPr>
+        <w:t>Completion Record</w:t>
       </w:r>
     </w:p>
     <w:tbl>
@@ -1940,7 +3760,7 @@
                 <w:sz w:val="19"/>
                 <w:szCs w:val="19"/>
               </w:rPr>
-              <w:t>Tests passing at start:</w:t>
+              <w:t>Date completed:</w:t>
             </w:r>
           </w:p>
         </w:tc>
@@ -1962,7 +3782,7 @@
             </w:pPr>
             <w:r>
               <w:rPr/>
-              <w:t>NA</w:t>
+              <w:t>03 March 2026</w:t>
             </w:r>
           </w:p>
         </w:tc>
@@ -1976,1197 +3796,6 @@
       </w:pPr>
       <w:r>
         <w:rPr/>
-      </w:r>
-    </w:p>
-    <w:p>
-      <w:pPr>
-        <w:pStyle w:val="Normal"/>
-        <w:spacing w:before="60" w:after="0"/>
-        <w:rPr/>
-      </w:pPr>
-      <w:r>
-        <w:rPr/>
-      </w:r>
-    </w:p>
-    <w:tbl>
-      <w:tblPr>
-        <w:tblW w:w="9360" w:type="dxa"/>
-        <w:jc w:val="left"/>
-        <w:tblInd w:w="0" w:type="dxa"/>
-        <w:tblLayout w:type="fixed"/>
-        <w:tblCellMar>
-          <w:top w:w="60" w:type="dxa"/>
-          <w:left w:w="120" w:type="dxa"/>
-          <w:bottom w:w="60" w:type="dxa"/>
-          <w:right w:w="120" w:type="dxa"/>
-        </w:tblCellMar>
-      </w:tblPr>
-      <w:tblGrid>
-        <w:gridCol w:w="9360"/>
-      </w:tblGrid>
-      <w:tr>
-        <w:trPr/>
-        <w:tc>
-          <w:tcPr>
-            <w:tcW w:w="9360" w:type="dxa"/>
-            <w:tcBorders>
-              <w:top w:val="single" w:sz="2" w:space="0" w:color="AAAAAA"/>
-              <w:left w:val="single" w:sz="2" w:space="0" w:color="AAAAAA"/>
-              <w:bottom w:val="single" w:sz="2" w:space="0" w:color="AAAAAA"/>
-              <w:right w:val="single" w:sz="2" w:space="0" w:color="AAAAAA"/>
-            </w:tcBorders>
-          </w:tcPr>
-          <w:p>
-            <w:pPr>
-              <w:pStyle w:val="Normal"/>
-              <w:rPr/>
-            </w:pPr>
-            <w:r>
-              <w:rPr>
-                <w:rFonts w:eastAsia="Georgia" w:cs="Georgia"/>
-                <w:b/>
-                <w:bCs/>
-                <w:color w:val="5A6070"/>
-                <w:sz w:val="18"/>
-                <w:szCs w:val="18"/>
-              </w:rPr>
-              <w:t>What I understand about this phase before starting:</w:t>
-            </w:r>
-          </w:p>
-        </w:tc>
-      </w:tr>
-      <w:tr>
-        <w:trPr/>
-        <w:tc>
-          <w:tcPr>
-            <w:tcW w:w="9360" w:type="dxa"/>
-            <w:tcBorders>
-              <w:left w:val="single" w:sz="2" w:space="0" w:color="AAAAAA"/>
-              <w:bottom w:val="single" w:sz="2" w:space="0" w:color="AAAAAA"/>
-              <w:right w:val="single" w:sz="2" w:space="0" w:color="AAAAAA"/>
-            </w:tcBorders>
-          </w:tcPr>
-          <w:p>
-            <w:pPr>
-              <w:pStyle w:val="Normal"/>
-              <w:rPr/>
-            </w:pPr>
-            <w:r>
-              <w:rPr/>
-              <w:t>I have developed a considerable bank of philosophy, lore, and build content.</w:t>
-            </w:r>
-          </w:p>
-        </w:tc>
-      </w:tr>
-      <w:tr>
-        <w:trPr/>
-        <w:tc>
-          <w:tcPr>
-            <w:tcW w:w="9360" w:type="dxa"/>
-            <w:tcBorders>
-              <w:left w:val="single" w:sz="2" w:space="0" w:color="AAAAAA"/>
-              <w:bottom w:val="single" w:sz="2" w:space="0" w:color="AAAAAA"/>
-              <w:right w:val="single" w:sz="2" w:space="0" w:color="AAAAAA"/>
-            </w:tcBorders>
-          </w:tcPr>
-          <w:p>
-            <w:pPr>
-              <w:pStyle w:val="Normal"/>
-              <w:rPr/>
-            </w:pPr>
-            <w:r>
-              <w:rPr/>
-              <w:t>Now, on the first day of the Mercurial Retrograde, I am  commencing phase 1.</w:t>
-            </w:r>
-          </w:p>
-        </w:tc>
-      </w:tr>
-      <w:tr>
-        <w:trPr/>
-        <w:tc>
-          <w:tcPr>
-            <w:tcW w:w="9360" w:type="dxa"/>
-            <w:tcBorders>
-              <w:left w:val="single" w:sz="2" w:space="0" w:color="AAAAAA"/>
-              <w:bottom w:val="single" w:sz="2" w:space="0" w:color="AAAAAA"/>
-              <w:right w:val="single" w:sz="2" w:space="0" w:color="AAAAAA"/>
-            </w:tcBorders>
-          </w:tcPr>
-          <w:p>
-            <w:pPr>
-              <w:pStyle w:val="Normal"/>
-              <w:rPr/>
-            </w:pPr>
-            <w:r>
-              <w:rPr/>
-              <w:t>This phase simply eases in by renaming some conventions.</w:t>
-            </w:r>
-          </w:p>
-        </w:tc>
-      </w:tr>
-    </w:tbl>
-    <w:p>
-      <w:pPr>
-        <w:pStyle w:val="Normal"/>
-        <w:spacing w:before="120" w:after="0"/>
-        <w:rPr/>
-      </w:pPr>
-      <w:r>
-        <w:rPr/>
-      </w:r>
-    </w:p>
-    <w:p>
-      <w:pPr>
-        <w:pStyle w:val="Heading2"/>
-        <w:spacing w:before="320" w:after="100"/>
-        <w:rPr/>
-      </w:pPr>
-      <w:r>
-        <w:rPr>
-          <w:rFonts w:eastAsia="Georgia" w:cs="Georgia" w:ascii="Georgia" w:hAnsi="Georgia"/>
-          <w:b/>
-          <w:bCs/>
-          <w:color w:val="C68B2A"/>
-          <w:sz w:val="28"/>
-          <w:szCs w:val="28"/>
-        </w:rPr>
-        <w:t>Decisions Made</w:t>
-      </w:r>
-    </w:p>
-    <w:p>
-      <w:pPr>
-        <w:pStyle w:val="Normal"/>
-        <w:pBdr>
-          <w:left w:val="single" w:sz="12" w:space="8" w:color="4E8B6F"/>
-        </w:pBdr>
-        <w:spacing w:before="100" w:after="100"/>
-        <w:ind w:left="360"/>
-        <w:rPr/>
-      </w:pPr>
-      <w:r>
-        <w:rPr>
-          <w:rFonts w:eastAsia="Georgia" w:cs="Georgia"/>
-          <w:i/>
-          <w:iCs/>
-          <w:color w:val="4E8B6F"/>
-          <w:sz w:val="21"/>
-          <w:szCs w:val="21"/>
-        </w:rPr>
-        <w:t xml:space="preserve">◆  </w:t>
-      </w:r>
-      <w:r>
-        <w:rPr>
-          <w:rFonts w:eastAsia="Georgia" w:cs="Georgia"/>
-          <w:i/>
-          <w:iCs/>
-          <w:color w:val="4E8B6F"/>
-          <w:sz w:val="21"/>
-          <w:szCs w:val="21"/>
-        </w:rPr>
-        <w:t>Record choices here as you make them — not at the end. One line per decision is enough.</w:t>
-      </w:r>
-    </w:p>
-    <w:p>
-      <w:pPr>
-        <w:pStyle w:val="Normal"/>
-        <w:spacing w:before="60" w:after="0"/>
-        <w:rPr/>
-      </w:pPr>
-      <w:r>
-        <w:rPr/>
-      </w:r>
-    </w:p>
-    <w:tbl>
-      <w:tblPr>
-        <w:tblW w:w="9360" w:type="dxa"/>
-        <w:jc w:val="left"/>
-        <w:tblInd w:w="0" w:type="dxa"/>
-        <w:tblLayout w:type="fixed"/>
-        <w:tblCellMar>
-          <w:top w:w="60" w:type="dxa"/>
-          <w:left w:w="120" w:type="dxa"/>
-          <w:bottom w:w="60" w:type="dxa"/>
-          <w:right w:w="120" w:type="dxa"/>
-        </w:tblCellMar>
-      </w:tblPr>
-      <w:tblGrid>
-        <w:gridCol w:w="9360"/>
-      </w:tblGrid>
-      <w:tr>
-        <w:trPr/>
-        <w:tc>
-          <w:tcPr>
-            <w:tcW w:w="9360" w:type="dxa"/>
-            <w:tcBorders>
-              <w:top w:val="single" w:sz="2" w:space="0" w:color="AAAAAA"/>
-              <w:left w:val="single" w:sz="2" w:space="0" w:color="AAAAAA"/>
-              <w:bottom w:val="single" w:sz="2" w:space="0" w:color="AAAAAA"/>
-              <w:right w:val="single" w:sz="2" w:space="0" w:color="AAAAAA"/>
-            </w:tcBorders>
-          </w:tcPr>
-          <w:p>
-            <w:pPr>
-              <w:pStyle w:val="Normal"/>
-              <w:rPr/>
-            </w:pPr>
-            <w:r>
-              <w:rPr>
-                <w:rFonts w:eastAsia="Georgia" w:cs="Georgia"/>
-                <w:b/>
-                <w:bCs/>
-                <w:color w:val="5A6070"/>
-                <w:sz w:val="18"/>
-                <w:szCs w:val="18"/>
-              </w:rPr>
-              <w:t>Decision log — one per line:</w:t>
-            </w:r>
-          </w:p>
-        </w:tc>
-      </w:tr>
-      <w:tr>
-        <w:trPr/>
-        <w:tc>
-          <w:tcPr>
-            <w:tcW w:w="9360" w:type="dxa"/>
-            <w:tcBorders>
-              <w:left w:val="single" w:sz="2" w:space="0" w:color="AAAAAA"/>
-              <w:bottom w:val="single" w:sz="2" w:space="0" w:color="AAAAAA"/>
-              <w:right w:val="single" w:sz="2" w:space="0" w:color="AAAAAA"/>
-            </w:tcBorders>
-          </w:tcPr>
-          <w:p>
-            <w:pPr>
-              <w:pStyle w:val="Normal"/>
-              <w:rPr/>
-            </w:pPr>
-            <w:r>
-              <w:rPr/>
-            </w:r>
-          </w:p>
-        </w:tc>
-      </w:tr>
-      <w:tr>
-        <w:trPr/>
-        <w:tc>
-          <w:tcPr>
-            <w:tcW w:w="9360" w:type="dxa"/>
-            <w:tcBorders>
-              <w:left w:val="single" w:sz="2" w:space="0" w:color="AAAAAA"/>
-              <w:bottom w:val="single" w:sz="2" w:space="0" w:color="AAAAAA"/>
-              <w:right w:val="single" w:sz="2" w:space="0" w:color="AAAAAA"/>
-            </w:tcBorders>
-          </w:tcPr>
-          <w:p>
-            <w:pPr>
-              <w:pStyle w:val="Normal"/>
-              <w:rPr/>
-            </w:pPr>
-            <w:r>
-              <w:rPr/>
-            </w:r>
-          </w:p>
-        </w:tc>
-      </w:tr>
-      <w:tr>
-        <w:trPr/>
-        <w:tc>
-          <w:tcPr>
-            <w:tcW w:w="9360" w:type="dxa"/>
-            <w:tcBorders>
-              <w:left w:val="single" w:sz="2" w:space="0" w:color="AAAAAA"/>
-              <w:bottom w:val="single" w:sz="2" w:space="0" w:color="AAAAAA"/>
-              <w:right w:val="single" w:sz="2" w:space="0" w:color="AAAAAA"/>
-            </w:tcBorders>
-          </w:tcPr>
-          <w:p>
-            <w:pPr>
-              <w:pStyle w:val="Normal"/>
-              <w:rPr/>
-            </w:pPr>
-            <w:r>
-              <w:rPr/>
-            </w:r>
-          </w:p>
-        </w:tc>
-      </w:tr>
-      <w:tr>
-        <w:trPr/>
-        <w:tc>
-          <w:tcPr>
-            <w:tcW w:w="9360" w:type="dxa"/>
-            <w:tcBorders>
-              <w:left w:val="single" w:sz="2" w:space="0" w:color="AAAAAA"/>
-              <w:bottom w:val="single" w:sz="2" w:space="0" w:color="AAAAAA"/>
-              <w:right w:val="single" w:sz="2" w:space="0" w:color="AAAAAA"/>
-            </w:tcBorders>
-          </w:tcPr>
-          <w:p>
-            <w:pPr>
-              <w:pStyle w:val="Normal"/>
-              <w:rPr/>
-            </w:pPr>
-            <w:r>
-              <w:rPr/>
-            </w:r>
-          </w:p>
-        </w:tc>
-      </w:tr>
-      <w:tr>
-        <w:trPr/>
-        <w:tc>
-          <w:tcPr>
-            <w:tcW w:w="9360" w:type="dxa"/>
-            <w:tcBorders>
-              <w:left w:val="single" w:sz="2" w:space="0" w:color="AAAAAA"/>
-              <w:bottom w:val="single" w:sz="2" w:space="0" w:color="AAAAAA"/>
-              <w:right w:val="single" w:sz="2" w:space="0" w:color="AAAAAA"/>
-            </w:tcBorders>
-          </w:tcPr>
-          <w:p>
-            <w:pPr>
-              <w:pStyle w:val="Normal"/>
-              <w:rPr/>
-            </w:pPr>
-            <w:r>
-              <w:rPr/>
-            </w:r>
-          </w:p>
-        </w:tc>
-      </w:tr>
-      <w:tr>
-        <w:trPr/>
-        <w:tc>
-          <w:tcPr>
-            <w:tcW w:w="9360" w:type="dxa"/>
-            <w:tcBorders>
-              <w:left w:val="single" w:sz="2" w:space="0" w:color="AAAAAA"/>
-              <w:bottom w:val="single" w:sz="2" w:space="0" w:color="AAAAAA"/>
-              <w:right w:val="single" w:sz="2" w:space="0" w:color="AAAAAA"/>
-            </w:tcBorders>
-          </w:tcPr>
-          <w:p>
-            <w:pPr>
-              <w:pStyle w:val="Normal"/>
-              <w:rPr/>
-            </w:pPr>
-            <w:r>
-              <w:rPr/>
-            </w:r>
-          </w:p>
-        </w:tc>
-      </w:tr>
-      <w:tr>
-        <w:trPr/>
-        <w:tc>
-          <w:tcPr>
-            <w:tcW w:w="9360" w:type="dxa"/>
-            <w:tcBorders>
-              <w:left w:val="single" w:sz="2" w:space="0" w:color="AAAAAA"/>
-              <w:bottom w:val="single" w:sz="2" w:space="0" w:color="AAAAAA"/>
-              <w:right w:val="single" w:sz="2" w:space="0" w:color="AAAAAA"/>
-            </w:tcBorders>
-          </w:tcPr>
-          <w:p>
-            <w:pPr>
-              <w:pStyle w:val="Normal"/>
-              <w:rPr/>
-            </w:pPr>
-            <w:r>
-              <w:rPr/>
-            </w:r>
-          </w:p>
-        </w:tc>
-      </w:tr>
-    </w:tbl>
-    <w:p>
-      <w:pPr>
-        <w:pStyle w:val="Normal"/>
-        <w:spacing w:before="120" w:after="0"/>
-        <w:rPr/>
-      </w:pPr>
-      <w:r>
-        <w:rPr/>
-      </w:r>
-    </w:p>
-    <w:p>
-      <w:pPr>
-        <w:pStyle w:val="Heading2"/>
-        <w:spacing w:before="320" w:after="100"/>
-        <w:rPr/>
-      </w:pPr>
-      <w:r>
-        <w:rPr>
-          <w:rFonts w:eastAsia="Georgia" w:cs="Georgia" w:ascii="Georgia" w:hAnsi="Georgia"/>
-          <w:b/>
-          <w:bCs/>
-          <w:color w:val="C68B2A"/>
-          <w:sz w:val="28"/>
-          <w:szCs w:val="28"/>
-        </w:rPr>
-        <w:t>Deviations from Spec</w:t>
-      </w:r>
-    </w:p>
-    <w:p>
-      <w:pPr>
-        <w:pStyle w:val="Normal"/>
-        <w:spacing w:before="70" w:after="90"/>
-        <w:rPr/>
-      </w:pPr>
-      <w:r>
-        <w:rPr>
-          <w:rFonts w:eastAsia="Georgia" w:cs="Georgia"/>
-          <w:b w:val="false"/>
-          <w:bCs w:val="false"/>
-          <w:i w:val="false"/>
-          <w:iCs w:val="false"/>
-          <w:color w:val="1A1A2E"/>
-          <w:sz w:val="22"/>
-          <w:szCs w:val="22"/>
-        </w:rPr>
-        <w:t>The spec is a blueprint, not a contract. Record every place you deviated, why, and whether the deviation is permanent or temporary.</w:t>
-      </w:r>
-    </w:p>
-    <w:p>
-      <w:pPr>
-        <w:pStyle w:val="Normal"/>
-        <w:spacing w:before="60" w:after="0"/>
-        <w:rPr/>
-      </w:pPr>
-      <w:r>
-        <w:rPr/>
-      </w:r>
-    </w:p>
-    <w:tbl>
-      <w:tblPr>
-        <w:tblW w:w="9360" w:type="dxa"/>
-        <w:jc w:val="left"/>
-        <w:tblInd w:w="0" w:type="dxa"/>
-        <w:tblLayout w:type="fixed"/>
-        <w:tblCellMar>
-          <w:top w:w="80" w:type="dxa"/>
-          <w:left w:w="120" w:type="dxa"/>
-          <w:bottom w:w="80" w:type="dxa"/>
-          <w:right w:w="120" w:type="dxa"/>
-        </w:tblCellMar>
-      </w:tblPr>
-      <w:tblGrid>
-        <w:gridCol w:w="1599"/>
-        <w:gridCol w:w="2401"/>
-        <w:gridCol w:w="2800"/>
-        <w:gridCol w:w="2559"/>
-      </w:tblGrid>
-      <w:tr>
-        <w:trPr>
-          <w:tblHeader w:val="true"/>
-        </w:trPr>
-        <w:tc>
-          <w:tcPr>
-            <w:tcW w:w="1599" w:type="dxa"/>
-            <w:tcBorders>
-              <w:top w:val="single" w:sz="2" w:space="0" w:color="AAAAAA"/>
-              <w:left w:val="single" w:sz="2" w:space="0" w:color="AAAAAA"/>
-              <w:bottom w:val="single" w:sz="2" w:space="0" w:color="AAAAAA"/>
-              <w:right w:val="single" w:sz="2" w:space="0" w:color="AAAAAA"/>
-            </w:tcBorders>
-            <w:shd w:fill="2A2535" w:val="clear"/>
-          </w:tcPr>
-          <w:p>
-            <w:pPr>
-              <w:pStyle w:val="Normal"/>
-              <w:rPr/>
-            </w:pPr>
-            <w:r>
-              <w:rPr>
-                <w:rFonts w:eastAsia="Georgia" w:cs="Georgia"/>
-                <w:b/>
-                <w:bCs/>
-                <w:color w:val="B8860B"/>
-                <w:sz w:val="19"/>
-                <w:szCs w:val="19"/>
-              </w:rPr>
-              <w:t>Section</w:t>
-            </w:r>
-          </w:p>
-        </w:tc>
-        <w:tc>
-          <w:tcPr>
-            <w:tcW w:w="2401" w:type="dxa"/>
-            <w:tcBorders>
-              <w:top w:val="single" w:sz="2" w:space="0" w:color="AAAAAA"/>
-              <w:left w:val="single" w:sz="2" w:space="0" w:color="AAAAAA"/>
-              <w:bottom w:val="single" w:sz="2" w:space="0" w:color="AAAAAA"/>
-              <w:right w:val="single" w:sz="2" w:space="0" w:color="AAAAAA"/>
-            </w:tcBorders>
-            <w:shd w:fill="2A2535" w:val="clear"/>
-          </w:tcPr>
-          <w:p>
-            <w:pPr>
-              <w:pStyle w:val="Normal"/>
-              <w:rPr/>
-            </w:pPr>
-            <w:r>
-              <w:rPr>
-                <w:rFonts w:eastAsia="Georgia" w:cs="Georgia"/>
-                <w:b/>
-                <w:bCs/>
-                <w:color w:val="B8860B"/>
-                <w:sz w:val="19"/>
-                <w:szCs w:val="19"/>
-              </w:rPr>
-              <w:t>What Spec Said</w:t>
-            </w:r>
-          </w:p>
-        </w:tc>
-        <w:tc>
-          <w:tcPr>
-            <w:tcW w:w="2800" w:type="dxa"/>
-            <w:tcBorders>
-              <w:top w:val="single" w:sz="2" w:space="0" w:color="AAAAAA"/>
-              <w:left w:val="single" w:sz="2" w:space="0" w:color="AAAAAA"/>
-              <w:bottom w:val="single" w:sz="2" w:space="0" w:color="AAAAAA"/>
-              <w:right w:val="single" w:sz="2" w:space="0" w:color="AAAAAA"/>
-            </w:tcBorders>
-            <w:shd w:fill="2A2535" w:val="clear"/>
-          </w:tcPr>
-          <w:p>
-            <w:pPr>
-              <w:pStyle w:val="Normal"/>
-              <w:rPr/>
-            </w:pPr>
-            <w:r>
-              <w:rPr>
-                <w:rFonts w:eastAsia="Georgia" w:cs="Georgia"/>
-                <w:b/>
-                <w:bCs/>
-                <w:color w:val="B8860B"/>
-                <w:sz w:val="19"/>
-                <w:szCs w:val="19"/>
-              </w:rPr>
-              <w:t>What I Did Instead</w:t>
-            </w:r>
-          </w:p>
-        </w:tc>
-        <w:tc>
-          <w:tcPr>
-            <w:tcW w:w="2559" w:type="dxa"/>
-            <w:tcBorders>
-              <w:top w:val="single" w:sz="2" w:space="0" w:color="AAAAAA"/>
-              <w:left w:val="single" w:sz="2" w:space="0" w:color="AAAAAA"/>
-              <w:bottom w:val="single" w:sz="2" w:space="0" w:color="AAAAAA"/>
-              <w:right w:val="single" w:sz="2" w:space="0" w:color="AAAAAA"/>
-            </w:tcBorders>
-            <w:shd w:fill="2A2535" w:val="clear"/>
-          </w:tcPr>
-          <w:p>
-            <w:pPr>
-              <w:pStyle w:val="Normal"/>
-              <w:rPr/>
-            </w:pPr>
-            <w:r>
-              <w:rPr>
-                <w:rFonts w:eastAsia="Georgia" w:cs="Georgia"/>
-                <w:b/>
-                <w:bCs/>
-                <w:color w:val="B8860B"/>
-                <w:sz w:val="19"/>
-                <w:szCs w:val="19"/>
-              </w:rPr>
-              <w:t>Why / Status</w:t>
-            </w:r>
-          </w:p>
-        </w:tc>
-      </w:tr>
-      <w:tr>
-        <w:trPr/>
-        <w:tc>
-          <w:tcPr>
-            <w:tcW w:w="1599" w:type="dxa"/>
-            <w:tcBorders>
-              <w:top w:val="single" w:sz="2" w:space="0" w:color="AAAAAA"/>
-              <w:left w:val="single" w:sz="2" w:space="0" w:color="AAAAAA"/>
-              <w:bottom w:val="single" w:sz="2" w:space="0" w:color="AAAAAA"/>
-              <w:right w:val="single" w:sz="2" w:space="0" w:color="AAAAAA"/>
-            </w:tcBorders>
-            <w:shd w:fill="F5F2EA" w:val="clear"/>
-          </w:tcPr>
-          <w:p>
-            <w:pPr>
-              <w:pStyle w:val="Normal"/>
-              <w:rPr/>
-            </w:pPr>
-            <w:r>
-              <w:rPr/>
-            </w:r>
-          </w:p>
-        </w:tc>
-        <w:tc>
-          <w:tcPr>
-            <w:tcW w:w="2401" w:type="dxa"/>
-            <w:tcBorders>
-              <w:top w:val="single" w:sz="2" w:space="0" w:color="AAAAAA"/>
-              <w:left w:val="single" w:sz="2" w:space="0" w:color="AAAAAA"/>
-              <w:bottom w:val="single" w:sz="2" w:space="0" w:color="AAAAAA"/>
-              <w:right w:val="single" w:sz="2" w:space="0" w:color="AAAAAA"/>
-            </w:tcBorders>
-            <w:shd w:fill="F5F2EA" w:val="clear"/>
-          </w:tcPr>
-          <w:p>
-            <w:pPr>
-              <w:pStyle w:val="Normal"/>
-              <w:rPr/>
-            </w:pPr>
-            <w:r>
-              <w:rPr/>
-            </w:r>
-          </w:p>
-        </w:tc>
-        <w:tc>
-          <w:tcPr>
-            <w:tcW w:w="2800" w:type="dxa"/>
-            <w:tcBorders>
-              <w:top w:val="single" w:sz="2" w:space="0" w:color="AAAAAA"/>
-              <w:left w:val="single" w:sz="2" w:space="0" w:color="AAAAAA"/>
-              <w:bottom w:val="single" w:sz="2" w:space="0" w:color="AAAAAA"/>
-              <w:right w:val="single" w:sz="2" w:space="0" w:color="AAAAAA"/>
-            </w:tcBorders>
-            <w:shd w:fill="F5F2EA" w:val="clear"/>
-          </w:tcPr>
-          <w:p>
-            <w:pPr>
-              <w:pStyle w:val="Normal"/>
-              <w:rPr/>
-            </w:pPr>
-            <w:r>
-              <w:rPr/>
-            </w:r>
-          </w:p>
-        </w:tc>
-        <w:tc>
-          <w:tcPr>
-            <w:tcW w:w="2559" w:type="dxa"/>
-            <w:tcBorders>
-              <w:top w:val="single" w:sz="2" w:space="0" w:color="AAAAAA"/>
-              <w:left w:val="single" w:sz="2" w:space="0" w:color="AAAAAA"/>
-              <w:bottom w:val="single" w:sz="2" w:space="0" w:color="AAAAAA"/>
-              <w:right w:val="single" w:sz="2" w:space="0" w:color="AAAAAA"/>
-            </w:tcBorders>
-            <w:shd w:fill="F5F2EA" w:val="clear"/>
-          </w:tcPr>
-          <w:p>
-            <w:pPr>
-              <w:pStyle w:val="Normal"/>
-              <w:rPr/>
-            </w:pPr>
-            <w:r>
-              <w:rPr/>
-            </w:r>
-          </w:p>
-        </w:tc>
-      </w:tr>
-      <w:tr>
-        <w:trPr/>
-        <w:tc>
-          <w:tcPr>
-            <w:tcW w:w="1599" w:type="dxa"/>
-            <w:tcBorders>
-              <w:top w:val="single" w:sz="2" w:space="0" w:color="AAAAAA"/>
-              <w:left w:val="single" w:sz="2" w:space="0" w:color="AAAAAA"/>
-              <w:bottom w:val="single" w:sz="2" w:space="0" w:color="AAAAAA"/>
-              <w:right w:val="single" w:sz="2" w:space="0" w:color="AAAAAA"/>
-            </w:tcBorders>
-            <w:shd w:fill="EEEBE0" w:val="clear"/>
-          </w:tcPr>
-          <w:p>
-            <w:pPr>
-              <w:pStyle w:val="Normal"/>
-              <w:rPr/>
-            </w:pPr>
-            <w:r>
-              <w:rPr/>
-            </w:r>
-          </w:p>
-        </w:tc>
-        <w:tc>
-          <w:tcPr>
-            <w:tcW w:w="2401" w:type="dxa"/>
-            <w:tcBorders>
-              <w:top w:val="single" w:sz="2" w:space="0" w:color="AAAAAA"/>
-              <w:left w:val="single" w:sz="2" w:space="0" w:color="AAAAAA"/>
-              <w:bottom w:val="single" w:sz="2" w:space="0" w:color="AAAAAA"/>
-              <w:right w:val="single" w:sz="2" w:space="0" w:color="AAAAAA"/>
-            </w:tcBorders>
-            <w:shd w:fill="EEEBE0" w:val="clear"/>
-          </w:tcPr>
-          <w:p>
-            <w:pPr>
-              <w:pStyle w:val="Normal"/>
-              <w:rPr/>
-            </w:pPr>
-            <w:r>
-              <w:rPr/>
-            </w:r>
-          </w:p>
-        </w:tc>
-        <w:tc>
-          <w:tcPr>
-            <w:tcW w:w="2800" w:type="dxa"/>
-            <w:tcBorders>
-              <w:top w:val="single" w:sz="2" w:space="0" w:color="AAAAAA"/>
-              <w:left w:val="single" w:sz="2" w:space="0" w:color="AAAAAA"/>
-              <w:bottom w:val="single" w:sz="2" w:space="0" w:color="AAAAAA"/>
-              <w:right w:val="single" w:sz="2" w:space="0" w:color="AAAAAA"/>
-            </w:tcBorders>
-            <w:shd w:fill="EEEBE0" w:val="clear"/>
-          </w:tcPr>
-          <w:p>
-            <w:pPr>
-              <w:pStyle w:val="Normal"/>
-              <w:rPr/>
-            </w:pPr>
-            <w:r>
-              <w:rPr/>
-            </w:r>
-          </w:p>
-        </w:tc>
-        <w:tc>
-          <w:tcPr>
-            <w:tcW w:w="2559" w:type="dxa"/>
-            <w:tcBorders>
-              <w:top w:val="single" w:sz="2" w:space="0" w:color="AAAAAA"/>
-              <w:left w:val="single" w:sz="2" w:space="0" w:color="AAAAAA"/>
-              <w:bottom w:val="single" w:sz="2" w:space="0" w:color="AAAAAA"/>
-              <w:right w:val="single" w:sz="2" w:space="0" w:color="AAAAAA"/>
-            </w:tcBorders>
-            <w:shd w:fill="EEEBE0" w:val="clear"/>
-          </w:tcPr>
-          <w:p>
-            <w:pPr>
-              <w:pStyle w:val="Normal"/>
-              <w:rPr/>
-            </w:pPr>
-            <w:r>
-              <w:rPr/>
-            </w:r>
-          </w:p>
-        </w:tc>
-      </w:tr>
-      <w:tr>
-        <w:trPr/>
-        <w:tc>
-          <w:tcPr>
-            <w:tcW w:w="1599" w:type="dxa"/>
-            <w:tcBorders>
-              <w:top w:val="single" w:sz="2" w:space="0" w:color="AAAAAA"/>
-              <w:left w:val="single" w:sz="2" w:space="0" w:color="AAAAAA"/>
-              <w:bottom w:val="single" w:sz="2" w:space="0" w:color="AAAAAA"/>
-              <w:right w:val="single" w:sz="2" w:space="0" w:color="AAAAAA"/>
-            </w:tcBorders>
-            <w:shd w:fill="F5F2EA" w:val="clear"/>
-          </w:tcPr>
-          <w:p>
-            <w:pPr>
-              <w:pStyle w:val="Normal"/>
-              <w:rPr/>
-            </w:pPr>
-            <w:r>
-              <w:rPr/>
-            </w:r>
-          </w:p>
-        </w:tc>
-        <w:tc>
-          <w:tcPr>
-            <w:tcW w:w="2401" w:type="dxa"/>
-            <w:tcBorders>
-              <w:top w:val="single" w:sz="2" w:space="0" w:color="AAAAAA"/>
-              <w:left w:val="single" w:sz="2" w:space="0" w:color="AAAAAA"/>
-              <w:bottom w:val="single" w:sz="2" w:space="0" w:color="AAAAAA"/>
-              <w:right w:val="single" w:sz="2" w:space="0" w:color="AAAAAA"/>
-            </w:tcBorders>
-            <w:shd w:fill="F5F2EA" w:val="clear"/>
-          </w:tcPr>
-          <w:p>
-            <w:pPr>
-              <w:pStyle w:val="Normal"/>
-              <w:rPr/>
-            </w:pPr>
-            <w:r>
-              <w:rPr/>
-            </w:r>
-          </w:p>
-        </w:tc>
-        <w:tc>
-          <w:tcPr>
-            <w:tcW w:w="2800" w:type="dxa"/>
-            <w:tcBorders>
-              <w:top w:val="single" w:sz="2" w:space="0" w:color="AAAAAA"/>
-              <w:left w:val="single" w:sz="2" w:space="0" w:color="AAAAAA"/>
-              <w:bottom w:val="single" w:sz="2" w:space="0" w:color="AAAAAA"/>
-              <w:right w:val="single" w:sz="2" w:space="0" w:color="AAAAAA"/>
-            </w:tcBorders>
-            <w:shd w:fill="F5F2EA" w:val="clear"/>
-          </w:tcPr>
-          <w:p>
-            <w:pPr>
-              <w:pStyle w:val="Normal"/>
-              <w:rPr/>
-            </w:pPr>
-            <w:r>
-              <w:rPr/>
-            </w:r>
-          </w:p>
-        </w:tc>
-        <w:tc>
-          <w:tcPr>
-            <w:tcW w:w="2559" w:type="dxa"/>
-            <w:tcBorders>
-              <w:top w:val="single" w:sz="2" w:space="0" w:color="AAAAAA"/>
-              <w:left w:val="single" w:sz="2" w:space="0" w:color="AAAAAA"/>
-              <w:bottom w:val="single" w:sz="2" w:space="0" w:color="AAAAAA"/>
-              <w:right w:val="single" w:sz="2" w:space="0" w:color="AAAAAA"/>
-            </w:tcBorders>
-            <w:shd w:fill="F5F2EA" w:val="clear"/>
-          </w:tcPr>
-          <w:p>
-            <w:pPr>
-              <w:pStyle w:val="Normal"/>
-              <w:rPr/>
-            </w:pPr>
-            <w:r>
-              <w:rPr/>
-            </w:r>
-          </w:p>
-        </w:tc>
-      </w:tr>
-      <w:tr>
-        <w:trPr/>
-        <w:tc>
-          <w:tcPr>
-            <w:tcW w:w="1599" w:type="dxa"/>
-            <w:tcBorders>
-              <w:top w:val="single" w:sz="2" w:space="0" w:color="AAAAAA"/>
-              <w:left w:val="single" w:sz="2" w:space="0" w:color="AAAAAA"/>
-              <w:bottom w:val="single" w:sz="2" w:space="0" w:color="AAAAAA"/>
-              <w:right w:val="single" w:sz="2" w:space="0" w:color="AAAAAA"/>
-            </w:tcBorders>
-            <w:shd w:fill="EEEBE0" w:val="clear"/>
-          </w:tcPr>
-          <w:p>
-            <w:pPr>
-              <w:pStyle w:val="Normal"/>
-              <w:rPr/>
-            </w:pPr>
-            <w:r>
-              <w:rPr/>
-            </w:r>
-          </w:p>
-        </w:tc>
-        <w:tc>
-          <w:tcPr>
-            <w:tcW w:w="2401" w:type="dxa"/>
-            <w:tcBorders>
-              <w:top w:val="single" w:sz="2" w:space="0" w:color="AAAAAA"/>
-              <w:left w:val="single" w:sz="2" w:space="0" w:color="AAAAAA"/>
-              <w:bottom w:val="single" w:sz="2" w:space="0" w:color="AAAAAA"/>
-              <w:right w:val="single" w:sz="2" w:space="0" w:color="AAAAAA"/>
-            </w:tcBorders>
-            <w:shd w:fill="EEEBE0" w:val="clear"/>
-          </w:tcPr>
-          <w:p>
-            <w:pPr>
-              <w:pStyle w:val="Normal"/>
-              <w:rPr/>
-            </w:pPr>
-            <w:r>
-              <w:rPr/>
-            </w:r>
-          </w:p>
-        </w:tc>
-        <w:tc>
-          <w:tcPr>
-            <w:tcW w:w="2800" w:type="dxa"/>
-            <w:tcBorders>
-              <w:top w:val="single" w:sz="2" w:space="0" w:color="AAAAAA"/>
-              <w:left w:val="single" w:sz="2" w:space="0" w:color="AAAAAA"/>
-              <w:bottom w:val="single" w:sz="2" w:space="0" w:color="AAAAAA"/>
-              <w:right w:val="single" w:sz="2" w:space="0" w:color="AAAAAA"/>
-            </w:tcBorders>
-            <w:shd w:fill="EEEBE0" w:val="clear"/>
-          </w:tcPr>
-          <w:p>
-            <w:pPr>
-              <w:pStyle w:val="Normal"/>
-              <w:rPr/>
-            </w:pPr>
-            <w:r>
-              <w:rPr/>
-            </w:r>
-          </w:p>
-        </w:tc>
-        <w:tc>
-          <w:tcPr>
-            <w:tcW w:w="2559" w:type="dxa"/>
-            <w:tcBorders>
-              <w:top w:val="single" w:sz="2" w:space="0" w:color="AAAAAA"/>
-              <w:left w:val="single" w:sz="2" w:space="0" w:color="AAAAAA"/>
-              <w:bottom w:val="single" w:sz="2" w:space="0" w:color="AAAAAA"/>
-              <w:right w:val="single" w:sz="2" w:space="0" w:color="AAAAAA"/>
-            </w:tcBorders>
-            <w:shd w:fill="EEEBE0" w:val="clear"/>
-          </w:tcPr>
-          <w:p>
-            <w:pPr>
-              <w:pStyle w:val="Normal"/>
-              <w:rPr/>
-            </w:pPr>
-            <w:r>
-              <w:rPr/>
-            </w:r>
-          </w:p>
-        </w:tc>
-      </w:tr>
-    </w:tbl>
-    <w:p>
-      <w:pPr>
-        <w:pStyle w:val="Normal"/>
-        <w:spacing w:before="120" w:after="0"/>
-        <w:rPr/>
-      </w:pPr>
-      <w:r>
-        <w:rPr/>
-      </w:r>
-    </w:p>
-    <w:p>
-      <w:pPr>
-        <w:pStyle w:val="Heading2"/>
-        <w:spacing w:before="320" w:after="100"/>
-        <w:rPr/>
-      </w:pPr>
-      <w:r>
-        <w:rPr>
-          <w:rFonts w:eastAsia="Georgia" w:cs="Georgia" w:ascii="Georgia" w:hAnsi="Georgia"/>
-          <w:b/>
-          <w:bCs/>
-          <w:color w:val="C68B2A"/>
-          <w:sz w:val="28"/>
-          <w:szCs w:val="28"/>
-        </w:rPr>
-        <w:t>Friction Points</w:t>
-      </w:r>
-    </w:p>
-    <w:p>
-      <w:pPr>
-        <w:pStyle w:val="Normal"/>
-        <w:spacing w:before="70" w:after="90"/>
-        <w:rPr/>
-      </w:pPr>
-      <w:r>
-        <w:rPr>
-          <w:rFonts w:eastAsia="Georgia" w:cs="Georgia"/>
-          <w:b w:val="false"/>
-          <w:bCs w:val="false"/>
-          <w:i w:val="false"/>
-          <w:iCs w:val="false"/>
-          <w:color w:val="1A1A2E"/>
-          <w:sz w:val="22"/>
-          <w:szCs w:val="22"/>
-        </w:rPr>
-        <w:t>What was harder than expected? What took longer? What confused you? Be specific.</w:t>
-      </w:r>
-    </w:p>
-    <w:p>
-      <w:pPr>
-        <w:pStyle w:val="Normal"/>
-        <w:spacing w:before="60" w:after="0"/>
-        <w:rPr/>
-      </w:pPr>
-      <w:r>
-        <w:rPr/>
-      </w:r>
-    </w:p>
-    <w:tbl>
-      <w:tblPr>
-        <w:tblW w:w="9360" w:type="dxa"/>
-        <w:jc w:val="left"/>
-        <w:tblInd w:w="0" w:type="dxa"/>
-        <w:tblLayout w:type="fixed"/>
-        <w:tblCellMar>
-          <w:top w:w="60" w:type="dxa"/>
-          <w:left w:w="120" w:type="dxa"/>
-          <w:bottom w:w="60" w:type="dxa"/>
-          <w:right w:w="120" w:type="dxa"/>
-        </w:tblCellMar>
-      </w:tblPr>
-      <w:tblGrid>
-        <w:gridCol w:w="9360"/>
-      </w:tblGrid>
-      <w:tr>
-        <w:trPr/>
-        <w:tc>
-          <w:tcPr>
-            <w:tcW w:w="9360" w:type="dxa"/>
-            <w:tcBorders>
-              <w:top w:val="single" w:sz="2" w:space="0" w:color="AAAAAA"/>
-              <w:left w:val="single" w:sz="2" w:space="0" w:color="AAAAAA"/>
-              <w:bottom w:val="single" w:sz="2" w:space="0" w:color="AAAAAA"/>
-              <w:right w:val="single" w:sz="2" w:space="0" w:color="AAAAAA"/>
-            </w:tcBorders>
-          </w:tcPr>
-          <w:p>
-            <w:pPr>
-              <w:pStyle w:val="Normal"/>
-              <w:rPr/>
-            </w:pPr>
-            <w:r>
-              <w:rPr>
-                <w:rFonts w:eastAsia="Georgia" w:cs="Georgia"/>
-                <w:b/>
-                <w:bCs/>
-                <w:color w:val="5A6070"/>
-                <w:sz w:val="18"/>
-                <w:szCs w:val="18"/>
-              </w:rPr>
-              <w:t>Friction points encountered:</w:t>
-            </w:r>
-          </w:p>
-        </w:tc>
-      </w:tr>
-      <w:tr>
-        <w:trPr/>
-        <w:tc>
-          <w:tcPr>
-            <w:tcW w:w="9360" w:type="dxa"/>
-            <w:tcBorders>
-              <w:left w:val="single" w:sz="2" w:space="0" w:color="AAAAAA"/>
-              <w:bottom w:val="single" w:sz="2" w:space="0" w:color="AAAAAA"/>
-              <w:right w:val="single" w:sz="2" w:space="0" w:color="AAAAAA"/>
-            </w:tcBorders>
-          </w:tcPr>
-          <w:p>
-            <w:pPr>
-              <w:pStyle w:val="Normal"/>
-              <w:rPr/>
-            </w:pPr>
-            <w:r>
-              <w:rPr/>
-            </w:r>
-          </w:p>
-        </w:tc>
-      </w:tr>
-      <w:tr>
-        <w:trPr/>
-        <w:tc>
-          <w:tcPr>
-            <w:tcW w:w="9360" w:type="dxa"/>
-            <w:tcBorders>
-              <w:left w:val="single" w:sz="2" w:space="0" w:color="AAAAAA"/>
-              <w:bottom w:val="single" w:sz="2" w:space="0" w:color="AAAAAA"/>
-              <w:right w:val="single" w:sz="2" w:space="0" w:color="AAAAAA"/>
-            </w:tcBorders>
-          </w:tcPr>
-          <w:p>
-            <w:pPr>
-              <w:pStyle w:val="Normal"/>
-              <w:rPr/>
-            </w:pPr>
-            <w:r>
-              <w:rPr/>
-            </w:r>
-          </w:p>
-        </w:tc>
-      </w:tr>
-      <w:tr>
-        <w:trPr/>
-        <w:tc>
-          <w:tcPr>
-            <w:tcW w:w="9360" w:type="dxa"/>
-            <w:tcBorders>
-              <w:left w:val="single" w:sz="2" w:space="0" w:color="AAAAAA"/>
-              <w:bottom w:val="single" w:sz="2" w:space="0" w:color="AAAAAA"/>
-              <w:right w:val="single" w:sz="2" w:space="0" w:color="AAAAAA"/>
-            </w:tcBorders>
-          </w:tcPr>
-          <w:p>
-            <w:pPr>
-              <w:pStyle w:val="Normal"/>
-              <w:rPr/>
-            </w:pPr>
-            <w:r>
-              <w:rPr/>
-            </w:r>
-          </w:p>
-        </w:tc>
-      </w:tr>
-      <w:tr>
-        <w:trPr/>
-        <w:tc>
-          <w:tcPr>
-            <w:tcW w:w="9360" w:type="dxa"/>
-            <w:tcBorders>
-              <w:left w:val="single" w:sz="2" w:space="0" w:color="AAAAAA"/>
-              <w:bottom w:val="single" w:sz="2" w:space="0" w:color="AAAAAA"/>
-              <w:right w:val="single" w:sz="2" w:space="0" w:color="AAAAAA"/>
-            </w:tcBorders>
-          </w:tcPr>
-          <w:p>
-            <w:pPr>
-              <w:pStyle w:val="Normal"/>
-              <w:rPr/>
-            </w:pPr>
-            <w:r>
-              <w:rPr/>
-            </w:r>
-          </w:p>
-        </w:tc>
-      </w:tr>
-      <w:tr>
-        <w:trPr/>
-        <w:tc>
-          <w:tcPr>
-            <w:tcW w:w="9360" w:type="dxa"/>
-            <w:tcBorders>
-              <w:left w:val="single" w:sz="2" w:space="0" w:color="AAAAAA"/>
-              <w:bottom w:val="single" w:sz="2" w:space="0" w:color="AAAAAA"/>
-              <w:right w:val="single" w:sz="2" w:space="0" w:color="AAAAAA"/>
-            </w:tcBorders>
-          </w:tcPr>
-          <w:p>
-            <w:pPr>
-              <w:pStyle w:val="Normal"/>
-              <w:rPr/>
-            </w:pPr>
-            <w:r>
-              <w:rPr/>
-            </w:r>
-          </w:p>
-        </w:tc>
-      </w:tr>
-    </w:tbl>
-    <w:p>
-      <w:pPr>
-        <w:pStyle w:val="Normal"/>
-        <w:spacing w:before="120" w:after="0"/>
-        <w:rPr/>
-      </w:pPr>
-      <w:r>
-        <w:rPr/>
-      </w:r>
-    </w:p>
-    <w:p>
-      <w:pPr>
-        <w:pStyle w:val="Heading2"/>
-        <w:spacing w:before="320" w:after="100"/>
-        <w:rPr/>
-      </w:pPr>
-      <w:r>
-        <w:rPr>
-          <w:rFonts w:eastAsia="Georgia" w:cs="Georgia" w:ascii="Georgia" w:hAnsi="Georgia"/>
-          <w:b/>
-          <w:bCs/>
-          <w:color w:val="C68B2A"/>
-          <w:sz w:val="28"/>
-          <w:szCs w:val="28"/>
-        </w:rPr>
-        <w:t>Completion Record</w:t>
       </w:r>
     </w:p>
     <w:tbl>
@@ -3209,7 +3838,7 @@
                 <w:sz w:val="19"/>
                 <w:szCs w:val="19"/>
               </w:rPr>
-              <w:t>Date completed:</w:t>
+              <w:t>Tests passing at end:</w:t>
             </w:r>
           </w:p>
         </w:tc>
@@ -3231,6 +3860,7 @@
             </w:pPr>
             <w:r>
               <w:rPr/>
+              <w:t>14/14</w:t>
             </w:r>
           </w:p>
         </w:tc>
@@ -3275,7 +3905,9 @@
           <w:p>
             <w:pPr>
               <w:pStyle w:val="Normal"/>
-              <w:rPr/>
+              <w:rPr>
+                <w:rFonts w:ascii="Georgia" w:hAnsi="Georgia"/>
+              </w:rPr>
             </w:pPr>
             <w:r>
               <w:rPr>
@@ -3286,7 +3918,51 @@
                 <w:sz w:val="19"/>
                 <w:szCs w:val="19"/>
               </w:rPr>
-              <w:t>Tests passing at end:</w:t>
+              <w:t>Commit hash:</w:t>
+            </w:r>
+            <w:r>
+              <w:rPr>
+                <w:rFonts w:ascii="monospace" w:hAnsi="monospace"/>
+                <w:color w:val="B26818"/>
+                <w:shd w:fill="FFFFFF" w:val="clear"/>
+              </w:rPr>
+              <w:t>e666f6a</w:t>
+            </w:r>
+            <w:r>
+              <w:rPr>
+                <w:rFonts w:ascii="monospace" w:hAnsi="monospace"/>
+              </w:rPr>
+              <w:br/>
+              <w:t xml:space="preserve">            </w:t>
+            </w:r>
+            <w:r>
+              <w:rPr>
+                <w:rFonts w:ascii="monospace" w:hAnsi="monospace"/>
+                <w:color w:val="B26818"/>
+                <w:shd w:fill="FFFFFF" w:val="clear"/>
+              </w:rPr>
+              <w:t>4ceb6e7</w:t>
+            </w:r>
+            <w:r>
+              <w:rPr>
+                <w:rFonts w:ascii="monospace" w:hAnsi="monospace"/>
+              </w:rPr>
+              <w:br/>
+              <w:t xml:space="preserve">            </w:t>
+            </w:r>
+            <w:r>
+              <w:rPr>
+                <w:rFonts w:ascii="monospace" w:hAnsi="monospace"/>
+                <w:color w:val="B26818"/>
+                <w:shd w:fill="FFFFFF" w:val="clear"/>
+              </w:rPr>
+              <w:t>faef0d1</w:t>
+            </w:r>
+            <w:r>
+              <w:rPr>
+                <w:rFonts w:ascii="monospace" w:hAnsi="monospace"/>
+              </w:rPr>
+              <w:br/>
             </w:r>
           </w:p>
         </w:tc>
@@ -3321,6 +3997,250 @@
       </w:pPr>
       <w:r>
         <w:rPr/>
+      </w:r>
+    </w:p>
+    <w:p>
+      <w:pPr>
+        <w:pStyle w:val="Normal"/>
+        <w:spacing w:before="60" w:after="0"/>
+        <w:rPr/>
+      </w:pPr>
+      <w:r>
+        <w:rPr/>
+      </w:r>
+    </w:p>
+    <w:tbl>
+      <w:tblPr>
+        <w:tblW w:w="9360" w:type="dxa"/>
+        <w:jc w:val="left"/>
+        <w:tblInd w:w="0" w:type="dxa"/>
+        <w:tblLayout w:type="fixed"/>
+        <w:tblCellMar>
+          <w:top w:w="60" w:type="dxa"/>
+          <w:left w:w="120" w:type="dxa"/>
+          <w:bottom w:w="60" w:type="dxa"/>
+          <w:right w:w="120" w:type="dxa"/>
+        </w:tblCellMar>
+      </w:tblPr>
+      <w:tblGrid>
+        <w:gridCol w:w="9360"/>
+      </w:tblGrid>
+      <w:tr>
+        <w:trPr/>
+        <w:tc>
+          <w:tcPr>
+            <w:tcW w:w="9360" w:type="dxa"/>
+            <w:tcBorders>
+              <w:top w:val="single" w:sz="2" w:space="0" w:color="AAAAAA"/>
+              <w:left w:val="single" w:sz="2" w:space="0" w:color="AAAAAA"/>
+              <w:bottom w:val="single" w:sz="2" w:space="0" w:color="AAAAAA"/>
+              <w:right w:val="single" w:sz="2" w:space="0" w:color="AAAAAA"/>
+            </w:tcBorders>
+          </w:tcPr>
+          <w:p>
+            <w:pPr>
+              <w:pStyle w:val="Normal"/>
+              <w:rPr/>
+            </w:pPr>
+            <w:r>
+              <w:rPr>
+                <w:rFonts w:eastAsia="Georgia" w:cs="Georgia"/>
+                <w:b/>
+                <w:bCs/>
+                <w:color w:val="5A6070"/>
+                <w:sz w:val="18"/>
+                <w:szCs w:val="18"/>
+              </w:rPr>
+              <w:t>What I would tell myself before starting this phase:</w:t>
+            </w:r>
+          </w:p>
+        </w:tc>
+      </w:tr>
+      <w:tr>
+        <w:trPr/>
+        <w:tc>
+          <w:tcPr>
+            <w:tcW w:w="9360" w:type="dxa"/>
+            <w:tcBorders>
+              <w:left w:val="single" w:sz="2" w:space="0" w:color="AAAAAA"/>
+              <w:bottom w:val="single" w:sz="2" w:space="0" w:color="AAAAAA"/>
+              <w:right w:val="single" w:sz="2" w:space="0" w:color="AAAAAA"/>
+            </w:tcBorders>
+          </w:tcPr>
+          <w:p>
+            <w:pPr>
+              <w:pStyle w:val="Normal"/>
+              <w:rPr/>
+            </w:pPr>
+            <w:r>
+              <w:rPr/>
+            </w:r>
+          </w:p>
+        </w:tc>
+      </w:tr>
+      <w:tr>
+        <w:trPr/>
+        <w:tc>
+          <w:tcPr>
+            <w:tcW w:w="9360" w:type="dxa"/>
+            <w:tcBorders>
+              <w:left w:val="single" w:sz="2" w:space="0" w:color="AAAAAA"/>
+              <w:bottom w:val="single" w:sz="2" w:space="0" w:color="AAAAAA"/>
+              <w:right w:val="single" w:sz="2" w:space="0" w:color="AAAAAA"/>
+            </w:tcBorders>
+          </w:tcPr>
+          <w:p>
+            <w:pPr>
+              <w:pStyle w:val="Normal"/>
+              <w:rPr/>
+            </w:pPr>
+            <w:r>
+              <w:rPr/>
+            </w:r>
+          </w:p>
+        </w:tc>
+      </w:tr>
+      <w:tr>
+        <w:trPr/>
+        <w:tc>
+          <w:tcPr>
+            <w:tcW w:w="9360" w:type="dxa"/>
+            <w:tcBorders>
+              <w:left w:val="single" w:sz="2" w:space="0" w:color="AAAAAA"/>
+              <w:bottom w:val="single" w:sz="2" w:space="0" w:color="AAAAAA"/>
+              <w:right w:val="single" w:sz="2" w:space="0" w:color="AAAAAA"/>
+            </w:tcBorders>
+          </w:tcPr>
+          <w:p>
+            <w:pPr>
+              <w:pStyle w:val="Normal"/>
+              <w:rPr/>
+            </w:pPr>
+            <w:r>
+              <w:rPr/>
+            </w:r>
+          </w:p>
+        </w:tc>
+      </w:tr>
+    </w:tbl>
+    <w:p>
+      <w:pPr>
+        <w:pStyle w:val="Normal"/>
+        <w:spacing w:before="120" w:after="0"/>
+        <w:rPr/>
+      </w:pPr>
+      <w:r>
+        <w:rPr/>
+      </w:r>
+    </w:p>
+    <w:p>
+      <w:pPr>
+        <w:pStyle w:val="Normal"/>
+        <w:rPr/>
+      </w:pPr>
+      <w:r>
+        <w:rPr/>
+      </w:r>
+      <w:r>
+        <w:br w:type="page"/>
+      </w:r>
+    </w:p>
+    <w:p>
+      <w:pPr>
+        <w:pStyle w:val="Normal"/>
+        <w:spacing w:before="0" w:after="0"/>
+        <w:jc w:val="center"/>
+        <w:rPr/>
+      </w:pPr>
+      <w:r>
+        <w:rPr>
+          <w:rFonts w:eastAsia="Georgia" w:cs="Georgia"/>
+          <w:b/>
+          <w:bCs/>
+          <w:caps/>
+          <w:color w:val="B8860B"/>
+          <w:sz w:val="40"/>
+          <w:szCs w:val="40"/>
+        </w:rPr>
+        <w:t>PHASE 2</w:t>
+      </w:r>
+    </w:p>
+    <w:p>
+      <w:pPr>
+        <w:pStyle w:val="Normal"/>
+        <w:spacing w:before="30" w:after="0"/>
+        <w:jc w:val="center"/>
+        <w:rPr/>
+      </w:pPr>
+      <w:r>
+        <w:rPr>
+          <w:rFonts w:eastAsia="Georgia" w:cs="Georgia"/>
+          <w:i/>
+          <w:iCs/>
+          <w:color w:val="C68B2A"/>
+          <w:sz w:val="28"/>
+          <w:szCs w:val="28"/>
+        </w:rPr>
+        <w:t>Status Visibility</w:t>
+      </w:r>
+    </w:p>
+    <w:p>
+      <w:pPr>
+        <w:pStyle w:val="Normal"/>
+        <w:spacing w:before="40" w:after="0"/>
+        <w:rPr/>
+      </w:pPr>
+      <w:r>
+        <w:rPr/>
+      </w:r>
+    </w:p>
+    <w:p>
+      <w:pPr>
+        <w:pStyle w:val="Normal"/>
+        <w:jc w:val="center"/>
+        <w:rPr/>
+      </w:pPr>
+      <w:r>
+        <w:rPr>
+          <w:rFonts w:eastAsia="Georgia" w:cs="Georgia"/>
+          <w:i/>
+          <w:iCs/>
+          <w:color w:val="5A6070"/>
+          <w:sz w:val="18"/>
+          <w:szCs w:val="18"/>
+        </w:rPr>
+        <w:t>Status layer. Bubble system. Boot sequence. Animations. Conjuration Chamber.</w:t>
+      </w:r>
+    </w:p>
+    <w:p>
+      <w:pPr>
+        <w:pStyle w:val="Normal"/>
+        <w:pBdr>
+          <w:bottom w:val="single" w:sz="4" w:space="4" w:color="C9A84C"/>
+        </w:pBdr>
+        <w:spacing w:before="160" w:after="160"/>
+        <w:rPr/>
+      </w:pPr>
+      <w:r>
+        <w:rPr/>
+      </w:r>
+    </w:p>
+    <w:p>
+      <w:pPr>
+        <w:pStyle w:val="Heading2"/>
+        <w:spacing w:before="320" w:after="100"/>
+        <w:rPr/>
+      </w:pPr>
+      <w:r>
+        <w:rPr>
+          <w:rFonts w:eastAsia="Georgia" w:cs="Georgia" w:ascii="Georgia" w:hAnsi="Georgia"/>
+          <w:b/>
+          <w:bCs/>
+          <w:color w:val="C68B2A"/>
+          <w:sz w:val="28"/>
+          <w:szCs w:val="28"/>
+        </w:rPr>
+        <w:t>Pre-Build State</w:t>
       </w:r>
     </w:p>
     <w:tbl>
@@ -3363,7 +4283,7 @@
                 <w:sz w:val="19"/>
                 <w:szCs w:val="19"/>
               </w:rPr>
-              <w:t>Commit hash:</w:t>
+              <w:t>Date started:</w:t>
             </w:r>
           </w:p>
         </w:tc>
@@ -3385,327 +4305,7 @@
             </w:pPr>
             <w:r>
               <w:rPr/>
-            </w:r>
-          </w:p>
-        </w:tc>
-      </w:tr>
-    </w:tbl>
-    <w:p>
-      <w:pPr>
-        <w:pStyle w:val="Normal"/>
-        <w:spacing w:before="80" w:after="0"/>
-        <w:rPr/>
-      </w:pPr>
-      <w:r>
-        <w:rPr/>
-      </w:r>
-    </w:p>
-    <w:p>
-      <w:pPr>
-        <w:pStyle w:val="Normal"/>
-        <w:spacing w:before="60" w:after="0"/>
-        <w:rPr/>
-      </w:pPr>
-      <w:r>
-        <w:rPr/>
-      </w:r>
-    </w:p>
-    <w:tbl>
-      <w:tblPr>
-        <w:tblW w:w="9360" w:type="dxa"/>
-        <w:jc w:val="left"/>
-        <w:tblInd w:w="0" w:type="dxa"/>
-        <w:tblLayout w:type="fixed"/>
-        <w:tblCellMar>
-          <w:top w:w="60" w:type="dxa"/>
-          <w:left w:w="120" w:type="dxa"/>
-          <w:bottom w:w="60" w:type="dxa"/>
-          <w:right w:w="120" w:type="dxa"/>
-        </w:tblCellMar>
-      </w:tblPr>
-      <w:tblGrid>
-        <w:gridCol w:w="9360"/>
-      </w:tblGrid>
-      <w:tr>
-        <w:trPr/>
-        <w:tc>
-          <w:tcPr>
-            <w:tcW w:w="9360" w:type="dxa"/>
-            <w:tcBorders>
-              <w:top w:val="single" w:sz="2" w:space="0" w:color="AAAAAA"/>
-              <w:left w:val="single" w:sz="2" w:space="0" w:color="AAAAAA"/>
-              <w:bottom w:val="single" w:sz="2" w:space="0" w:color="AAAAAA"/>
-              <w:right w:val="single" w:sz="2" w:space="0" w:color="AAAAAA"/>
-            </w:tcBorders>
-          </w:tcPr>
-          <w:p>
-            <w:pPr>
-              <w:pStyle w:val="Normal"/>
-              <w:rPr/>
-            </w:pPr>
-            <w:r>
-              <w:rPr>
-                <w:rFonts w:eastAsia="Georgia" w:cs="Georgia"/>
-                <w:b/>
-                <w:bCs/>
-                <w:color w:val="5A6070"/>
-                <w:sz w:val="18"/>
-                <w:szCs w:val="18"/>
-              </w:rPr>
-              <w:t>What I would tell myself before starting this phase:</w:t>
-            </w:r>
-          </w:p>
-        </w:tc>
-      </w:tr>
-      <w:tr>
-        <w:trPr/>
-        <w:tc>
-          <w:tcPr>
-            <w:tcW w:w="9360" w:type="dxa"/>
-            <w:tcBorders>
-              <w:left w:val="single" w:sz="2" w:space="0" w:color="AAAAAA"/>
-              <w:bottom w:val="single" w:sz="2" w:space="0" w:color="AAAAAA"/>
-              <w:right w:val="single" w:sz="2" w:space="0" w:color="AAAAAA"/>
-            </w:tcBorders>
-          </w:tcPr>
-          <w:p>
-            <w:pPr>
-              <w:pStyle w:val="Normal"/>
-              <w:rPr/>
-            </w:pPr>
-            <w:r>
-              <w:rPr/>
-            </w:r>
-          </w:p>
-        </w:tc>
-      </w:tr>
-      <w:tr>
-        <w:trPr/>
-        <w:tc>
-          <w:tcPr>
-            <w:tcW w:w="9360" w:type="dxa"/>
-            <w:tcBorders>
-              <w:left w:val="single" w:sz="2" w:space="0" w:color="AAAAAA"/>
-              <w:bottom w:val="single" w:sz="2" w:space="0" w:color="AAAAAA"/>
-              <w:right w:val="single" w:sz="2" w:space="0" w:color="AAAAAA"/>
-            </w:tcBorders>
-          </w:tcPr>
-          <w:p>
-            <w:pPr>
-              <w:pStyle w:val="Normal"/>
-              <w:rPr/>
-            </w:pPr>
-            <w:r>
-              <w:rPr/>
-            </w:r>
-          </w:p>
-        </w:tc>
-      </w:tr>
-      <w:tr>
-        <w:trPr/>
-        <w:tc>
-          <w:tcPr>
-            <w:tcW w:w="9360" w:type="dxa"/>
-            <w:tcBorders>
-              <w:left w:val="single" w:sz="2" w:space="0" w:color="AAAAAA"/>
-              <w:bottom w:val="single" w:sz="2" w:space="0" w:color="AAAAAA"/>
-              <w:right w:val="single" w:sz="2" w:space="0" w:color="AAAAAA"/>
-            </w:tcBorders>
-          </w:tcPr>
-          <w:p>
-            <w:pPr>
-              <w:pStyle w:val="Normal"/>
-              <w:rPr/>
-            </w:pPr>
-            <w:r>
-              <w:rPr/>
-            </w:r>
-          </w:p>
-        </w:tc>
-      </w:tr>
-    </w:tbl>
-    <w:p>
-      <w:pPr>
-        <w:pStyle w:val="Normal"/>
-        <w:spacing w:before="120" w:after="0"/>
-        <w:rPr/>
-      </w:pPr>
-      <w:r>
-        <w:rPr/>
-      </w:r>
-    </w:p>
-    <w:p>
-      <w:pPr>
-        <w:pStyle w:val="Normal"/>
-        <w:rPr/>
-      </w:pPr>
-      <w:r>
-        <w:rPr/>
-      </w:r>
-      <w:r>
-        <w:br w:type="page"/>
-      </w:r>
-    </w:p>
-    <w:p>
-      <w:pPr>
-        <w:pStyle w:val="Normal"/>
-        <w:spacing w:before="0" w:after="0"/>
-        <w:jc w:val="center"/>
-        <w:rPr/>
-      </w:pPr>
-      <w:r>
-        <w:rPr>
-          <w:rFonts w:eastAsia="Georgia" w:cs="Georgia"/>
-          <w:b/>
-          <w:bCs/>
-          <w:caps/>
-          <w:color w:val="B8860B"/>
-          <w:sz w:val="40"/>
-          <w:szCs w:val="40"/>
-        </w:rPr>
-        <w:t>PHASE 2</w:t>
-      </w:r>
-    </w:p>
-    <w:p>
-      <w:pPr>
-        <w:pStyle w:val="Normal"/>
-        <w:spacing w:before="30" w:after="0"/>
-        <w:jc w:val="center"/>
-        <w:rPr/>
-      </w:pPr>
-      <w:r>
-        <w:rPr>
-          <w:rFonts w:eastAsia="Georgia" w:cs="Georgia"/>
-          <w:i/>
-          <w:iCs/>
-          <w:color w:val="C68B2A"/>
-          <w:sz w:val="28"/>
-          <w:szCs w:val="28"/>
-        </w:rPr>
-        <w:t>Status Visibility</w:t>
-      </w:r>
-    </w:p>
-    <w:p>
-      <w:pPr>
-        <w:pStyle w:val="Normal"/>
-        <w:spacing w:before="40" w:after="0"/>
-        <w:rPr/>
-      </w:pPr>
-      <w:r>
-        <w:rPr/>
-      </w:r>
-    </w:p>
-    <w:p>
-      <w:pPr>
-        <w:pStyle w:val="Normal"/>
-        <w:jc w:val="center"/>
-        <w:rPr/>
-      </w:pPr>
-      <w:r>
-        <w:rPr>
-          <w:rFonts w:eastAsia="Georgia" w:cs="Georgia"/>
-          <w:i/>
-          <w:iCs/>
-          <w:color w:val="5A6070"/>
-          <w:sz w:val="18"/>
-          <w:szCs w:val="18"/>
-        </w:rPr>
-        <w:t>Status layer. Bubble system. Boot sequence. Animations. Conjuration Chamber.</w:t>
-      </w:r>
-    </w:p>
-    <w:p>
-      <w:pPr>
-        <w:pStyle w:val="Normal"/>
-        <w:pBdr>
-          <w:bottom w:val="single" w:sz="4" w:space="4" w:color="C9A84C"/>
-        </w:pBdr>
-        <w:spacing w:before="160" w:after="160"/>
-        <w:rPr/>
-      </w:pPr>
-      <w:r>
-        <w:rPr/>
-      </w:r>
-    </w:p>
-    <w:p>
-      <w:pPr>
-        <w:pStyle w:val="Heading2"/>
-        <w:spacing w:before="320" w:after="100"/>
-        <w:rPr/>
-      </w:pPr>
-      <w:r>
-        <w:rPr>
-          <w:rFonts w:eastAsia="Georgia" w:cs="Georgia" w:ascii="Georgia" w:hAnsi="Georgia"/>
-          <w:b/>
-          <w:bCs/>
-          <w:color w:val="C68B2A"/>
-          <w:sz w:val="28"/>
-          <w:szCs w:val="28"/>
-        </w:rPr>
-        <w:t>Pre-Build State</w:t>
-      </w:r>
-    </w:p>
-    <w:tbl>
-      <w:tblPr>
-        <w:tblW w:w="9360" w:type="dxa"/>
-        <w:jc w:val="left"/>
-        <w:tblInd w:w="0" w:type="dxa"/>
-        <w:tblLayout w:type="fixed"/>
-        <w:tblCellMar>
-          <w:top w:w="40" w:type="dxa"/>
-          <w:left w:w="0" w:type="dxa"/>
-          <w:bottom w:w="40" w:type="dxa"/>
-          <w:right w:w="120" w:type="dxa"/>
-        </w:tblCellMar>
-      </w:tblPr>
-      <w:tblGrid>
-        <w:gridCol w:w="2999"/>
-        <w:gridCol w:w="6360"/>
-      </w:tblGrid>
-      <w:tr>
-        <w:trPr/>
-        <w:tc>
-          <w:tcPr>
-            <w:tcW w:w="2999" w:type="dxa"/>
-            <w:tcBorders>
-              <w:bottom w:val="single" w:sz="2" w:space="0" w:color="AAAAAA"/>
-            </w:tcBorders>
-          </w:tcPr>
-          <w:p>
-            <w:pPr>
-              <w:pStyle w:val="Normal"/>
-              <w:rPr/>
-            </w:pPr>
-            <w:r>
-              <w:rPr>
-                <w:rFonts w:eastAsia="Georgia" w:cs="Georgia"/>
-                <w:b/>
-                <w:bCs/>
-                <w:color w:val="5A6070"/>
-                <w:sz w:val="19"/>
-                <w:szCs w:val="19"/>
-              </w:rPr>
-              <w:t>Date started:</w:t>
-            </w:r>
-          </w:p>
-        </w:tc>
-        <w:tc>
-          <w:tcPr>
-            <w:tcW w:w="6360" w:type="dxa"/>
-            <w:tcBorders>
-              <w:bottom w:val="single" w:sz="2" w:space="0" w:color="AAAAAA"/>
-            </w:tcBorders>
-            <w:tcMar>
-              <w:left w:w="60" w:type="dxa"/>
-              <w:right w:w="0" w:type="dxa"/>
-            </w:tcMar>
-          </w:tcPr>
-          <w:p>
-            <w:pPr>
-              <w:pStyle w:val="Normal"/>
-              <w:rPr/>
-            </w:pPr>
-            <w:r>
-              <w:rPr/>
+              <w:t>03 March 2026</w:t>
             </w:r>
           </w:p>
         </w:tc>
@@ -20664,7 +21264,7 @@
     </w:r>
     <w:r>
       <w:rPr/>
-      <w:t>33</w:t>
+      <w:t>7</w:t>
     </w:r>
     <w:r>
       <w:rPr/>
@@ -20708,7 +21308,7 @@
     </w:r>
     <w:r>
       <w:rPr/>
-      <w:t>33</w:t>
+      <w:t>7</w:t>
     </w:r>
     <w:r>
       <w:rPr/>
@@ -21180,6 +21780,21 @@
     <w:rPr>
       <w:sz w:val="20"/>
       <w:szCs w:val="20"/>
+    </w:rPr>
+  </w:style>
+  <w:style w:type="character" w:styleId="Emphasis">
+    <w:name w:val="Emphasis"/>
+    <w:qFormat/>
+    <w:rPr>
+      <w:i/>
+      <w:iCs/>
+    </w:rPr>
+  </w:style>
+  <w:style w:type="character" w:styleId="SourceText">
+    <w:name w:val="Source Text"/>
+    <w:qFormat/>
+    <w:rPr>
+      <w:rFonts w:ascii="Liberation Mono" w:hAnsi="Liberation Mono" w:eastAsia="Noto Sans Mono CJK SC" w:cs="Liberation Mono"/>
     </w:rPr>
   </w:style>
   <w:style w:type="paragraph" w:styleId="Heading">
@@ -21322,6 +21937,29 @@
     <w:pPr/>
     <w:rPr/>
   </w:style>
+  <w:style w:type="paragraph" w:styleId="TableContents">
+    <w:name w:val="Table Contents"/>
+    <w:basedOn w:val="Normal"/>
+    <w:qFormat/>
+    <w:pPr>
+      <w:widowControl w:val="false"/>
+      <w:suppressLineNumbers/>
+    </w:pPr>
+    <w:rPr/>
+  </w:style>
+  <w:style w:type="paragraph" w:styleId="TableHeading">
+    <w:name w:val="Table Heading"/>
+    <w:basedOn w:val="TableContents"/>
+    <w:qFormat/>
+    <w:pPr>
+      <w:suppressLineNumbers/>
+      <w:jc w:val="center"/>
+    </w:pPr>
+    <w:rPr>
+      <w:b/>
+      <w:bCs/>
+    </w:rPr>
+  </w:style>
 </w:styles>
 </file>
 

</xml_diff>

<commit_message>
Phase 3 complete: Grimoire — persistent memory layer, injection, commands, management page
</commit_message>
<xml_diff>
--- a/Referentia/luminarious_build_journal.docx
+++ b/Referentia/luminarious_build_journal.docx
@@ -285,7 +285,7 @@
         <w:pStyle w:val="ListParagraph"/>
         <w:numPr>
           <w:ilvl w:val="0"/>
-          <w:numId w:val="3"/>
+          <w:numId w:val="24"/>
         </w:numPr>
         <w:spacing w:before="50" w:after="50"/>
         <w:rPr/>
@@ -4378,11 +4378,28 @@
           </w:tcPr>
           <w:p>
             <w:pPr>
-              <w:pStyle w:val="Normal"/>
-              <w:rPr/>
-            </w:pPr>
-            <w:r>
-              <w:rPr/>
+              <w:pStyle w:val="PreformattedText"/>
+              <w:spacing w:before="0" w:after="283"/>
+              <w:ind w:hanging="0" w:left="0" w:right="0"/>
+              <w:rPr/>
+            </w:pPr>
+            <w:r>
+              <w:rPr>
+                <w:rStyle w:val="SourceText"/>
+                <w:rFonts w:ascii="var font-mono" w:hAnsi="var font-mono"/>
+                <w:color w:val="70B8FF"/>
+                <w:shd w:fill="auto" w:val="clear"/>
+              </w:rPr>
+              <w:t>git</w:t>
+            </w:r>
+            <w:r>
+              <w:rPr>
+                <w:rStyle w:val="SourceText"/>
+                <w:rFonts w:ascii="var font-mono" w:hAnsi="var font-mono"/>
+                <w:color w:val="EAECF0"/>
+                <w:shd w:fill="auto" w:val="clear"/>
+              </w:rPr>
+              <w:t xml:space="preserve"> checkout -b phase-2-status-visibility</w:t>
             </w:r>
           </w:p>
         </w:tc>
@@ -4460,6 +4477,7 @@
             </w:pPr>
             <w:r>
               <w:rPr/>
+              <w:t>NA</w:t>
             </w:r>
           </w:p>
         </w:tc>
@@ -4550,6 +4568,7 @@
             </w:pPr>
             <w:r>
               <w:rPr/>
+              <w:t>Adds 5 new systems.</w:t>
             </w:r>
           </w:p>
         </w:tc>
@@ -4572,6 +4591,7 @@
             </w:pPr>
             <w:r>
               <w:rPr/>
+              <w:t>Overhauls some interface and title aspects</w:t>
             </w:r>
           </w:p>
         </w:tc>
@@ -4730,6 +4750,52 @@
           </w:tcPr>
           <w:p>
             <w:pPr>
+              <w:pStyle w:val="BodyText"/>
+              <w:numPr>
+                <w:ilvl w:val="0"/>
+                <w:numId w:val="2"/>
+              </w:numPr>
+              <w:tabs>
+                <w:tab w:val="clear" w:pos="720"/>
+                <w:tab w:val="left" w:pos="0" w:leader="none"/>
+              </w:tabs>
+              <w:spacing w:before="0" w:after="0"/>
+              <w:ind w:hanging="283" w:left="720"/>
+              <w:rPr/>
+            </w:pPr>
+            <w:r>
+              <w:rPr>
+                <w:rStyle w:val="SourceText"/>
+              </w:rPr>
+              <w:t>StatusState</w:t>
+            </w:r>
+            <w:r>
+              <w:rPr/>
+              <w:t xml:space="preserve"> moved to </w:t>
+            </w:r>
+            <w:r>
+              <w:rPr>
+                <w:rStyle w:val="SourceText"/>
+              </w:rPr>
+              <w:t>ui/state.py</w:t>
+            </w:r>
+            <w:r>
+              <w:rPr/>
+              <w:t xml:space="preserve"> to avoid circular import with </w:t>
+            </w:r>
+            <w:r>
+              <w:rPr>
+                <w:rStyle w:val="SourceText"/>
+              </w:rPr>
+              <w:t>status_layer.py</w:t>
+            </w:r>
+            <w:r>
+              <w:rPr/>
+              <w:t xml:space="preserve"> </w:t>
+            </w:r>
+          </w:p>
+          <w:p>
+            <w:pPr>
               <w:pStyle w:val="Normal"/>
               <w:rPr/>
             </w:pPr>
@@ -4752,6 +4818,52 @@
           </w:tcPr>
           <w:p>
             <w:pPr>
+              <w:pStyle w:val="BodyText"/>
+              <w:numPr>
+                <w:ilvl w:val="0"/>
+                <w:numId w:val="3"/>
+              </w:numPr>
+              <w:tabs>
+                <w:tab w:val="clear" w:pos="720"/>
+                <w:tab w:val="left" w:pos="0" w:leader="none"/>
+              </w:tabs>
+              <w:spacing w:before="0" w:after="0"/>
+              <w:ind w:hanging="283" w:left="720"/>
+              <w:rPr/>
+            </w:pPr>
+            <w:r>
+              <w:rPr>
+                <w:rStyle w:val="SourceText"/>
+              </w:rPr>
+              <w:t>BubbleMessage</w:t>
+            </w:r>
+            <w:r>
+              <w:rPr/>
+              <w:t xml:space="preserve"> added to </w:t>
+            </w:r>
+            <w:r>
+              <w:rPr>
+                <w:rStyle w:val="SourceText"/>
+              </w:rPr>
+              <w:t>ui/state.py</w:t>
+            </w:r>
+            <w:r>
+              <w:rPr/>
+              <w:t xml:space="preserve"> alongside </w:t>
+            </w:r>
+            <w:r>
+              <w:rPr>
+                <w:rStyle w:val="SourceText"/>
+              </w:rPr>
+              <w:t>StatusState</w:t>
+            </w:r>
+            <w:r>
+              <w:rPr/>
+              <w:t xml:space="preserve"> — pure data, no UI dependencies </w:t>
+            </w:r>
+          </w:p>
+          <w:p>
+            <w:pPr>
               <w:pStyle w:val="Normal"/>
               <w:rPr/>
             </w:pPr>
@@ -4774,6 +4886,56 @@
           </w:tcPr>
           <w:p>
             <w:pPr>
+              <w:pStyle w:val="BodyText"/>
+              <w:numPr>
+                <w:ilvl w:val="0"/>
+                <w:numId w:val="4"/>
+              </w:numPr>
+              <w:tabs>
+                <w:tab w:val="clear" w:pos="720"/>
+                <w:tab w:val="left" w:pos="0" w:leader="none"/>
+              </w:tabs>
+              <w:spacing w:before="0" w:after="0"/>
+              <w:ind w:hanging="283" w:left="720"/>
+              <w:rPr/>
+            </w:pPr>
+            <w:r>
+              <w:rPr/>
+              <w:t>Animation workers stubbed as no-ops (</w:t>
+            </w:r>
+            <w:r>
+              <w:rPr>
+                <w:rStyle w:val="SourceText"/>
+              </w:rPr>
+              <w:t>update_glyph_field</w:t>
+            </w:r>
+            <w:r>
+              <w:rPr/>
+              <w:t xml:space="preserve">, </w:t>
+            </w:r>
+            <w:r>
+              <w:rPr>
+                <w:rStyle w:val="SourceText"/>
+              </w:rPr>
+              <w:t>set_css_variable</w:t>
+            </w:r>
+            <w:r>
+              <w:rPr/>
+              <w:t xml:space="preserve">, </w:t>
+            </w:r>
+            <w:r>
+              <w:rPr>
+                <w:rStyle w:val="SourceText"/>
+              </w:rPr>
+              <w:t>set_sigil_opacity</w:t>
+            </w:r>
+            <w:r>
+              <w:rPr/>
+              <w:t xml:space="preserve">) — visual wiring deferred </w:t>
+            </w:r>
+          </w:p>
+          <w:p>
+            <w:pPr>
               <w:pStyle w:val="Normal"/>
               <w:rPr/>
             </w:pPr>
@@ -4796,6 +4958,32 @@
           </w:tcPr>
           <w:p>
             <w:pPr>
+              <w:pStyle w:val="BodyText"/>
+              <w:numPr>
+                <w:ilvl w:val="0"/>
+                <w:numId w:val="5"/>
+              </w:numPr>
+              <w:tabs>
+                <w:tab w:val="clear" w:pos="720"/>
+                <w:tab w:val="left" w:pos="0" w:leader="none"/>
+              </w:tabs>
+              <w:spacing w:before="0" w:after="0"/>
+              <w:ind w:hanging="283" w:left="720"/>
+              <w:rPr/>
+            </w:pPr>
+            <w:r>
+              <w:rPr>
+                <w:rStyle w:val="SourceText"/>
+              </w:rPr>
+              <w:t>glyph_pool</w:t>
+            </w:r>
+            <w:r>
+              <w:rPr/>
+              <w:t xml:space="preserve"> using placeholder symbols — Wizard-authored glyphs to replace later, no structural change needed </w:t>
+            </w:r>
+          </w:p>
+          <w:p>
+            <w:pPr>
               <w:pStyle w:val="Normal"/>
               <w:rPr/>
             </w:pPr>
@@ -4818,6 +5006,42 @@
           </w:tcPr>
           <w:p>
             <w:pPr>
+              <w:pStyle w:val="BodyText"/>
+              <w:numPr>
+                <w:ilvl w:val="0"/>
+                <w:numId w:val="6"/>
+              </w:numPr>
+              <w:tabs>
+                <w:tab w:val="clear" w:pos="720"/>
+                <w:tab w:val="left" w:pos="0" w:leader="none"/>
+              </w:tabs>
+              <w:spacing w:before="0" w:after="0"/>
+              <w:ind w:hanging="283" w:left="720"/>
+              <w:rPr/>
+            </w:pPr>
+            <w:r>
+              <w:rPr>
+                <w:rStyle w:val="SourceText"/>
+              </w:rPr>
+              <w:t>ConversationsPage</w:t>
+            </w:r>
+            <w:r>
+              <w:rPr/>
+              <w:t xml:space="preserve"> uses </w:t>
+            </w:r>
+            <w:r>
+              <w:rPr>
+                <w:rStyle w:val="SourceText"/>
+              </w:rPr>
+              <w:t>dismiss(cid)</w:t>
+            </w:r>
+            <w:r>
+              <w:rPr/>
+              <w:t xml:space="preserve"> pattern to pass selection back to caller via callback </w:t>
+            </w:r>
+          </w:p>
+          <w:p>
+            <w:pPr>
               <w:pStyle w:val="Normal"/>
               <w:rPr/>
             </w:pPr>
@@ -4838,6 +5062,151 @@
               <w:right w:val="single" w:sz="2" w:space="0" w:color="AAAAAA"/>
             </w:tcBorders>
           </w:tcPr>
+          <w:p>
+            <w:pPr>
+              <w:pStyle w:val="BodyText"/>
+              <w:numPr>
+                <w:ilvl w:val="0"/>
+                <w:numId w:val="7"/>
+              </w:numPr>
+              <w:tabs>
+                <w:tab w:val="clear" w:pos="720"/>
+                <w:tab w:val="left" w:pos="0" w:leader="none"/>
+              </w:tabs>
+              <w:spacing w:before="0" w:after="0"/>
+              <w:ind w:hanging="283" w:left="720"/>
+              <w:rPr/>
+            </w:pPr>
+            <w:r>
+              <w:rPr>
+                <w:rStyle w:val="SourceText"/>
+              </w:rPr>
+              <w:t>ConversationSelected</w:t>
+            </w:r>
+            <w:r>
+              <w:rPr/>
+              <w:t xml:space="preserve"> exception class removed — unused </w:t>
+            </w:r>
+          </w:p>
+          <w:p>
+            <w:pPr>
+              <w:pStyle w:val="Normal"/>
+              <w:rPr/>
+            </w:pPr>
+            <w:r>
+              <w:rPr/>
+            </w:r>
+          </w:p>
+        </w:tc>
+      </w:tr>
+      <w:tr>
+        <w:trPr/>
+        <w:tc>
+          <w:tcPr>
+            <w:tcW w:w="9360" w:type="dxa"/>
+            <w:tcBorders>
+              <w:left w:val="single" w:sz="2" w:space="0" w:color="AAAAAA"/>
+              <w:bottom w:val="single" w:sz="2" w:space="0" w:color="AAAAAA"/>
+              <w:right w:val="single" w:sz="2" w:space="0" w:color="AAAAAA"/>
+            </w:tcBorders>
+          </w:tcPr>
+          <w:p>
+            <w:pPr>
+              <w:pStyle w:val="BodyText"/>
+              <w:numPr>
+                <w:ilvl w:val="0"/>
+                <w:numId w:val="8"/>
+              </w:numPr>
+              <w:tabs>
+                <w:tab w:val="clear" w:pos="720"/>
+                <w:tab w:val="left" w:pos="0" w:leader="none"/>
+              </w:tabs>
+              <w:spacing w:before="0" w:after="0"/>
+              <w:ind w:hanging="283" w:left="720"/>
+              <w:rPr/>
+            </w:pPr>
+            <w:r>
+              <w:rPr>
+                <w:rStyle w:val="SourceText"/>
+              </w:rPr>
+              <w:t>AnimationConfig.master_enabled</w:t>
+            </w:r>
+            <w:r>
+              <w:rPr/>
+              <w:t xml:space="preserve"> defaults to </w:t>
+            </w:r>
+            <w:r>
+              <w:rPr>
+                <w:rStyle w:val="SourceText"/>
+              </w:rPr>
+              <w:t>False</w:t>
+            </w:r>
+            <w:r>
+              <w:rPr/>
+              <w:t xml:space="preserve"> — animations dormant until individually confirmed </w:t>
+            </w:r>
+          </w:p>
+          <w:p>
+            <w:pPr>
+              <w:pStyle w:val="Normal"/>
+              <w:rPr/>
+            </w:pPr>
+            <w:r>
+              <w:rPr/>
+            </w:r>
+          </w:p>
+        </w:tc>
+      </w:tr>
+      <w:tr>
+        <w:trPr/>
+        <w:tc>
+          <w:tcPr>
+            <w:tcW w:w="9360" w:type="dxa"/>
+            <w:tcBorders>
+              <w:left w:val="single" w:sz="2" w:space="0" w:color="AAAAAA"/>
+              <w:bottom w:val="single" w:sz="2" w:space="0" w:color="AAAAAA"/>
+              <w:right w:val="single" w:sz="2" w:space="0" w:color="AAAAAA"/>
+            </w:tcBorders>
+          </w:tcPr>
+          <w:p>
+            <w:pPr>
+              <w:pStyle w:val="BodyText"/>
+              <w:numPr>
+                <w:ilvl w:val="0"/>
+                <w:numId w:val="9"/>
+              </w:numPr>
+              <w:tabs>
+                <w:tab w:val="clear" w:pos="720"/>
+                <w:tab w:val="left" w:pos="0" w:leader="none"/>
+              </w:tabs>
+              <w:ind w:hanging="283" w:left="709"/>
+              <w:rPr/>
+            </w:pPr>
+            <w:r>
+              <w:rPr/>
+              <w:t xml:space="preserve">App location remains </w:t>
+            </w:r>
+            <w:r>
+              <w:rPr>
+                <w:rStyle w:val="SourceText"/>
+              </w:rPr>
+              <w:t>ui/app.py</w:t>
+            </w:r>
+            <w:r>
+              <w:rPr/>
+              <w:t xml:space="preserve"> not </w:t>
+            </w:r>
+            <w:r>
+              <w:rPr>
+                <w:rStyle w:val="SourceText"/>
+              </w:rPr>
+              <w:t>client/app.py</w:t>
+            </w:r>
+            <w:r>
+              <w:rPr/>
+              <w:t xml:space="preserve"> — moving would break imports </w:t>
+            </w:r>
+          </w:p>
           <w:p>
             <w:pPr>
               <w:pStyle w:val="Normal"/>
@@ -5090,6 +5459,7 @@
             </w:pPr>
             <w:r>
               <w:rPr/>
+              <w:t>App location</w:t>
             </w:r>
           </w:p>
         </w:tc>
@@ -5111,6 +5481,7 @@
             </w:pPr>
             <w:r>
               <w:rPr/>
+              <w:t>client/app.py</w:t>
             </w:r>
           </w:p>
         </w:tc>
@@ -5132,6 +5503,7 @@
             </w:pPr>
             <w:r>
               <w:rPr/>
+              <w:t>ui/app.py</w:t>
             </w:r>
           </w:p>
         </w:tc>
@@ -5153,6 +5525,7 @@
             </w:pPr>
             <w:r>
               <w:rPr/>
+              <w:t>Already resided here. Moving breaks imports. Permanent.</w:t>
             </w:r>
           </w:p>
         </w:tc>
@@ -5177,6 +5550,7 @@
             </w:pPr>
             <w:r>
               <w:rPr/>
+              <w:t>CSS selectors</w:t>
             </w:r>
           </w:p>
         </w:tc>
@@ -5197,7 +5571,30 @@
               <w:rPr/>
             </w:pPr>
             <w:r>
-              <w:rPr/>
+              <w:rPr>
+                <w:rStyle w:val="SourceText"/>
+              </w:rPr>
+              <w:t>ArcaCognitorium</w:t>
+            </w:r>
+            <w:r>
+              <w:rPr/>
+              <w:t xml:space="preserve">, </w:t>
+            </w:r>
+            <w:r>
+              <w:rPr>
+                <w:rStyle w:val="SourceText"/>
+              </w:rPr>
+              <w:t>#chat-pane</w:t>
+            </w:r>
+            <w:r>
+              <w:rPr/>
+              <w:t xml:space="preserve">, </w:t>
+            </w:r>
+            <w:r>
+              <w:rPr>
+                <w:rStyle w:val="SourceText"/>
+              </w:rPr>
+              <w:t>#invocation-field</w:t>
             </w:r>
           </w:p>
         </w:tc>
@@ -5218,7 +5615,30 @@
               <w:rPr/>
             </w:pPr>
             <w:r>
-              <w:rPr/>
+              <w:rPr>
+                <w:rStyle w:val="SourceText"/>
+              </w:rPr>
+              <w:t>ChatTUIApp</w:t>
+            </w:r>
+            <w:r>
+              <w:rPr/>
+              <w:t xml:space="preserve">, </w:t>
+            </w:r>
+            <w:r>
+              <w:rPr>
+                <w:rStyle w:val="SourceText"/>
+              </w:rPr>
+              <w:t>#middle</w:t>
+            </w:r>
+            <w:r>
+              <w:rPr/>
+              <w:t xml:space="preserve">, </w:t>
+            </w:r>
+            <w:r>
+              <w:rPr>
+                <w:rStyle w:val="SourceText"/>
+              </w:rPr>
+              <w:t>#chat_input</w:t>
             </w:r>
           </w:p>
         </w:tc>
@@ -5240,6 +5660,7 @@
             </w:pPr>
             <w:r>
               <w:rPr/>
+              <w:t>ID names differ from spec. Corrected to match actual codebase. Permanent.</w:t>
             </w:r>
           </w:p>
         </w:tc>
@@ -5264,6 +5685,7 @@
             </w:pPr>
             <w:r>
               <w:rPr/>
+              <w:t>ConversationsPage import</w:t>
             </w:r>
           </w:p>
         </w:tc>
@@ -5285,6 +5707,7 @@
             </w:pPr>
             <w:r>
               <w:rPr/>
+              <w:t>storage.conversation_store</w:t>
             </w:r>
           </w:p>
         </w:tc>
@@ -5306,6 +5729,7 @@
             </w:pPr>
             <w:r>
               <w:rPr/>
+              <w:t>memory.conversation_store</w:t>
             </w:r>
           </w:p>
         </w:tc>
@@ -5327,6 +5751,7 @@
             </w:pPr>
             <w:r>
               <w:rPr/>
+              <w:t>Correct path for this codebase. Permanent.</w:t>
             </w:r>
           </w:p>
         </w:tc>
@@ -5351,6 +5776,7 @@
             </w:pPr>
             <w:r>
               <w:rPr/>
+              <w:t>ConversationsPage</w:t>
             </w:r>
           </w:p>
         </w:tc>
@@ -5371,7 +5797,14 @@
               <w:rPr/>
             </w:pPr>
             <w:r>
-              <w:rPr/>
+              <w:rPr>
+                <w:rStyle w:val="SourceText"/>
+              </w:rPr>
+              <w:t>ConversationSelected</w:t>
+            </w:r>
+            <w:r>
+              <w:rPr/>
+              <w:t xml:space="preserve"> exception</w:t>
             </w:r>
           </w:p>
         </w:tc>
@@ -5393,6 +5826,7 @@
             </w:pPr>
             <w:r>
               <w:rPr/>
+              <w:t>Removed</w:t>
             </w:r>
           </w:p>
         </w:tc>
@@ -5401,6 +5835,266 @@
             <w:tcW w:w="2559" w:type="dxa"/>
             <w:tcBorders>
               <w:top w:val="single" w:sz="2" w:space="0" w:color="AAAAAA"/>
+              <w:left w:val="single" w:sz="2" w:space="0" w:color="AAAAAA"/>
+              <w:bottom w:val="single" w:sz="2" w:space="0" w:color="AAAAAA"/>
+              <w:right w:val="single" w:sz="2" w:space="0" w:color="AAAAAA"/>
+            </w:tcBorders>
+            <w:shd w:fill="EEEBE0" w:val="clear"/>
+          </w:tcPr>
+          <w:p>
+            <w:pPr>
+              <w:pStyle w:val="Normal"/>
+              <w:rPr/>
+            </w:pPr>
+            <w:r>
+              <w:rPr/>
+              <w:t>Unused dead code. Permanent.</w:t>
+            </w:r>
+          </w:p>
+        </w:tc>
+      </w:tr>
+      <w:tr>
+        <w:trPr/>
+        <w:tc>
+          <w:tcPr>
+            <w:tcW w:w="1599" w:type="dxa"/>
+            <w:tcBorders>
+              <w:left w:val="single" w:sz="2" w:space="0" w:color="AAAAAA"/>
+              <w:bottom w:val="single" w:sz="2" w:space="0" w:color="AAAAAA"/>
+              <w:right w:val="single" w:sz="2" w:space="0" w:color="AAAAAA"/>
+            </w:tcBorders>
+            <w:shd w:fill="EEEBE0" w:val="clear"/>
+          </w:tcPr>
+          <w:p>
+            <w:pPr>
+              <w:pStyle w:val="Normal"/>
+              <w:rPr/>
+            </w:pPr>
+            <w:r>
+              <w:rPr/>
+              <w:t>Animation visual wiring</w:t>
+            </w:r>
+          </w:p>
+        </w:tc>
+        <w:tc>
+          <w:tcPr>
+            <w:tcW w:w="2401" w:type="dxa"/>
+            <w:tcBorders>
+              <w:left w:val="single" w:sz="2" w:space="0" w:color="AAAAAA"/>
+              <w:bottom w:val="single" w:sz="2" w:space="0" w:color="AAAAAA"/>
+              <w:right w:val="single" w:sz="2" w:space="0" w:color="AAAAAA"/>
+            </w:tcBorders>
+            <w:shd w:fill="EEEBE0" w:val="clear"/>
+          </w:tcPr>
+          <w:p>
+            <w:pPr>
+              <w:pStyle w:val="Normal"/>
+              <w:rPr/>
+            </w:pPr>
+            <w:r>
+              <w:rPr>
+                <w:rStyle w:val="SourceText"/>
+              </w:rPr>
+              <w:t>update_glyph_field</w:t>
+            </w:r>
+            <w:r>
+              <w:rPr/>
+              <w:t xml:space="preserve"> etc. on app</w:t>
+            </w:r>
+          </w:p>
+        </w:tc>
+        <w:tc>
+          <w:tcPr>
+            <w:tcW w:w="2800" w:type="dxa"/>
+            <w:tcBorders>
+              <w:left w:val="single" w:sz="2" w:space="0" w:color="AAAAAA"/>
+              <w:bottom w:val="single" w:sz="2" w:space="0" w:color="AAAAAA"/>
+              <w:right w:val="single" w:sz="2" w:space="0" w:color="AAAAAA"/>
+            </w:tcBorders>
+            <w:shd w:fill="EEEBE0" w:val="clear"/>
+          </w:tcPr>
+          <w:p>
+            <w:pPr>
+              <w:pStyle w:val="Normal"/>
+              <w:rPr/>
+            </w:pPr>
+            <w:r>
+              <w:rPr/>
+              <w:t>Stubbed as no-ops</w:t>
+            </w:r>
+          </w:p>
+        </w:tc>
+        <w:tc>
+          <w:tcPr>
+            <w:tcW w:w="2559" w:type="dxa"/>
+            <w:tcBorders>
+              <w:left w:val="single" w:sz="2" w:space="0" w:color="AAAAAA"/>
+              <w:bottom w:val="single" w:sz="2" w:space="0" w:color="AAAAAA"/>
+              <w:right w:val="single" w:sz="2" w:space="0" w:color="AAAAAA"/>
+            </w:tcBorders>
+            <w:shd w:fill="EEEBE0" w:val="clear"/>
+          </w:tcPr>
+          <w:p>
+            <w:pPr>
+              <w:pStyle w:val="Normal"/>
+              <w:rPr/>
+            </w:pPr>
+            <w:r>
+              <w:rPr/>
+              <w:t>Visual layer not yet built. Temporary — revisit post Phase 2.</w:t>
+            </w:r>
+          </w:p>
+        </w:tc>
+      </w:tr>
+      <w:tr>
+        <w:trPr/>
+        <w:tc>
+          <w:tcPr>
+            <w:tcW w:w="1599" w:type="dxa"/>
+            <w:tcBorders>
+              <w:left w:val="single" w:sz="2" w:space="0" w:color="AAAAAA"/>
+              <w:bottom w:val="single" w:sz="2" w:space="0" w:color="AAAAAA"/>
+              <w:right w:val="single" w:sz="2" w:space="0" w:color="AAAAAA"/>
+            </w:tcBorders>
+            <w:shd w:fill="EEEBE0" w:val="clear"/>
+          </w:tcPr>
+          <w:p>
+            <w:pPr>
+              <w:pStyle w:val="Normal"/>
+              <w:rPr/>
+            </w:pPr>
+            <w:r>
+              <w:rPr/>
+            </w:r>
+          </w:p>
+        </w:tc>
+        <w:tc>
+          <w:tcPr>
+            <w:tcW w:w="2401" w:type="dxa"/>
+            <w:tcBorders>
+              <w:left w:val="single" w:sz="2" w:space="0" w:color="AAAAAA"/>
+              <w:bottom w:val="single" w:sz="2" w:space="0" w:color="AAAAAA"/>
+              <w:right w:val="single" w:sz="2" w:space="0" w:color="AAAAAA"/>
+            </w:tcBorders>
+            <w:shd w:fill="EEEBE0" w:val="clear"/>
+          </w:tcPr>
+          <w:p>
+            <w:pPr>
+              <w:pStyle w:val="Normal"/>
+              <w:rPr/>
+            </w:pPr>
+            <w:r>
+              <w:rPr/>
+            </w:r>
+          </w:p>
+        </w:tc>
+        <w:tc>
+          <w:tcPr>
+            <w:tcW w:w="2800" w:type="dxa"/>
+            <w:tcBorders>
+              <w:left w:val="single" w:sz="2" w:space="0" w:color="AAAAAA"/>
+              <w:bottom w:val="single" w:sz="2" w:space="0" w:color="AAAAAA"/>
+              <w:right w:val="single" w:sz="2" w:space="0" w:color="AAAAAA"/>
+            </w:tcBorders>
+            <w:shd w:fill="EEEBE0" w:val="clear"/>
+          </w:tcPr>
+          <w:p>
+            <w:pPr>
+              <w:pStyle w:val="Normal"/>
+              <w:rPr/>
+            </w:pPr>
+            <w:r>
+              <w:rPr/>
+            </w:r>
+          </w:p>
+        </w:tc>
+        <w:tc>
+          <w:tcPr>
+            <w:tcW w:w="2559" w:type="dxa"/>
+            <w:tcBorders>
+              <w:left w:val="single" w:sz="2" w:space="0" w:color="AAAAAA"/>
+              <w:bottom w:val="single" w:sz="2" w:space="0" w:color="AAAAAA"/>
+              <w:right w:val="single" w:sz="2" w:space="0" w:color="AAAAAA"/>
+            </w:tcBorders>
+            <w:shd w:fill="EEEBE0" w:val="clear"/>
+          </w:tcPr>
+          <w:p>
+            <w:pPr>
+              <w:pStyle w:val="Normal"/>
+              <w:rPr/>
+            </w:pPr>
+            <w:r>
+              <w:rPr/>
+            </w:r>
+          </w:p>
+        </w:tc>
+      </w:tr>
+      <w:tr>
+        <w:trPr/>
+        <w:tc>
+          <w:tcPr>
+            <w:tcW w:w="1599" w:type="dxa"/>
+            <w:tcBorders>
+              <w:left w:val="single" w:sz="2" w:space="0" w:color="AAAAAA"/>
+              <w:bottom w:val="single" w:sz="2" w:space="0" w:color="AAAAAA"/>
+              <w:right w:val="single" w:sz="2" w:space="0" w:color="AAAAAA"/>
+            </w:tcBorders>
+            <w:shd w:fill="EEEBE0" w:val="clear"/>
+          </w:tcPr>
+          <w:p>
+            <w:pPr>
+              <w:pStyle w:val="Normal"/>
+              <w:rPr/>
+            </w:pPr>
+            <w:r>
+              <w:rPr/>
+            </w:r>
+          </w:p>
+        </w:tc>
+        <w:tc>
+          <w:tcPr>
+            <w:tcW w:w="2401" w:type="dxa"/>
+            <w:tcBorders>
+              <w:left w:val="single" w:sz="2" w:space="0" w:color="AAAAAA"/>
+              <w:bottom w:val="single" w:sz="2" w:space="0" w:color="AAAAAA"/>
+              <w:right w:val="single" w:sz="2" w:space="0" w:color="AAAAAA"/>
+            </w:tcBorders>
+            <w:shd w:fill="EEEBE0" w:val="clear"/>
+          </w:tcPr>
+          <w:p>
+            <w:pPr>
+              <w:pStyle w:val="Normal"/>
+              <w:rPr/>
+            </w:pPr>
+            <w:r>
+              <w:rPr/>
+            </w:r>
+          </w:p>
+        </w:tc>
+        <w:tc>
+          <w:tcPr>
+            <w:tcW w:w="2800" w:type="dxa"/>
+            <w:tcBorders>
+              <w:left w:val="single" w:sz="2" w:space="0" w:color="AAAAAA"/>
+              <w:bottom w:val="single" w:sz="2" w:space="0" w:color="AAAAAA"/>
+              <w:right w:val="single" w:sz="2" w:space="0" w:color="AAAAAA"/>
+            </w:tcBorders>
+            <w:shd w:fill="EEEBE0" w:val="clear"/>
+          </w:tcPr>
+          <w:p>
+            <w:pPr>
+              <w:pStyle w:val="Normal"/>
+              <w:rPr/>
+            </w:pPr>
+            <w:r>
+              <w:rPr/>
+            </w:r>
+          </w:p>
+        </w:tc>
+        <w:tc>
+          <w:tcPr>
+            <w:tcW w:w="2559" w:type="dxa"/>
+            <w:tcBorders>
               <w:left w:val="single" w:sz="2" w:space="0" w:color="AAAAAA"/>
               <w:bottom w:val="single" w:sz="2" w:space="0" w:color="AAAAAA"/>
               <w:right w:val="single" w:sz="2" w:space="0" w:color="AAAAAA"/>
@@ -5537,6 +6231,42 @@
           </w:tcPr>
           <w:p>
             <w:pPr>
+              <w:pStyle w:val="BodyText"/>
+              <w:numPr>
+                <w:ilvl w:val="0"/>
+                <w:numId w:val="10"/>
+              </w:numPr>
+              <w:tabs>
+                <w:tab w:val="clear" w:pos="720"/>
+                <w:tab w:val="left" w:pos="0" w:leader="none"/>
+              </w:tabs>
+              <w:spacing w:before="0" w:after="0"/>
+              <w:ind w:hanging="283" w:left="720"/>
+              <w:rPr/>
+            </w:pPr>
+            <w:r>
+              <w:rPr>
+                <w:rStyle w:val="SourceText"/>
+              </w:rPr>
+              <w:t>StatusState</w:t>
+            </w:r>
+            <w:r>
+              <w:rPr/>
+              <w:t xml:space="preserve"> circular import not anticipated — required extracting to </w:t>
+            </w:r>
+            <w:r>
+              <w:rPr>
+                <w:rStyle w:val="SourceText"/>
+              </w:rPr>
+              <w:t>ui/state.py</w:t>
+            </w:r>
+            <w:r>
+              <w:rPr/>
+              <w:t xml:space="preserve"> before anything could boot </w:t>
+            </w:r>
+          </w:p>
+          <w:p>
+            <w:pPr>
               <w:pStyle w:val="Normal"/>
               <w:rPr/>
             </w:pPr>
@@ -5559,6 +6289,72 @@
           </w:tcPr>
           <w:p>
             <w:pPr>
+              <w:pStyle w:val="BodyText"/>
+              <w:numPr>
+                <w:ilvl w:val="0"/>
+                <w:numId w:val="11"/>
+              </w:numPr>
+              <w:tabs>
+                <w:tab w:val="clear" w:pos="720"/>
+                <w:tab w:val="left" w:pos="0" w:leader="none"/>
+              </w:tabs>
+              <w:spacing w:before="0" w:after="0"/>
+              <w:ind w:hanging="283" w:left="720"/>
+              <w:rPr/>
+            </w:pPr>
+            <w:r>
+              <w:rPr>
+                <w:rStyle w:val="SourceText"/>
+              </w:rPr>
+              <w:t>config.yaml</w:t>
+            </w:r>
+            <w:r>
+              <w:rPr/>
+              <w:t xml:space="preserve"> </w:t>
+            </w:r>
+            <w:r>
+              <w:rPr>
+                <w:rStyle w:val="SourceText"/>
+              </w:rPr>
+              <w:t>analytics</w:t>
+            </w:r>
+            <w:r>
+              <w:rPr/>
+              <w:t xml:space="preserve"> → </w:t>
+            </w:r>
+            <w:r>
+              <w:rPr>
+                <w:rStyle w:val="SourceText"/>
+              </w:rPr>
+              <w:t>reflection</w:t>
+            </w:r>
+            <w:r>
+              <w:rPr/>
+              <w:t xml:space="preserve"> rename touched more files than expected (</w:t>
+            </w:r>
+            <w:r>
+              <w:rPr>
+                <w:rStyle w:val="SourceText"/>
+              </w:rPr>
+              <w:t>config.py</w:t>
+            </w:r>
+            <w:r>
+              <w:rPr/>
+              <w:t xml:space="preserve">, </w:t>
+            </w:r>
+            <w:r>
+              <w:rPr>
+                <w:rStyle w:val="SourceText"/>
+              </w:rPr>
+              <w:t>reflection.py</w:t>
+            </w:r>
+            <w:r>
+              <w:rPr/>
+              <w:t xml:space="preserve">, config keys) </w:t>
+            </w:r>
+          </w:p>
+          <w:p>
+            <w:pPr>
               <w:pStyle w:val="Normal"/>
               <w:rPr/>
             </w:pPr>
@@ -5581,6 +6377,32 @@
           </w:tcPr>
           <w:p>
             <w:pPr>
+              <w:pStyle w:val="BodyText"/>
+              <w:numPr>
+                <w:ilvl w:val="0"/>
+                <w:numId w:val="12"/>
+              </w:numPr>
+              <w:tabs>
+                <w:tab w:val="clear" w:pos="720"/>
+                <w:tab w:val="left" w:pos="0" w:leader="none"/>
+              </w:tabs>
+              <w:spacing w:before="0" w:after="0"/>
+              <w:ind w:hanging="283" w:left="720"/>
+              <w:rPr/>
+            </w:pPr>
+            <w:r>
+              <w:rPr>
+                <w:rStyle w:val="SourceText"/>
+              </w:rPr>
+              <w:t>pyfiglet</w:t>
+            </w:r>
+            <w:r>
+              <w:rPr/>
+              <w:t xml:space="preserve"> installed in wrong Python — pyenv shim vs venv caused confusing test failure; resolved by installing to pyenv directly </w:t>
+            </w:r>
+          </w:p>
+          <w:p>
+            <w:pPr>
               <w:pStyle w:val="Normal"/>
               <w:rPr/>
             </w:pPr>
@@ -5601,6 +6423,97 @@
               <w:right w:val="single" w:sz="2" w:space="0" w:color="AAAAAA"/>
             </w:tcBorders>
           </w:tcPr>
+          <w:p>
+            <w:pPr>
+              <w:pStyle w:val="BodyText"/>
+              <w:numPr>
+                <w:ilvl w:val="0"/>
+                <w:numId w:val="13"/>
+              </w:numPr>
+              <w:tabs>
+                <w:tab w:val="clear" w:pos="720"/>
+                <w:tab w:val="left" w:pos="0" w:leader="none"/>
+              </w:tabs>
+              <w:spacing w:before="0" w:after="0"/>
+              <w:ind w:hanging="283" w:left="720"/>
+              <w:rPr/>
+            </w:pPr>
+            <w:r>
+              <w:rPr/>
+              <w:t xml:space="preserve">Boot sequence accidentally had </w:t>
+            </w:r>
+            <w:r>
+              <w:rPr>
+                <w:rStyle w:val="SourceText"/>
+              </w:rPr>
+              <w:t>push_screen</w:t>
+            </w:r>
+            <w:r>
+              <w:rPr/>
+              <w:t xml:space="preserve"> placed inside </w:t>
+            </w:r>
+            <w:r>
+              <w:rPr>
+                <w:rStyle w:val="SourceText"/>
+              </w:rPr>
+              <w:t>_run_boot_sequence</w:t>
+            </w:r>
+            <w:r>
+              <w:rPr/>
+              <w:t xml:space="preserve"> — required cleanup </w:t>
+            </w:r>
+          </w:p>
+          <w:p>
+            <w:pPr>
+              <w:pStyle w:val="Normal"/>
+              <w:rPr/>
+            </w:pPr>
+            <w:r>
+              <w:rPr/>
+            </w:r>
+          </w:p>
+        </w:tc>
+      </w:tr>
+      <w:tr>
+        <w:trPr/>
+        <w:tc>
+          <w:tcPr>
+            <w:tcW w:w="9360" w:type="dxa"/>
+            <w:tcBorders>
+              <w:left w:val="single" w:sz="2" w:space="0" w:color="AAAAAA"/>
+              <w:bottom w:val="single" w:sz="2" w:space="0" w:color="AAAAAA"/>
+              <w:right w:val="single" w:sz="2" w:space="0" w:color="AAAAAA"/>
+            </w:tcBorders>
+          </w:tcPr>
+          <w:p>
+            <w:pPr>
+              <w:pStyle w:val="BodyText"/>
+              <w:numPr>
+                <w:ilvl w:val="0"/>
+                <w:numId w:val="14"/>
+              </w:numPr>
+              <w:tabs>
+                <w:tab w:val="clear" w:pos="720"/>
+                <w:tab w:val="left" w:pos="0" w:leader="none"/>
+              </w:tabs>
+              <w:ind w:hanging="283" w:left="709" w:right="0"/>
+              <w:rPr/>
+            </w:pPr>
+            <w:r>
+              <w:rPr/>
+              <w:t xml:space="preserve">Animation workers crashed immediately on </w:t>
+            </w:r>
+            <w:r>
+              <w:rPr>
+                <w:rStyle w:val="SourceText"/>
+              </w:rPr>
+              <w:t>master_enabled=True</w:t>
+            </w:r>
+            <w:r>
+              <w:rPr/>
+              <w:t xml:space="preserve"> because app-side receiver methods didn't exist — stubbed to unblock </w:t>
+            </w:r>
+          </w:p>
           <w:p>
             <w:pPr>
               <w:pStyle w:val="Normal"/>
@@ -5703,7 +6616,7 @@
                 <w:sz w:val="19"/>
                 <w:szCs w:val="19"/>
               </w:rPr>
-              <w:t>Date completed:</w:t>
+              <w:t xml:space="preserve">Date completed: </w:t>
             </w:r>
           </w:p>
         </w:tc>
@@ -5725,6 +6638,7 @@
             </w:pPr>
             <w:r>
               <w:rPr/>
+              <w:t>04 March 2026</w:t>
             </w:r>
           </w:p>
         </w:tc>
@@ -5802,6 +6716,7 @@
             </w:pPr>
             <w:r>
               <w:rPr/>
+              <w:t>32/32</w:t>
             </w:r>
           </w:p>
         </w:tc>
@@ -5875,10 +6790,24 @@
           <w:p>
             <w:pPr>
               <w:pStyle w:val="Normal"/>
-              <w:rPr/>
-            </w:pPr>
-            <w:r>
-              <w:rPr/>
+              <w:ind w:hanging="0" w:left="0" w:right="0"/>
+              <w:rPr>
+                <w:rFonts w:ascii="monospace" w:hAnsi="monospace"/>
+              </w:rPr>
+            </w:pPr>
+            <w:r>
+              <w:rPr>
+                <w:rFonts w:ascii="monospace" w:hAnsi="monospace"/>
+                <w:color w:val="B26818"/>
+                <w:shd w:fill="FFFFFF" w:val="clear"/>
+              </w:rPr>
+              <w:t>2ced99c</w:t>
+            </w:r>
+            <w:r>
+              <w:rPr>
+                <w:rFonts w:ascii="monospace" w:hAnsi="monospace"/>
+              </w:rPr>
+              <w:br/>
             </w:r>
           </w:p>
         </w:tc>
@@ -6200,6 +7129,7 @@
             </w:pPr>
             <w:r>
               <w:rPr/>
+              <w:t>04 March 2026</w:t>
             </w:r>
           </w:p>
         </w:tc>
@@ -6273,10 +7203,24 @@
           <w:p>
             <w:pPr>
               <w:pStyle w:val="Normal"/>
-              <w:rPr/>
-            </w:pPr>
-            <w:r>
-              <w:rPr/>
+              <w:ind w:hanging="0" w:left="0" w:right="0"/>
+              <w:rPr>
+                <w:rFonts w:ascii="monospace" w:hAnsi="monospace"/>
+              </w:rPr>
+            </w:pPr>
+            <w:r>
+              <w:rPr>
+                <w:rFonts w:ascii="monospace" w:hAnsi="monospace"/>
+                <w:color w:val="000000"/>
+                <w:shd w:fill="FFFFFF" w:val="clear"/>
+              </w:rPr>
+              <w:t>phase-3-grimoire</w:t>
+            </w:r>
+            <w:r>
+              <w:rPr>
+                <w:rFonts w:ascii="monospace" w:hAnsi="monospace"/>
+              </w:rPr>
+              <w:br/>
             </w:r>
           </w:p>
         </w:tc>
@@ -6354,6 +7298,7 @@
             </w:pPr>
             <w:r>
               <w:rPr/>
+              <w:t>NA</w:t>
             </w:r>
           </w:p>
         </w:tc>
@@ -6444,6 +7389,7 @@
             </w:pPr>
             <w:r>
               <w:rPr/>
+              <w:t>Setting up the framework for the Grimoire feature.</w:t>
             </w:r>
           </w:p>
         </w:tc>
@@ -6624,6 +7570,46 @@
           </w:tcPr>
           <w:p>
             <w:pPr>
+              <w:pStyle w:val="BodyText"/>
+              <w:numPr>
+                <w:ilvl w:val="0"/>
+                <w:numId w:val="15"/>
+              </w:numPr>
+              <w:tabs>
+                <w:tab w:val="clear" w:pos="720"/>
+                <w:tab w:val="left" w:pos="0" w:leader="none"/>
+              </w:tabs>
+              <w:spacing w:before="0" w:after="0"/>
+              <w:ind w:hanging="283" w:left="720"/>
+              <w:rPr/>
+            </w:pPr>
+            <w:r>
+              <w:rPr/>
+              <w:t xml:space="preserve">Grimoire store path changed from </w:t>
+            </w:r>
+            <w:r>
+              <w:rPr>
+                <w:rStyle w:val="SourceText"/>
+              </w:rPr>
+              <w:t>data/grimoire/grimoire.json</w:t>
+            </w:r>
+            <w:r>
+              <w:rPr/>
+              <w:t xml:space="preserve"> to </w:t>
+            </w:r>
+            <w:r>
+              <w:rPr>
+                <w:rStyle w:val="SourceText"/>
+              </w:rPr>
+              <w:t>storage/grimoire/grimoire.json</w:t>
+            </w:r>
+            <w:r>
+              <w:rPr/>
+              <w:t xml:space="preserve"> to match project storage convention </w:t>
+            </w:r>
+          </w:p>
+          <w:p>
+            <w:pPr>
               <w:pStyle w:val="Normal"/>
               <w:rPr/>
             </w:pPr>
@@ -6646,6 +7632,32 @@
           </w:tcPr>
           <w:p>
             <w:pPr>
+              <w:pStyle w:val="BodyText"/>
+              <w:numPr>
+                <w:ilvl w:val="0"/>
+                <w:numId w:val="16"/>
+              </w:numPr>
+              <w:tabs>
+                <w:tab w:val="clear" w:pos="720"/>
+                <w:tab w:val="left" w:pos="0" w:leader="none"/>
+              </w:tabs>
+              <w:spacing w:before="0" w:after="0"/>
+              <w:ind w:hanging="283" w:left="720"/>
+              <w:rPr/>
+            </w:pPr>
+            <w:r>
+              <w:rPr>
+                <w:rStyle w:val="SourceText"/>
+              </w:rPr>
+              <w:t>_estimate_tokens</w:t>
+            </w:r>
+            <w:r>
+              <w:rPr/>
+              <w:t xml:space="preserve"> fixed to return 0 on empty string instead of minimum 1 </w:t>
+            </w:r>
+          </w:p>
+          <w:p>
+            <w:pPr>
               <w:pStyle w:val="Normal"/>
               <w:rPr/>
             </w:pPr>
@@ -6668,6 +7680,32 @@
           </w:tcPr>
           <w:p>
             <w:pPr>
+              <w:pStyle w:val="BodyText"/>
+              <w:numPr>
+                <w:ilvl w:val="0"/>
+                <w:numId w:val="17"/>
+              </w:numPr>
+              <w:tabs>
+                <w:tab w:val="clear" w:pos="720"/>
+                <w:tab w:val="left" w:pos="0" w:leader="none"/>
+              </w:tabs>
+              <w:spacing w:before="0" w:after="0"/>
+              <w:ind w:hanging="283" w:left="720"/>
+              <w:rPr/>
+            </w:pPr>
+            <w:r>
+              <w:rPr>
+                <w:rStyle w:val="SourceText"/>
+              </w:rPr>
+              <w:t>_estimate_tokens</w:t>
+            </w:r>
+            <w:r>
+              <w:rPr/>
+              <w:t xml:space="preserve"> fixed to return 0 on empty string instead of minimum 1 </w:t>
+            </w:r>
+          </w:p>
+          <w:p>
+            <w:pPr>
               <w:pStyle w:val="Normal"/>
               <w:rPr/>
             </w:pPr>
@@ -6690,6 +7728,42 @@
           </w:tcPr>
           <w:p>
             <w:pPr>
+              <w:pStyle w:val="BodyText"/>
+              <w:numPr>
+                <w:ilvl w:val="0"/>
+                <w:numId w:val="18"/>
+              </w:numPr>
+              <w:tabs>
+                <w:tab w:val="clear" w:pos="720"/>
+                <w:tab w:val="left" w:pos="0" w:leader="none"/>
+              </w:tabs>
+              <w:spacing w:before="0" w:after="0"/>
+              <w:ind w:hanging="283" w:left="720"/>
+              <w:rPr/>
+            </w:pPr>
+            <w:r>
+              <w:rPr>
+                <w:rStyle w:val="SourceText"/>
+              </w:rPr>
+              <w:t>_handle_grimoire_command</w:t>
+            </w:r>
+            <w:r>
+              <w:rPr/>
+              <w:t xml:space="preserve"> accidentally placed at module level twice — moved into </w:t>
+            </w:r>
+            <w:r>
+              <w:rPr>
+                <w:rStyle w:val="SourceText"/>
+              </w:rPr>
+              <w:t>ChatTUIApp</w:t>
+            </w:r>
+            <w:r>
+              <w:rPr/>
+              <w:t xml:space="preserve"> as proper method </w:t>
+            </w:r>
+          </w:p>
+          <w:p>
+            <w:pPr>
               <w:pStyle w:val="Normal"/>
               <w:rPr/>
             </w:pPr>
@@ -6712,6 +7786,52 @@
           </w:tcPr>
           <w:p>
             <w:pPr>
+              <w:pStyle w:val="BodyText"/>
+              <w:numPr>
+                <w:ilvl w:val="0"/>
+                <w:numId w:val="19"/>
+              </w:numPr>
+              <w:tabs>
+                <w:tab w:val="clear" w:pos="720"/>
+                <w:tab w:val="left" w:pos="0" w:leader="none"/>
+              </w:tabs>
+              <w:spacing w:before="0" w:after="0"/>
+              <w:ind w:hanging="283" w:left="720"/>
+              <w:rPr/>
+            </w:pPr>
+            <w:r>
+              <w:rPr>
+                <w:rStyle w:val="SourceText"/>
+              </w:rPr>
+              <w:t>push_screen(ConversationsPage...)</w:t>
+            </w:r>
+            <w:r>
+              <w:rPr/>
+              <w:t xml:space="preserve"> and </w:t>
+            </w:r>
+            <w:r>
+              <w:rPr>
+                <w:rStyle w:val="SourceText"/>
+              </w:rPr>
+              <w:t>_on_conversation_selected</w:t>
+            </w:r>
+            <w:r>
+              <w:rPr/>
+              <w:t xml:space="preserve"> removed from inside </w:t>
+            </w:r>
+            <w:r>
+              <w:rPr>
+                <w:rStyle w:val="SourceText"/>
+              </w:rPr>
+              <w:t>_handle_menu_command</w:t>
+            </w:r>
+            <w:r>
+              <w:rPr/>
+              <w:t xml:space="preserve"> where they had been incorrectly placed </w:t>
+            </w:r>
+          </w:p>
+          <w:p>
+            <w:pPr>
               <w:pStyle w:val="Normal"/>
               <w:rPr/>
             </w:pPr>
@@ -6734,6 +7854,66 @@
           </w:tcPr>
           <w:p>
             <w:pPr>
+              <w:pStyle w:val="BodyText"/>
+              <w:numPr>
+                <w:ilvl w:val="0"/>
+                <w:numId w:val="20"/>
+              </w:numPr>
+              <w:tabs>
+                <w:tab w:val="clear" w:pos="720"/>
+                <w:tab w:val="left" w:pos="0" w:leader="none"/>
+              </w:tabs>
+              <w:spacing w:before="0" w:after="0"/>
+              <w:ind w:hanging="283" w:left="720"/>
+              <w:rPr/>
+            </w:pPr>
+            <w:r>
+              <w:rPr/>
+              <w:t xml:space="preserve">Grimoire instantiation in </w:t>
+            </w:r>
+            <w:r>
+              <w:rPr>
+                <w:rStyle w:val="SourceText"/>
+              </w:rPr>
+              <w:t>__init__</w:t>
+            </w:r>
+            <w:r>
+              <w:rPr/>
+              <w:t xml:space="preserve"> uses </w:t>
+            </w:r>
+            <w:r>
+              <w:rPr>
+                <w:rStyle w:val="SourceText"/>
+              </w:rPr>
+              <w:t>self.cfg.raw.get()</w:t>
+            </w:r>
+            <w:r>
+              <w:rPr/>
+              <w:t xml:space="preserve"> not </w:t>
+            </w:r>
+            <w:r>
+              <w:rPr>
+                <w:rStyle w:val="SourceText"/>
+              </w:rPr>
+              <w:t>self.cfg.get()</w:t>
+            </w:r>
+            <w:r>
+              <w:rPr/>
+              <w:t xml:space="preserve"> or </w:t>
+            </w:r>
+            <w:r>
+              <w:rPr>
+                <w:rStyle w:val="SourceText"/>
+              </w:rPr>
+              <w:t>self.config.get()</w:t>
+            </w:r>
+            <w:r>
+              <w:rPr/>
+              <w:t xml:space="preserve"> </w:t>
+            </w:r>
+          </w:p>
+          <w:p>
+            <w:pPr>
               <w:pStyle w:val="Normal"/>
               <w:rPr/>
             </w:pPr>
@@ -6754,6 +7934,99 @@
               <w:right w:val="single" w:sz="2" w:space="0" w:color="AAAAAA"/>
             </w:tcBorders>
           </w:tcPr>
+          <w:p>
+            <w:pPr>
+              <w:pStyle w:val="BodyText"/>
+              <w:numPr>
+                <w:ilvl w:val="0"/>
+                <w:numId w:val="21"/>
+              </w:numPr>
+              <w:tabs>
+                <w:tab w:val="clear" w:pos="720"/>
+                <w:tab w:val="left" w:pos="0" w:leader="none"/>
+              </w:tabs>
+              <w:spacing w:before="0" w:after="0"/>
+              <w:ind w:hanging="283" w:left="720"/>
+              <w:rPr/>
+            </w:pPr>
+            <w:r>
+              <w:rPr>
+                <w:rStyle w:val="SourceText"/>
+              </w:rPr>
+              <w:t>GrimoirePage</w:t>
+            </w:r>
+            <w:r>
+              <w:rPr/>
+              <w:t xml:space="preserve"> action methods implemented with modal pattern for add/edit </w:t>
+            </w:r>
+          </w:p>
+          <w:p>
+            <w:pPr>
+              <w:pStyle w:val="Normal"/>
+              <w:rPr/>
+            </w:pPr>
+            <w:r>
+              <w:rPr/>
+            </w:r>
+          </w:p>
+        </w:tc>
+      </w:tr>
+      <w:tr>
+        <w:trPr/>
+        <w:tc>
+          <w:tcPr>
+            <w:tcW w:w="9360" w:type="dxa"/>
+            <w:tcBorders>
+              <w:left w:val="single" w:sz="2" w:space="0" w:color="AAAAAA"/>
+              <w:bottom w:val="single" w:sz="2" w:space="0" w:color="AAAAAA"/>
+              <w:right w:val="single" w:sz="2" w:space="0" w:color="AAAAAA"/>
+            </w:tcBorders>
+          </w:tcPr>
+          <w:p>
+            <w:pPr>
+              <w:pStyle w:val="BodyText"/>
+              <w:numPr>
+                <w:ilvl w:val="0"/>
+                <w:numId w:val="22"/>
+              </w:numPr>
+              <w:tabs>
+                <w:tab w:val="clear" w:pos="720"/>
+                <w:tab w:val="left" w:pos="0" w:leader="none"/>
+              </w:tabs>
+              <w:ind w:hanging="283" w:left="709"/>
+              <w:rPr/>
+            </w:pPr>
+            <w:r>
+              <w:rPr>
+                <w:rStyle w:val="SourceText"/>
+              </w:rPr>
+              <w:t>budget</w:t>
+            </w:r>
+            <w:r>
+              <w:rPr/>
+              <w:t xml:space="preserve"> assignment accidentally placed inside </w:t>
+            </w:r>
+            <w:r>
+              <w:rPr>
+                <w:rStyle w:val="SourceText"/>
+              </w:rPr>
+              <w:t>token_usage()</w:t>
+            </w:r>
+            <w:r>
+              <w:rPr/>
+              <w:t xml:space="preserve"> return dict — moved back to </w:t>
+            </w:r>
+            <w:r>
+              <w:rPr>
+                <w:rStyle w:val="SourceText"/>
+              </w:rPr>
+              <w:t>build_injection_string()</w:t>
+            </w:r>
+            <w:r>
+              <w:rPr/>
+              <w:t xml:space="preserve"> </w:t>
+            </w:r>
+          </w:p>
           <w:p>
             <w:pPr>
               <w:pStyle w:val="Normal"/>
@@ -21264,7 +22537,7 @@
     </w:r>
     <w:r>
       <w:rPr/>
-      <w:t>7</w:t>
+      <w:t>12</w:t>
     </w:r>
     <w:r>
       <w:rPr/>
@@ -21308,7 +22581,7 @@
     </w:r>
     <w:r>
       <w:rPr/>
-      <w:t>7</w:t>
+      <w:t>12</w:t>
     </w:r>
     <w:r>
       <w:rPr/>
@@ -21498,6 +22771,2451 @@
   <w:abstractNum w:abstractNumId="2">
     <w:lvl w:ilvl="0">
       <w:start w:val="1"/>
+      <w:numFmt w:val="bullet"/>
+      <w:lvlText w:val=""/>
+      <w:lvlJc w:val="left"/>
+      <w:pPr>
+        <w:tabs>
+          <w:tab w:val="num" w:pos="720"/>
+        </w:tabs>
+        <w:ind w:left="720" w:hanging="283"/>
+      </w:pPr>
+      <w:rPr>
+        <w:rFonts w:ascii="Symbol" w:hAnsi="Symbol" w:cs="Symbol" w:hint="default"/>
+      </w:rPr>
+    </w:lvl>
+    <w:lvl w:ilvl="1">
+      <w:start w:val="1"/>
+      <w:numFmt w:val="decimal"/>
+      <w:lvlText w:val="%2."/>
+      <w:lvlJc w:val="left"/>
+      <w:pPr>
+        <w:tabs>
+          <w:tab w:val="num" w:pos="1080"/>
+        </w:tabs>
+        <w:ind w:left="1080" w:hanging="360"/>
+      </w:pPr>
+    </w:lvl>
+    <w:lvl w:ilvl="2">
+      <w:start w:val="1"/>
+      <w:numFmt w:val="decimal"/>
+      <w:lvlText w:val="%3."/>
+      <w:lvlJc w:val="left"/>
+      <w:pPr>
+        <w:tabs>
+          <w:tab w:val="num" w:pos="1440"/>
+        </w:tabs>
+        <w:ind w:left="1440" w:hanging="360"/>
+      </w:pPr>
+    </w:lvl>
+    <w:lvl w:ilvl="3">
+      <w:start w:val="1"/>
+      <w:numFmt w:val="decimal"/>
+      <w:lvlText w:val="%4."/>
+      <w:lvlJc w:val="left"/>
+      <w:pPr>
+        <w:tabs>
+          <w:tab w:val="num" w:pos="1800"/>
+        </w:tabs>
+        <w:ind w:left="1800" w:hanging="360"/>
+      </w:pPr>
+    </w:lvl>
+    <w:lvl w:ilvl="4">
+      <w:start w:val="1"/>
+      <w:numFmt w:val="decimal"/>
+      <w:lvlText w:val="%5."/>
+      <w:lvlJc w:val="left"/>
+      <w:pPr>
+        <w:tabs>
+          <w:tab w:val="num" w:pos="2160"/>
+        </w:tabs>
+        <w:ind w:left="2160" w:hanging="360"/>
+      </w:pPr>
+    </w:lvl>
+    <w:lvl w:ilvl="5">
+      <w:start w:val="1"/>
+      <w:numFmt w:val="decimal"/>
+      <w:lvlText w:val="%6."/>
+      <w:lvlJc w:val="left"/>
+      <w:pPr>
+        <w:tabs>
+          <w:tab w:val="num" w:pos="2520"/>
+        </w:tabs>
+        <w:ind w:left="2520" w:hanging="360"/>
+      </w:pPr>
+    </w:lvl>
+    <w:lvl w:ilvl="6">
+      <w:start w:val="1"/>
+      <w:numFmt w:val="decimal"/>
+      <w:lvlText w:val="%7."/>
+      <w:lvlJc w:val="left"/>
+      <w:pPr>
+        <w:tabs>
+          <w:tab w:val="num" w:pos="2880"/>
+        </w:tabs>
+        <w:ind w:left="2880" w:hanging="360"/>
+      </w:pPr>
+    </w:lvl>
+    <w:lvl w:ilvl="7">
+      <w:start w:val="1"/>
+      <w:numFmt w:val="decimal"/>
+      <w:lvlText w:val="%8."/>
+      <w:lvlJc w:val="left"/>
+      <w:pPr>
+        <w:tabs>
+          <w:tab w:val="num" w:pos="3240"/>
+        </w:tabs>
+        <w:ind w:left="3240" w:hanging="360"/>
+      </w:pPr>
+    </w:lvl>
+    <w:lvl w:ilvl="8">
+      <w:start w:val="1"/>
+      <w:numFmt w:val="decimal"/>
+      <w:lvlText w:val="%9."/>
+      <w:lvlJc w:val="left"/>
+      <w:pPr>
+        <w:tabs>
+          <w:tab w:val="num" w:pos="3600"/>
+        </w:tabs>
+        <w:ind w:left="3600" w:hanging="360"/>
+      </w:pPr>
+    </w:lvl>
+  </w:abstractNum>
+  <w:abstractNum w:abstractNumId="3">
+    <w:lvl w:ilvl="0">
+      <w:start w:val="1"/>
+      <w:numFmt w:val="bullet"/>
+      <w:lvlText w:val=""/>
+      <w:lvlJc w:val="left"/>
+      <w:pPr>
+        <w:tabs>
+          <w:tab w:val="num" w:pos="720"/>
+        </w:tabs>
+        <w:ind w:left="720" w:hanging="283"/>
+      </w:pPr>
+      <w:rPr>
+        <w:rFonts w:ascii="Symbol" w:hAnsi="Symbol" w:cs="Symbol" w:hint="default"/>
+      </w:rPr>
+    </w:lvl>
+    <w:lvl w:ilvl="1">
+      <w:start w:val="1"/>
+      <w:numFmt w:val="decimal"/>
+      <w:lvlText w:val="%2."/>
+      <w:lvlJc w:val="left"/>
+      <w:pPr>
+        <w:tabs>
+          <w:tab w:val="num" w:pos="1080"/>
+        </w:tabs>
+        <w:ind w:left="1080" w:hanging="360"/>
+      </w:pPr>
+    </w:lvl>
+    <w:lvl w:ilvl="2">
+      <w:start w:val="1"/>
+      <w:numFmt w:val="decimal"/>
+      <w:lvlText w:val="%3."/>
+      <w:lvlJc w:val="left"/>
+      <w:pPr>
+        <w:tabs>
+          <w:tab w:val="num" w:pos="1440"/>
+        </w:tabs>
+        <w:ind w:left="1440" w:hanging="360"/>
+      </w:pPr>
+    </w:lvl>
+    <w:lvl w:ilvl="3">
+      <w:start w:val="1"/>
+      <w:numFmt w:val="decimal"/>
+      <w:lvlText w:val="%4."/>
+      <w:lvlJc w:val="left"/>
+      <w:pPr>
+        <w:tabs>
+          <w:tab w:val="num" w:pos="1800"/>
+        </w:tabs>
+        <w:ind w:left="1800" w:hanging="360"/>
+      </w:pPr>
+    </w:lvl>
+    <w:lvl w:ilvl="4">
+      <w:start w:val="1"/>
+      <w:numFmt w:val="decimal"/>
+      <w:lvlText w:val="%5."/>
+      <w:lvlJc w:val="left"/>
+      <w:pPr>
+        <w:tabs>
+          <w:tab w:val="num" w:pos="2160"/>
+        </w:tabs>
+        <w:ind w:left="2160" w:hanging="360"/>
+      </w:pPr>
+    </w:lvl>
+    <w:lvl w:ilvl="5">
+      <w:start w:val="1"/>
+      <w:numFmt w:val="decimal"/>
+      <w:lvlText w:val="%6."/>
+      <w:lvlJc w:val="left"/>
+      <w:pPr>
+        <w:tabs>
+          <w:tab w:val="num" w:pos="2520"/>
+        </w:tabs>
+        <w:ind w:left="2520" w:hanging="360"/>
+      </w:pPr>
+    </w:lvl>
+    <w:lvl w:ilvl="6">
+      <w:start w:val="1"/>
+      <w:numFmt w:val="decimal"/>
+      <w:lvlText w:val="%7."/>
+      <w:lvlJc w:val="left"/>
+      <w:pPr>
+        <w:tabs>
+          <w:tab w:val="num" w:pos="2880"/>
+        </w:tabs>
+        <w:ind w:left="2880" w:hanging="360"/>
+      </w:pPr>
+    </w:lvl>
+    <w:lvl w:ilvl="7">
+      <w:start w:val="1"/>
+      <w:numFmt w:val="decimal"/>
+      <w:lvlText w:val="%8."/>
+      <w:lvlJc w:val="left"/>
+      <w:pPr>
+        <w:tabs>
+          <w:tab w:val="num" w:pos="3240"/>
+        </w:tabs>
+        <w:ind w:left="3240" w:hanging="360"/>
+      </w:pPr>
+    </w:lvl>
+    <w:lvl w:ilvl="8">
+      <w:start w:val="1"/>
+      <w:numFmt w:val="decimal"/>
+      <w:lvlText w:val="%9."/>
+      <w:lvlJc w:val="left"/>
+      <w:pPr>
+        <w:tabs>
+          <w:tab w:val="num" w:pos="3600"/>
+        </w:tabs>
+        <w:ind w:left="3600" w:hanging="360"/>
+      </w:pPr>
+    </w:lvl>
+  </w:abstractNum>
+  <w:abstractNum w:abstractNumId="4">
+    <w:lvl w:ilvl="0">
+      <w:start w:val="1"/>
+      <w:numFmt w:val="bullet"/>
+      <w:lvlText w:val=""/>
+      <w:lvlJc w:val="left"/>
+      <w:pPr>
+        <w:tabs>
+          <w:tab w:val="num" w:pos="720"/>
+        </w:tabs>
+        <w:ind w:left="720" w:hanging="283"/>
+      </w:pPr>
+      <w:rPr>
+        <w:rFonts w:ascii="Symbol" w:hAnsi="Symbol" w:cs="Symbol" w:hint="default"/>
+      </w:rPr>
+    </w:lvl>
+    <w:lvl w:ilvl="1">
+      <w:start w:val="1"/>
+      <w:numFmt w:val="decimal"/>
+      <w:lvlText w:val="%2."/>
+      <w:lvlJc w:val="left"/>
+      <w:pPr>
+        <w:tabs>
+          <w:tab w:val="num" w:pos="1080"/>
+        </w:tabs>
+        <w:ind w:left="1080" w:hanging="360"/>
+      </w:pPr>
+    </w:lvl>
+    <w:lvl w:ilvl="2">
+      <w:start w:val="1"/>
+      <w:numFmt w:val="decimal"/>
+      <w:lvlText w:val="%3."/>
+      <w:lvlJc w:val="left"/>
+      <w:pPr>
+        <w:tabs>
+          <w:tab w:val="num" w:pos="1440"/>
+        </w:tabs>
+        <w:ind w:left="1440" w:hanging="360"/>
+      </w:pPr>
+    </w:lvl>
+    <w:lvl w:ilvl="3">
+      <w:start w:val="1"/>
+      <w:numFmt w:val="decimal"/>
+      <w:lvlText w:val="%4."/>
+      <w:lvlJc w:val="left"/>
+      <w:pPr>
+        <w:tabs>
+          <w:tab w:val="num" w:pos="1800"/>
+        </w:tabs>
+        <w:ind w:left="1800" w:hanging="360"/>
+      </w:pPr>
+    </w:lvl>
+    <w:lvl w:ilvl="4">
+      <w:start w:val="1"/>
+      <w:numFmt w:val="decimal"/>
+      <w:lvlText w:val="%5."/>
+      <w:lvlJc w:val="left"/>
+      <w:pPr>
+        <w:tabs>
+          <w:tab w:val="num" w:pos="2160"/>
+        </w:tabs>
+        <w:ind w:left="2160" w:hanging="360"/>
+      </w:pPr>
+    </w:lvl>
+    <w:lvl w:ilvl="5">
+      <w:start w:val="1"/>
+      <w:numFmt w:val="decimal"/>
+      <w:lvlText w:val="%6."/>
+      <w:lvlJc w:val="left"/>
+      <w:pPr>
+        <w:tabs>
+          <w:tab w:val="num" w:pos="2520"/>
+        </w:tabs>
+        <w:ind w:left="2520" w:hanging="360"/>
+      </w:pPr>
+    </w:lvl>
+    <w:lvl w:ilvl="6">
+      <w:start w:val="1"/>
+      <w:numFmt w:val="decimal"/>
+      <w:lvlText w:val="%7."/>
+      <w:lvlJc w:val="left"/>
+      <w:pPr>
+        <w:tabs>
+          <w:tab w:val="num" w:pos="2880"/>
+        </w:tabs>
+        <w:ind w:left="2880" w:hanging="360"/>
+      </w:pPr>
+    </w:lvl>
+    <w:lvl w:ilvl="7">
+      <w:start w:val="1"/>
+      <w:numFmt w:val="decimal"/>
+      <w:lvlText w:val="%8."/>
+      <w:lvlJc w:val="left"/>
+      <w:pPr>
+        <w:tabs>
+          <w:tab w:val="num" w:pos="3240"/>
+        </w:tabs>
+        <w:ind w:left="3240" w:hanging="360"/>
+      </w:pPr>
+    </w:lvl>
+    <w:lvl w:ilvl="8">
+      <w:start w:val="1"/>
+      <w:numFmt w:val="decimal"/>
+      <w:lvlText w:val="%9."/>
+      <w:lvlJc w:val="left"/>
+      <w:pPr>
+        <w:tabs>
+          <w:tab w:val="num" w:pos="3600"/>
+        </w:tabs>
+        <w:ind w:left="3600" w:hanging="360"/>
+      </w:pPr>
+    </w:lvl>
+  </w:abstractNum>
+  <w:abstractNum w:abstractNumId="5">
+    <w:lvl w:ilvl="0">
+      <w:start w:val="1"/>
+      <w:numFmt w:val="bullet"/>
+      <w:lvlText w:val=""/>
+      <w:lvlJc w:val="left"/>
+      <w:pPr>
+        <w:tabs>
+          <w:tab w:val="num" w:pos="720"/>
+        </w:tabs>
+        <w:ind w:left="720" w:hanging="283"/>
+      </w:pPr>
+      <w:rPr>
+        <w:rFonts w:ascii="Symbol" w:hAnsi="Symbol" w:cs="Symbol" w:hint="default"/>
+      </w:rPr>
+    </w:lvl>
+    <w:lvl w:ilvl="1">
+      <w:start w:val="1"/>
+      <w:numFmt w:val="decimal"/>
+      <w:lvlText w:val="%2."/>
+      <w:lvlJc w:val="left"/>
+      <w:pPr>
+        <w:tabs>
+          <w:tab w:val="num" w:pos="1080"/>
+        </w:tabs>
+        <w:ind w:left="1080" w:hanging="360"/>
+      </w:pPr>
+    </w:lvl>
+    <w:lvl w:ilvl="2">
+      <w:start w:val="1"/>
+      <w:numFmt w:val="decimal"/>
+      <w:lvlText w:val="%3."/>
+      <w:lvlJc w:val="left"/>
+      <w:pPr>
+        <w:tabs>
+          <w:tab w:val="num" w:pos="1440"/>
+        </w:tabs>
+        <w:ind w:left="1440" w:hanging="360"/>
+      </w:pPr>
+    </w:lvl>
+    <w:lvl w:ilvl="3">
+      <w:start w:val="1"/>
+      <w:numFmt w:val="decimal"/>
+      <w:lvlText w:val="%4."/>
+      <w:lvlJc w:val="left"/>
+      <w:pPr>
+        <w:tabs>
+          <w:tab w:val="num" w:pos="1800"/>
+        </w:tabs>
+        <w:ind w:left="1800" w:hanging="360"/>
+      </w:pPr>
+    </w:lvl>
+    <w:lvl w:ilvl="4">
+      <w:start w:val="1"/>
+      <w:numFmt w:val="decimal"/>
+      <w:lvlText w:val="%5."/>
+      <w:lvlJc w:val="left"/>
+      <w:pPr>
+        <w:tabs>
+          <w:tab w:val="num" w:pos="2160"/>
+        </w:tabs>
+        <w:ind w:left="2160" w:hanging="360"/>
+      </w:pPr>
+    </w:lvl>
+    <w:lvl w:ilvl="5">
+      <w:start w:val="1"/>
+      <w:numFmt w:val="decimal"/>
+      <w:lvlText w:val="%6."/>
+      <w:lvlJc w:val="left"/>
+      <w:pPr>
+        <w:tabs>
+          <w:tab w:val="num" w:pos="2520"/>
+        </w:tabs>
+        <w:ind w:left="2520" w:hanging="360"/>
+      </w:pPr>
+    </w:lvl>
+    <w:lvl w:ilvl="6">
+      <w:start w:val="1"/>
+      <w:numFmt w:val="decimal"/>
+      <w:lvlText w:val="%7."/>
+      <w:lvlJc w:val="left"/>
+      <w:pPr>
+        <w:tabs>
+          <w:tab w:val="num" w:pos="2880"/>
+        </w:tabs>
+        <w:ind w:left="2880" w:hanging="360"/>
+      </w:pPr>
+    </w:lvl>
+    <w:lvl w:ilvl="7">
+      <w:start w:val="1"/>
+      <w:numFmt w:val="decimal"/>
+      <w:lvlText w:val="%8."/>
+      <w:lvlJc w:val="left"/>
+      <w:pPr>
+        <w:tabs>
+          <w:tab w:val="num" w:pos="3240"/>
+        </w:tabs>
+        <w:ind w:left="3240" w:hanging="360"/>
+      </w:pPr>
+    </w:lvl>
+    <w:lvl w:ilvl="8">
+      <w:start w:val="1"/>
+      <w:numFmt w:val="decimal"/>
+      <w:lvlText w:val="%9."/>
+      <w:lvlJc w:val="left"/>
+      <w:pPr>
+        <w:tabs>
+          <w:tab w:val="num" w:pos="3600"/>
+        </w:tabs>
+        <w:ind w:left="3600" w:hanging="360"/>
+      </w:pPr>
+    </w:lvl>
+  </w:abstractNum>
+  <w:abstractNum w:abstractNumId="6">
+    <w:lvl w:ilvl="0">
+      <w:start w:val="1"/>
+      <w:numFmt w:val="bullet"/>
+      <w:lvlText w:val=""/>
+      <w:lvlJc w:val="left"/>
+      <w:pPr>
+        <w:tabs>
+          <w:tab w:val="num" w:pos="720"/>
+        </w:tabs>
+        <w:ind w:left="720" w:hanging="283"/>
+      </w:pPr>
+      <w:rPr>
+        <w:rFonts w:ascii="Symbol" w:hAnsi="Symbol" w:cs="Symbol" w:hint="default"/>
+      </w:rPr>
+    </w:lvl>
+    <w:lvl w:ilvl="1">
+      <w:start w:val="1"/>
+      <w:numFmt w:val="decimal"/>
+      <w:lvlText w:val="%2."/>
+      <w:lvlJc w:val="left"/>
+      <w:pPr>
+        <w:tabs>
+          <w:tab w:val="num" w:pos="1080"/>
+        </w:tabs>
+        <w:ind w:left="1080" w:hanging="360"/>
+      </w:pPr>
+    </w:lvl>
+    <w:lvl w:ilvl="2">
+      <w:start w:val="1"/>
+      <w:numFmt w:val="decimal"/>
+      <w:lvlText w:val="%3."/>
+      <w:lvlJc w:val="left"/>
+      <w:pPr>
+        <w:tabs>
+          <w:tab w:val="num" w:pos="1440"/>
+        </w:tabs>
+        <w:ind w:left="1440" w:hanging="360"/>
+      </w:pPr>
+    </w:lvl>
+    <w:lvl w:ilvl="3">
+      <w:start w:val="1"/>
+      <w:numFmt w:val="decimal"/>
+      <w:lvlText w:val="%4."/>
+      <w:lvlJc w:val="left"/>
+      <w:pPr>
+        <w:tabs>
+          <w:tab w:val="num" w:pos="1800"/>
+        </w:tabs>
+        <w:ind w:left="1800" w:hanging="360"/>
+      </w:pPr>
+    </w:lvl>
+    <w:lvl w:ilvl="4">
+      <w:start w:val="1"/>
+      <w:numFmt w:val="decimal"/>
+      <w:lvlText w:val="%5."/>
+      <w:lvlJc w:val="left"/>
+      <w:pPr>
+        <w:tabs>
+          <w:tab w:val="num" w:pos="2160"/>
+        </w:tabs>
+        <w:ind w:left="2160" w:hanging="360"/>
+      </w:pPr>
+    </w:lvl>
+    <w:lvl w:ilvl="5">
+      <w:start w:val="1"/>
+      <w:numFmt w:val="decimal"/>
+      <w:lvlText w:val="%6."/>
+      <w:lvlJc w:val="left"/>
+      <w:pPr>
+        <w:tabs>
+          <w:tab w:val="num" w:pos="2520"/>
+        </w:tabs>
+        <w:ind w:left="2520" w:hanging="360"/>
+      </w:pPr>
+    </w:lvl>
+    <w:lvl w:ilvl="6">
+      <w:start w:val="1"/>
+      <w:numFmt w:val="decimal"/>
+      <w:lvlText w:val="%7."/>
+      <w:lvlJc w:val="left"/>
+      <w:pPr>
+        <w:tabs>
+          <w:tab w:val="num" w:pos="2880"/>
+        </w:tabs>
+        <w:ind w:left="2880" w:hanging="360"/>
+      </w:pPr>
+    </w:lvl>
+    <w:lvl w:ilvl="7">
+      <w:start w:val="1"/>
+      <w:numFmt w:val="decimal"/>
+      <w:lvlText w:val="%8."/>
+      <w:lvlJc w:val="left"/>
+      <w:pPr>
+        <w:tabs>
+          <w:tab w:val="num" w:pos="3240"/>
+        </w:tabs>
+        <w:ind w:left="3240" w:hanging="360"/>
+      </w:pPr>
+    </w:lvl>
+    <w:lvl w:ilvl="8">
+      <w:start w:val="1"/>
+      <w:numFmt w:val="decimal"/>
+      <w:lvlText w:val="%9."/>
+      <w:lvlJc w:val="left"/>
+      <w:pPr>
+        <w:tabs>
+          <w:tab w:val="num" w:pos="3600"/>
+        </w:tabs>
+        <w:ind w:left="3600" w:hanging="360"/>
+      </w:pPr>
+    </w:lvl>
+  </w:abstractNum>
+  <w:abstractNum w:abstractNumId="7">
+    <w:lvl w:ilvl="0">
+      <w:start w:val="1"/>
+      <w:numFmt w:val="bullet"/>
+      <w:lvlText w:val=""/>
+      <w:lvlJc w:val="left"/>
+      <w:pPr>
+        <w:tabs>
+          <w:tab w:val="num" w:pos="720"/>
+        </w:tabs>
+        <w:ind w:left="720" w:hanging="283"/>
+      </w:pPr>
+      <w:rPr>
+        <w:rFonts w:ascii="Symbol" w:hAnsi="Symbol" w:cs="Symbol" w:hint="default"/>
+      </w:rPr>
+    </w:lvl>
+    <w:lvl w:ilvl="1">
+      <w:start w:val="1"/>
+      <w:numFmt w:val="decimal"/>
+      <w:lvlText w:val="%2."/>
+      <w:lvlJc w:val="left"/>
+      <w:pPr>
+        <w:tabs>
+          <w:tab w:val="num" w:pos="1080"/>
+        </w:tabs>
+        <w:ind w:left="1080" w:hanging="360"/>
+      </w:pPr>
+    </w:lvl>
+    <w:lvl w:ilvl="2">
+      <w:start w:val="1"/>
+      <w:numFmt w:val="decimal"/>
+      <w:lvlText w:val="%3."/>
+      <w:lvlJc w:val="left"/>
+      <w:pPr>
+        <w:tabs>
+          <w:tab w:val="num" w:pos="1440"/>
+        </w:tabs>
+        <w:ind w:left="1440" w:hanging="360"/>
+      </w:pPr>
+    </w:lvl>
+    <w:lvl w:ilvl="3">
+      <w:start w:val="1"/>
+      <w:numFmt w:val="decimal"/>
+      <w:lvlText w:val="%4."/>
+      <w:lvlJc w:val="left"/>
+      <w:pPr>
+        <w:tabs>
+          <w:tab w:val="num" w:pos="1800"/>
+        </w:tabs>
+        <w:ind w:left="1800" w:hanging="360"/>
+      </w:pPr>
+    </w:lvl>
+    <w:lvl w:ilvl="4">
+      <w:start w:val="1"/>
+      <w:numFmt w:val="decimal"/>
+      <w:lvlText w:val="%5."/>
+      <w:lvlJc w:val="left"/>
+      <w:pPr>
+        <w:tabs>
+          <w:tab w:val="num" w:pos="2160"/>
+        </w:tabs>
+        <w:ind w:left="2160" w:hanging="360"/>
+      </w:pPr>
+    </w:lvl>
+    <w:lvl w:ilvl="5">
+      <w:start w:val="1"/>
+      <w:numFmt w:val="decimal"/>
+      <w:lvlText w:val="%6."/>
+      <w:lvlJc w:val="left"/>
+      <w:pPr>
+        <w:tabs>
+          <w:tab w:val="num" w:pos="2520"/>
+        </w:tabs>
+        <w:ind w:left="2520" w:hanging="360"/>
+      </w:pPr>
+    </w:lvl>
+    <w:lvl w:ilvl="6">
+      <w:start w:val="1"/>
+      <w:numFmt w:val="decimal"/>
+      <w:lvlText w:val="%7."/>
+      <w:lvlJc w:val="left"/>
+      <w:pPr>
+        <w:tabs>
+          <w:tab w:val="num" w:pos="2880"/>
+        </w:tabs>
+        <w:ind w:left="2880" w:hanging="360"/>
+      </w:pPr>
+    </w:lvl>
+    <w:lvl w:ilvl="7">
+      <w:start w:val="1"/>
+      <w:numFmt w:val="decimal"/>
+      <w:lvlText w:val="%8."/>
+      <w:lvlJc w:val="left"/>
+      <w:pPr>
+        <w:tabs>
+          <w:tab w:val="num" w:pos="3240"/>
+        </w:tabs>
+        <w:ind w:left="3240" w:hanging="360"/>
+      </w:pPr>
+    </w:lvl>
+    <w:lvl w:ilvl="8">
+      <w:start w:val="1"/>
+      <w:numFmt w:val="decimal"/>
+      <w:lvlText w:val="%9."/>
+      <w:lvlJc w:val="left"/>
+      <w:pPr>
+        <w:tabs>
+          <w:tab w:val="num" w:pos="3600"/>
+        </w:tabs>
+        <w:ind w:left="3600" w:hanging="360"/>
+      </w:pPr>
+    </w:lvl>
+  </w:abstractNum>
+  <w:abstractNum w:abstractNumId="8">
+    <w:lvl w:ilvl="0">
+      <w:start w:val="1"/>
+      <w:numFmt w:val="bullet"/>
+      <w:lvlText w:val=""/>
+      <w:lvlJc w:val="left"/>
+      <w:pPr>
+        <w:tabs>
+          <w:tab w:val="num" w:pos="720"/>
+        </w:tabs>
+        <w:ind w:left="720" w:hanging="283"/>
+      </w:pPr>
+      <w:rPr>
+        <w:rFonts w:ascii="Symbol" w:hAnsi="Symbol" w:cs="Symbol" w:hint="default"/>
+      </w:rPr>
+    </w:lvl>
+    <w:lvl w:ilvl="1">
+      <w:start w:val="1"/>
+      <w:numFmt w:val="decimal"/>
+      <w:lvlText w:val="%2."/>
+      <w:lvlJc w:val="left"/>
+      <w:pPr>
+        <w:tabs>
+          <w:tab w:val="num" w:pos="1080"/>
+        </w:tabs>
+        <w:ind w:left="1080" w:hanging="360"/>
+      </w:pPr>
+    </w:lvl>
+    <w:lvl w:ilvl="2">
+      <w:start w:val="1"/>
+      <w:numFmt w:val="decimal"/>
+      <w:lvlText w:val="%3."/>
+      <w:lvlJc w:val="left"/>
+      <w:pPr>
+        <w:tabs>
+          <w:tab w:val="num" w:pos="1440"/>
+        </w:tabs>
+        <w:ind w:left="1440" w:hanging="360"/>
+      </w:pPr>
+    </w:lvl>
+    <w:lvl w:ilvl="3">
+      <w:start w:val="1"/>
+      <w:numFmt w:val="decimal"/>
+      <w:lvlText w:val="%4."/>
+      <w:lvlJc w:val="left"/>
+      <w:pPr>
+        <w:tabs>
+          <w:tab w:val="num" w:pos="1800"/>
+        </w:tabs>
+        <w:ind w:left="1800" w:hanging="360"/>
+      </w:pPr>
+    </w:lvl>
+    <w:lvl w:ilvl="4">
+      <w:start w:val="1"/>
+      <w:numFmt w:val="decimal"/>
+      <w:lvlText w:val="%5."/>
+      <w:lvlJc w:val="left"/>
+      <w:pPr>
+        <w:tabs>
+          <w:tab w:val="num" w:pos="2160"/>
+        </w:tabs>
+        <w:ind w:left="2160" w:hanging="360"/>
+      </w:pPr>
+    </w:lvl>
+    <w:lvl w:ilvl="5">
+      <w:start w:val="1"/>
+      <w:numFmt w:val="decimal"/>
+      <w:lvlText w:val="%6."/>
+      <w:lvlJc w:val="left"/>
+      <w:pPr>
+        <w:tabs>
+          <w:tab w:val="num" w:pos="2520"/>
+        </w:tabs>
+        <w:ind w:left="2520" w:hanging="360"/>
+      </w:pPr>
+    </w:lvl>
+    <w:lvl w:ilvl="6">
+      <w:start w:val="1"/>
+      <w:numFmt w:val="decimal"/>
+      <w:lvlText w:val="%7."/>
+      <w:lvlJc w:val="left"/>
+      <w:pPr>
+        <w:tabs>
+          <w:tab w:val="num" w:pos="2880"/>
+        </w:tabs>
+        <w:ind w:left="2880" w:hanging="360"/>
+      </w:pPr>
+    </w:lvl>
+    <w:lvl w:ilvl="7">
+      <w:start w:val="1"/>
+      <w:numFmt w:val="decimal"/>
+      <w:lvlText w:val="%8."/>
+      <w:lvlJc w:val="left"/>
+      <w:pPr>
+        <w:tabs>
+          <w:tab w:val="num" w:pos="3240"/>
+        </w:tabs>
+        <w:ind w:left="3240" w:hanging="360"/>
+      </w:pPr>
+    </w:lvl>
+    <w:lvl w:ilvl="8">
+      <w:start w:val="1"/>
+      <w:numFmt w:val="decimal"/>
+      <w:lvlText w:val="%9."/>
+      <w:lvlJc w:val="left"/>
+      <w:pPr>
+        <w:tabs>
+          <w:tab w:val="num" w:pos="3600"/>
+        </w:tabs>
+        <w:ind w:left="3600" w:hanging="360"/>
+      </w:pPr>
+    </w:lvl>
+  </w:abstractNum>
+  <w:abstractNum w:abstractNumId="9">
+    <w:lvl w:ilvl="0">
+      <w:start w:val="1"/>
+      <w:numFmt w:val="bullet"/>
+      <w:lvlText w:val=""/>
+      <w:lvlJc w:val="left"/>
+      <w:pPr>
+        <w:tabs>
+          <w:tab w:val="num" w:pos="709"/>
+        </w:tabs>
+        <w:ind w:left="709" w:hanging="283"/>
+      </w:pPr>
+      <w:rPr>
+        <w:rFonts w:ascii="Symbol" w:hAnsi="Symbol" w:cs="Symbol" w:hint="default"/>
+      </w:rPr>
+    </w:lvl>
+    <w:lvl w:ilvl="1">
+      <w:start w:val="1"/>
+      <w:numFmt w:val="bullet"/>
+      <w:lvlText w:val=""/>
+      <w:lvlJc w:val="left"/>
+      <w:pPr>
+        <w:tabs>
+          <w:tab w:val="num" w:pos="1418"/>
+        </w:tabs>
+        <w:ind w:left="1418" w:hanging="283"/>
+      </w:pPr>
+      <w:rPr>
+        <w:rFonts w:ascii="Symbol" w:hAnsi="Symbol" w:cs="Symbol" w:hint="default"/>
+      </w:rPr>
+    </w:lvl>
+    <w:lvl w:ilvl="2">
+      <w:start w:val="1"/>
+      <w:numFmt w:val="bullet"/>
+      <w:lvlText w:val=""/>
+      <w:lvlJc w:val="left"/>
+      <w:pPr>
+        <w:tabs>
+          <w:tab w:val="num" w:pos="2127"/>
+        </w:tabs>
+        <w:ind w:left="2127" w:hanging="283"/>
+      </w:pPr>
+      <w:rPr>
+        <w:rFonts w:ascii="Symbol" w:hAnsi="Symbol" w:cs="Symbol" w:hint="default"/>
+      </w:rPr>
+    </w:lvl>
+    <w:lvl w:ilvl="3">
+      <w:start w:val="1"/>
+      <w:numFmt w:val="bullet"/>
+      <w:lvlText w:val=""/>
+      <w:lvlJc w:val="left"/>
+      <w:pPr>
+        <w:tabs>
+          <w:tab w:val="num" w:pos="2836"/>
+        </w:tabs>
+        <w:ind w:left="2836" w:hanging="283"/>
+      </w:pPr>
+      <w:rPr>
+        <w:rFonts w:ascii="Symbol" w:hAnsi="Symbol" w:cs="Symbol" w:hint="default"/>
+      </w:rPr>
+    </w:lvl>
+    <w:lvl w:ilvl="4">
+      <w:start w:val="1"/>
+      <w:numFmt w:val="bullet"/>
+      <w:lvlText w:val=""/>
+      <w:lvlJc w:val="left"/>
+      <w:pPr>
+        <w:tabs>
+          <w:tab w:val="num" w:pos="3545"/>
+        </w:tabs>
+        <w:ind w:left="3545" w:hanging="283"/>
+      </w:pPr>
+      <w:rPr>
+        <w:rFonts w:ascii="Symbol" w:hAnsi="Symbol" w:cs="Symbol" w:hint="default"/>
+      </w:rPr>
+    </w:lvl>
+    <w:lvl w:ilvl="5">
+      <w:start w:val="1"/>
+      <w:numFmt w:val="bullet"/>
+      <w:lvlText w:val=""/>
+      <w:lvlJc w:val="left"/>
+      <w:pPr>
+        <w:tabs>
+          <w:tab w:val="num" w:pos="4254"/>
+        </w:tabs>
+        <w:ind w:left="4254" w:hanging="283"/>
+      </w:pPr>
+      <w:rPr>
+        <w:rFonts w:ascii="Symbol" w:hAnsi="Symbol" w:cs="Symbol" w:hint="default"/>
+      </w:rPr>
+    </w:lvl>
+    <w:lvl w:ilvl="6">
+      <w:start w:val="1"/>
+      <w:numFmt w:val="bullet"/>
+      <w:lvlText w:val=""/>
+      <w:lvlJc w:val="left"/>
+      <w:pPr>
+        <w:tabs>
+          <w:tab w:val="num" w:pos="4963"/>
+        </w:tabs>
+        <w:ind w:left="4963" w:hanging="283"/>
+      </w:pPr>
+      <w:rPr>
+        <w:rFonts w:ascii="Symbol" w:hAnsi="Symbol" w:cs="Symbol" w:hint="default"/>
+      </w:rPr>
+    </w:lvl>
+    <w:lvl w:ilvl="7">
+      <w:start w:val="1"/>
+      <w:numFmt w:val="bullet"/>
+      <w:lvlText w:val=""/>
+      <w:lvlJc w:val="left"/>
+      <w:pPr>
+        <w:tabs>
+          <w:tab w:val="num" w:pos="5672"/>
+        </w:tabs>
+        <w:ind w:left="5672" w:hanging="283"/>
+      </w:pPr>
+      <w:rPr>
+        <w:rFonts w:ascii="Symbol" w:hAnsi="Symbol" w:cs="Symbol" w:hint="default"/>
+      </w:rPr>
+    </w:lvl>
+    <w:lvl w:ilvl="8">
+      <w:start w:val="1"/>
+      <w:numFmt w:val="bullet"/>
+      <w:lvlText w:val=""/>
+      <w:lvlJc w:val="left"/>
+      <w:pPr>
+        <w:tabs>
+          <w:tab w:val="num" w:pos="6381"/>
+        </w:tabs>
+        <w:ind w:left="6381" w:hanging="283"/>
+      </w:pPr>
+      <w:rPr>
+        <w:rFonts w:ascii="Symbol" w:hAnsi="Symbol" w:cs="Symbol" w:hint="default"/>
+      </w:rPr>
+    </w:lvl>
+  </w:abstractNum>
+  <w:abstractNum w:abstractNumId="10">
+    <w:lvl w:ilvl="0">
+      <w:start w:val="1"/>
+      <w:numFmt w:val="bullet"/>
+      <w:lvlText w:val=""/>
+      <w:lvlJc w:val="left"/>
+      <w:pPr>
+        <w:tabs>
+          <w:tab w:val="num" w:pos="720"/>
+        </w:tabs>
+        <w:ind w:left="720" w:hanging="283"/>
+      </w:pPr>
+      <w:rPr>
+        <w:rFonts w:ascii="Symbol" w:hAnsi="Symbol" w:cs="Symbol" w:hint="default"/>
+      </w:rPr>
+    </w:lvl>
+    <w:lvl w:ilvl="1">
+      <w:start w:val="1"/>
+      <w:numFmt w:val="decimal"/>
+      <w:lvlText w:val="%2."/>
+      <w:lvlJc w:val="left"/>
+      <w:pPr>
+        <w:tabs>
+          <w:tab w:val="num" w:pos="1080"/>
+        </w:tabs>
+        <w:ind w:left="1080" w:hanging="360"/>
+      </w:pPr>
+    </w:lvl>
+    <w:lvl w:ilvl="2">
+      <w:start w:val="1"/>
+      <w:numFmt w:val="decimal"/>
+      <w:lvlText w:val="%3."/>
+      <w:lvlJc w:val="left"/>
+      <w:pPr>
+        <w:tabs>
+          <w:tab w:val="num" w:pos="1440"/>
+        </w:tabs>
+        <w:ind w:left="1440" w:hanging="360"/>
+      </w:pPr>
+    </w:lvl>
+    <w:lvl w:ilvl="3">
+      <w:start w:val="1"/>
+      <w:numFmt w:val="decimal"/>
+      <w:lvlText w:val="%4."/>
+      <w:lvlJc w:val="left"/>
+      <w:pPr>
+        <w:tabs>
+          <w:tab w:val="num" w:pos="1800"/>
+        </w:tabs>
+        <w:ind w:left="1800" w:hanging="360"/>
+      </w:pPr>
+    </w:lvl>
+    <w:lvl w:ilvl="4">
+      <w:start w:val="1"/>
+      <w:numFmt w:val="decimal"/>
+      <w:lvlText w:val="%5."/>
+      <w:lvlJc w:val="left"/>
+      <w:pPr>
+        <w:tabs>
+          <w:tab w:val="num" w:pos="2160"/>
+        </w:tabs>
+        <w:ind w:left="2160" w:hanging="360"/>
+      </w:pPr>
+    </w:lvl>
+    <w:lvl w:ilvl="5">
+      <w:start w:val="1"/>
+      <w:numFmt w:val="decimal"/>
+      <w:lvlText w:val="%6."/>
+      <w:lvlJc w:val="left"/>
+      <w:pPr>
+        <w:tabs>
+          <w:tab w:val="num" w:pos="2520"/>
+        </w:tabs>
+        <w:ind w:left="2520" w:hanging="360"/>
+      </w:pPr>
+    </w:lvl>
+    <w:lvl w:ilvl="6">
+      <w:start w:val="1"/>
+      <w:numFmt w:val="decimal"/>
+      <w:lvlText w:val="%7."/>
+      <w:lvlJc w:val="left"/>
+      <w:pPr>
+        <w:tabs>
+          <w:tab w:val="num" w:pos="2880"/>
+        </w:tabs>
+        <w:ind w:left="2880" w:hanging="360"/>
+      </w:pPr>
+    </w:lvl>
+    <w:lvl w:ilvl="7">
+      <w:start w:val="1"/>
+      <w:numFmt w:val="decimal"/>
+      <w:lvlText w:val="%8."/>
+      <w:lvlJc w:val="left"/>
+      <w:pPr>
+        <w:tabs>
+          <w:tab w:val="num" w:pos="3240"/>
+        </w:tabs>
+        <w:ind w:left="3240" w:hanging="360"/>
+      </w:pPr>
+    </w:lvl>
+    <w:lvl w:ilvl="8">
+      <w:start w:val="1"/>
+      <w:numFmt w:val="decimal"/>
+      <w:lvlText w:val="%9."/>
+      <w:lvlJc w:val="left"/>
+      <w:pPr>
+        <w:tabs>
+          <w:tab w:val="num" w:pos="3600"/>
+        </w:tabs>
+        <w:ind w:left="3600" w:hanging="360"/>
+      </w:pPr>
+    </w:lvl>
+  </w:abstractNum>
+  <w:abstractNum w:abstractNumId="11">
+    <w:lvl w:ilvl="0">
+      <w:start w:val="1"/>
+      <w:numFmt w:val="bullet"/>
+      <w:lvlText w:val=""/>
+      <w:lvlJc w:val="left"/>
+      <w:pPr>
+        <w:tabs>
+          <w:tab w:val="num" w:pos="720"/>
+        </w:tabs>
+        <w:ind w:left="720" w:hanging="283"/>
+      </w:pPr>
+      <w:rPr>
+        <w:rFonts w:ascii="Symbol" w:hAnsi="Symbol" w:cs="Symbol" w:hint="default"/>
+      </w:rPr>
+    </w:lvl>
+    <w:lvl w:ilvl="1">
+      <w:start w:val="1"/>
+      <w:numFmt w:val="decimal"/>
+      <w:lvlText w:val="%2."/>
+      <w:lvlJc w:val="left"/>
+      <w:pPr>
+        <w:tabs>
+          <w:tab w:val="num" w:pos="1080"/>
+        </w:tabs>
+        <w:ind w:left="1080" w:hanging="360"/>
+      </w:pPr>
+    </w:lvl>
+    <w:lvl w:ilvl="2">
+      <w:start w:val="1"/>
+      <w:numFmt w:val="decimal"/>
+      <w:lvlText w:val="%3."/>
+      <w:lvlJc w:val="left"/>
+      <w:pPr>
+        <w:tabs>
+          <w:tab w:val="num" w:pos="1440"/>
+        </w:tabs>
+        <w:ind w:left="1440" w:hanging="360"/>
+      </w:pPr>
+    </w:lvl>
+    <w:lvl w:ilvl="3">
+      <w:start w:val="1"/>
+      <w:numFmt w:val="decimal"/>
+      <w:lvlText w:val="%4."/>
+      <w:lvlJc w:val="left"/>
+      <w:pPr>
+        <w:tabs>
+          <w:tab w:val="num" w:pos="1800"/>
+        </w:tabs>
+        <w:ind w:left="1800" w:hanging="360"/>
+      </w:pPr>
+    </w:lvl>
+    <w:lvl w:ilvl="4">
+      <w:start w:val="1"/>
+      <w:numFmt w:val="decimal"/>
+      <w:lvlText w:val="%5."/>
+      <w:lvlJc w:val="left"/>
+      <w:pPr>
+        <w:tabs>
+          <w:tab w:val="num" w:pos="2160"/>
+        </w:tabs>
+        <w:ind w:left="2160" w:hanging="360"/>
+      </w:pPr>
+    </w:lvl>
+    <w:lvl w:ilvl="5">
+      <w:start w:val="1"/>
+      <w:numFmt w:val="decimal"/>
+      <w:lvlText w:val="%6."/>
+      <w:lvlJc w:val="left"/>
+      <w:pPr>
+        <w:tabs>
+          <w:tab w:val="num" w:pos="2520"/>
+        </w:tabs>
+        <w:ind w:left="2520" w:hanging="360"/>
+      </w:pPr>
+    </w:lvl>
+    <w:lvl w:ilvl="6">
+      <w:start w:val="1"/>
+      <w:numFmt w:val="decimal"/>
+      <w:lvlText w:val="%7."/>
+      <w:lvlJc w:val="left"/>
+      <w:pPr>
+        <w:tabs>
+          <w:tab w:val="num" w:pos="2880"/>
+        </w:tabs>
+        <w:ind w:left="2880" w:hanging="360"/>
+      </w:pPr>
+    </w:lvl>
+    <w:lvl w:ilvl="7">
+      <w:start w:val="1"/>
+      <w:numFmt w:val="decimal"/>
+      <w:lvlText w:val="%8."/>
+      <w:lvlJc w:val="left"/>
+      <w:pPr>
+        <w:tabs>
+          <w:tab w:val="num" w:pos="3240"/>
+        </w:tabs>
+        <w:ind w:left="3240" w:hanging="360"/>
+      </w:pPr>
+    </w:lvl>
+    <w:lvl w:ilvl="8">
+      <w:start w:val="1"/>
+      <w:numFmt w:val="decimal"/>
+      <w:lvlText w:val="%9."/>
+      <w:lvlJc w:val="left"/>
+      <w:pPr>
+        <w:tabs>
+          <w:tab w:val="num" w:pos="3600"/>
+        </w:tabs>
+        <w:ind w:left="3600" w:hanging="360"/>
+      </w:pPr>
+    </w:lvl>
+  </w:abstractNum>
+  <w:abstractNum w:abstractNumId="12">
+    <w:lvl w:ilvl="0">
+      <w:start w:val="1"/>
+      <w:numFmt w:val="bullet"/>
+      <w:lvlText w:val=""/>
+      <w:lvlJc w:val="left"/>
+      <w:pPr>
+        <w:tabs>
+          <w:tab w:val="num" w:pos="720"/>
+        </w:tabs>
+        <w:ind w:left="720" w:hanging="283"/>
+      </w:pPr>
+      <w:rPr>
+        <w:rFonts w:ascii="Symbol" w:hAnsi="Symbol" w:cs="Symbol" w:hint="default"/>
+      </w:rPr>
+    </w:lvl>
+    <w:lvl w:ilvl="1">
+      <w:start w:val="1"/>
+      <w:numFmt w:val="decimal"/>
+      <w:lvlText w:val="%2."/>
+      <w:lvlJc w:val="left"/>
+      <w:pPr>
+        <w:tabs>
+          <w:tab w:val="num" w:pos="1080"/>
+        </w:tabs>
+        <w:ind w:left="1080" w:hanging="360"/>
+      </w:pPr>
+    </w:lvl>
+    <w:lvl w:ilvl="2">
+      <w:start w:val="1"/>
+      <w:numFmt w:val="decimal"/>
+      <w:lvlText w:val="%3."/>
+      <w:lvlJc w:val="left"/>
+      <w:pPr>
+        <w:tabs>
+          <w:tab w:val="num" w:pos="1440"/>
+        </w:tabs>
+        <w:ind w:left="1440" w:hanging="360"/>
+      </w:pPr>
+    </w:lvl>
+    <w:lvl w:ilvl="3">
+      <w:start w:val="1"/>
+      <w:numFmt w:val="decimal"/>
+      <w:lvlText w:val="%4."/>
+      <w:lvlJc w:val="left"/>
+      <w:pPr>
+        <w:tabs>
+          <w:tab w:val="num" w:pos="1800"/>
+        </w:tabs>
+        <w:ind w:left="1800" w:hanging="360"/>
+      </w:pPr>
+    </w:lvl>
+    <w:lvl w:ilvl="4">
+      <w:start w:val="1"/>
+      <w:numFmt w:val="decimal"/>
+      <w:lvlText w:val="%5."/>
+      <w:lvlJc w:val="left"/>
+      <w:pPr>
+        <w:tabs>
+          <w:tab w:val="num" w:pos="2160"/>
+        </w:tabs>
+        <w:ind w:left="2160" w:hanging="360"/>
+      </w:pPr>
+    </w:lvl>
+    <w:lvl w:ilvl="5">
+      <w:start w:val="1"/>
+      <w:numFmt w:val="decimal"/>
+      <w:lvlText w:val="%6."/>
+      <w:lvlJc w:val="left"/>
+      <w:pPr>
+        <w:tabs>
+          <w:tab w:val="num" w:pos="2520"/>
+        </w:tabs>
+        <w:ind w:left="2520" w:hanging="360"/>
+      </w:pPr>
+    </w:lvl>
+    <w:lvl w:ilvl="6">
+      <w:start w:val="1"/>
+      <w:numFmt w:val="decimal"/>
+      <w:lvlText w:val="%7."/>
+      <w:lvlJc w:val="left"/>
+      <w:pPr>
+        <w:tabs>
+          <w:tab w:val="num" w:pos="2880"/>
+        </w:tabs>
+        <w:ind w:left="2880" w:hanging="360"/>
+      </w:pPr>
+    </w:lvl>
+    <w:lvl w:ilvl="7">
+      <w:start w:val="1"/>
+      <w:numFmt w:val="decimal"/>
+      <w:lvlText w:val="%8."/>
+      <w:lvlJc w:val="left"/>
+      <w:pPr>
+        <w:tabs>
+          <w:tab w:val="num" w:pos="3240"/>
+        </w:tabs>
+        <w:ind w:left="3240" w:hanging="360"/>
+      </w:pPr>
+    </w:lvl>
+    <w:lvl w:ilvl="8">
+      <w:start w:val="1"/>
+      <w:numFmt w:val="decimal"/>
+      <w:lvlText w:val="%9."/>
+      <w:lvlJc w:val="left"/>
+      <w:pPr>
+        <w:tabs>
+          <w:tab w:val="num" w:pos="3600"/>
+        </w:tabs>
+        <w:ind w:left="3600" w:hanging="360"/>
+      </w:pPr>
+    </w:lvl>
+  </w:abstractNum>
+  <w:abstractNum w:abstractNumId="13">
+    <w:lvl w:ilvl="0">
+      <w:start w:val="1"/>
+      <w:numFmt w:val="bullet"/>
+      <w:lvlText w:val=""/>
+      <w:lvlJc w:val="left"/>
+      <w:pPr>
+        <w:tabs>
+          <w:tab w:val="num" w:pos="720"/>
+        </w:tabs>
+        <w:ind w:left="720" w:hanging="283"/>
+      </w:pPr>
+      <w:rPr>
+        <w:rFonts w:ascii="Symbol" w:hAnsi="Symbol" w:cs="Symbol" w:hint="default"/>
+      </w:rPr>
+    </w:lvl>
+    <w:lvl w:ilvl="1">
+      <w:start w:val="1"/>
+      <w:numFmt w:val="decimal"/>
+      <w:lvlText w:val="%2."/>
+      <w:lvlJc w:val="left"/>
+      <w:pPr>
+        <w:tabs>
+          <w:tab w:val="num" w:pos="1080"/>
+        </w:tabs>
+        <w:ind w:left="1080" w:hanging="360"/>
+      </w:pPr>
+    </w:lvl>
+    <w:lvl w:ilvl="2">
+      <w:start w:val="1"/>
+      <w:numFmt w:val="decimal"/>
+      <w:lvlText w:val="%3."/>
+      <w:lvlJc w:val="left"/>
+      <w:pPr>
+        <w:tabs>
+          <w:tab w:val="num" w:pos="1440"/>
+        </w:tabs>
+        <w:ind w:left="1440" w:hanging="360"/>
+      </w:pPr>
+    </w:lvl>
+    <w:lvl w:ilvl="3">
+      <w:start w:val="1"/>
+      <w:numFmt w:val="decimal"/>
+      <w:lvlText w:val="%4."/>
+      <w:lvlJc w:val="left"/>
+      <w:pPr>
+        <w:tabs>
+          <w:tab w:val="num" w:pos="1800"/>
+        </w:tabs>
+        <w:ind w:left="1800" w:hanging="360"/>
+      </w:pPr>
+    </w:lvl>
+    <w:lvl w:ilvl="4">
+      <w:start w:val="1"/>
+      <w:numFmt w:val="decimal"/>
+      <w:lvlText w:val="%5."/>
+      <w:lvlJc w:val="left"/>
+      <w:pPr>
+        <w:tabs>
+          <w:tab w:val="num" w:pos="2160"/>
+        </w:tabs>
+        <w:ind w:left="2160" w:hanging="360"/>
+      </w:pPr>
+    </w:lvl>
+    <w:lvl w:ilvl="5">
+      <w:start w:val="1"/>
+      <w:numFmt w:val="decimal"/>
+      <w:lvlText w:val="%6."/>
+      <w:lvlJc w:val="left"/>
+      <w:pPr>
+        <w:tabs>
+          <w:tab w:val="num" w:pos="2520"/>
+        </w:tabs>
+        <w:ind w:left="2520" w:hanging="360"/>
+      </w:pPr>
+    </w:lvl>
+    <w:lvl w:ilvl="6">
+      <w:start w:val="1"/>
+      <w:numFmt w:val="decimal"/>
+      <w:lvlText w:val="%7."/>
+      <w:lvlJc w:val="left"/>
+      <w:pPr>
+        <w:tabs>
+          <w:tab w:val="num" w:pos="2880"/>
+        </w:tabs>
+        <w:ind w:left="2880" w:hanging="360"/>
+      </w:pPr>
+    </w:lvl>
+    <w:lvl w:ilvl="7">
+      <w:start w:val="1"/>
+      <w:numFmt w:val="decimal"/>
+      <w:lvlText w:val="%8."/>
+      <w:lvlJc w:val="left"/>
+      <w:pPr>
+        <w:tabs>
+          <w:tab w:val="num" w:pos="3240"/>
+        </w:tabs>
+        <w:ind w:left="3240" w:hanging="360"/>
+      </w:pPr>
+    </w:lvl>
+    <w:lvl w:ilvl="8">
+      <w:start w:val="1"/>
+      <w:numFmt w:val="decimal"/>
+      <w:lvlText w:val="%9."/>
+      <w:lvlJc w:val="left"/>
+      <w:pPr>
+        <w:tabs>
+          <w:tab w:val="num" w:pos="3600"/>
+        </w:tabs>
+        <w:ind w:left="3600" w:hanging="360"/>
+      </w:pPr>
+    </w:lvl>
+  </w:abstractNum>
+  <w:abstractNum w:abstractNumId="14">
+    <w:lvl w:ilvl="0">
+      <w:start w:val="1"/>
+      <w:numFmt w:val="bullet"/>
+      <w:lvlText w:val=""/>
+      <w:lvlJc w:val="left"/>
+      <w:pPr>
+        <w:tabs>
+          <w:tab w:val="num" w:pos="709"/>
+        </w:tabs>
+        <w:ind w:left="709" w:hanging="283"/>
+      </w:pPr>
+      <w:rPr>
+        <w:rFonts w:ascii="Symbol" w:hAnsi="Symbol" w:cs="Symbol" w:hint="default"/>
+      </w:rPr>
+    </w:lvl>
+    <w:lvl w:ilvl="1">
+      <w:start w:val="1"/>
+      <w:numFmt w:val="bullet"/>
+      <w:lvlText w:val=""/>
+      <w:lvlJc w:val="left"/>
+      <w:pPr>
+        <w:tabs>
+          <w:tab w:val="num" w:pos="1418"/>
+        </w:tabs>
+        <w:ind w:left="1418" w:hanging="283"/>
+      </w:pPr>
+      <w:rPr>
+        <w:rFonts w:ascii="Symbol" w:hAnsi="Symbol" w:cs="Symbol" w:hint="default"/>
+      </w:rPr>
+    </w:lvl>
+    <w:lvl w:ilvl="2">
+      <w:start w:val="1"/>
+      <w:numFmt w:val="bullet"/>
+      <w:lvlText w:val=""/>
+      <w:lvlJc w:val="left"/>
+      <w:pPr>
+        <w:tabs>
+          <w:tab w:val="num" w:pos="2127"/>
+        </w:tabs>
+        <w:ind w:left="2127" w:hanging="283"/>
+      </w:pPr>
+      <w:rPr>
+        <w:rFonts w:ascii="Symbol" w:hAnsi="Symbol" w:cs="Symbol" w:hint="default"/>
+      </w:rPr>
+    </w:lvl>
+    <w:lvl w:ilvl="3">
+      <w:start w:val="1"/>
+      <w:numFmt w:val="bullet"/>
+      <w:lvlText w:val=""/>
+      <w:lvlJc w:val="left"/>
+      <w:pPr>
+        <w:tabs>
+          <w:tab w:val="num" w:pos="2836"/>
+        </w:tabs>
+        <w:ind w:left="2836" w:hanging="283"/>
+      </w:pPr>
+      <w:rPr>
+        <w:rFonts w:ascii="Symbol" w:hAnsi="Symbol" w:cs="Symbol" w:hint="default"/>
+      </w:rPr>
+    </w:lvl>
+    <w:lvl w:ilvl="4">
+      <w:start w:val="1"/>
+      <w:numFmt w:val="bullet"/>
+      <w:lvlText w:val=""/>
+      <w:lvlJc w:val="left"/>
+      <w:pPr>
+        <w:tabs>
+          <w:tab w:val="num" w:pos="3545"/>
+        </w:tabs>
+        <w:ind w:left="3545" w:hanging="283"/>
+      </w:pPr>
+      <w:rPr>
+        <w:rFonts w:ascii="Symbol" w:hAnsi="Symbol" w:cs="Symbol" w:hint="default"/>
+      </w:rPr>
+    </w:lvl>
+    <w:lvl w:ilvl="5">
+      <w:start w:val="1"/>
+      <w:numFmt w:val="bullet"/>
+      <w:lvlText w:val=""/>
+      <w:lvlJc w:val="left"/>
+      <w:pPr>
+        <w:tabs>
+          <w:tab w:val="num" w:pos="4254"/>
+        </w:tabs>
+        <w:ind w:left="4254" w:hanging="283"/>
+      </w:pPr>
+      <w:rPr>
+        <w:rFonts w:ascii="Symbol" w:hAnsi="Symbol" w:cs="Symbol" w:hint="default"/>
+      </w:rPr>
+    </w:lvl>
+    <w:lvl w:ilvl="6">
+      <w:start w:val="1"/>
+      <w:numFmt w:val="bullet"/>
+      <w:lvlText w:val=""/>
+      <w:lvlJc w:val="left"/>
+      <w:pPr>
+        <w:tabs>
+          <w:tab w:val="num" w:pos="4963"/>
+        </w:tabs>
+        <w:ind w:left="4963" w:hanging="283"/>
+      </w:pPr>
+      <w:rPr>
+        <w:rFonts w:ascii="Symbol" w:hAnsi="Symbol" w:cs="Symbol" w:hint="default"/>
+      </w:rPr>
+    </w:lvl>
+    <w:lvl w:ilvl="7">
+      <w:start w:val="1"/>
+      <w:numFmt w:val="bullet"/>
+      <w:lvlText w:val=""/>
+      <w:lvlJc w:val="left"/>
+      <w:pPr>
+        <w:tabs>
+          <w:tab w:val="num" w:pos="5672"/>
+        </w:tabs>
+        <w:ind w:left="5672" w:hanging="283"/>
+      </w:pPr>
+      <w:rPr>
+        <w:rFonts w:ascii="Symbol" w:hAnsi="Symbol" w:cs="Symbol" w:hint="default"/>
+      </w:rPr>
+    </w:lvl>
+    <w:lvl w:ilvl="8">
+      <w:start w:val="1"/>
+      <w:numFmt w:val="bullet"/>
+      <w:lvlText w:val=""/>
+      <w:lvlJc w:val="left"/>
+      <w:pPr>
+        <w:tabs>
+          <w:tab w:val="num" w:pos="6381"/>
+        </w:tabs>
+        <w:ind w:left="6381" w:hanging="283"/>
+      </w:pPr>
+      <w:rPr>
+        <w:rFonts w:ascii="Symbol" w:hAnsi="Symbol" w:cs="Symbol" w:hint="default"/>
+      </w:rPr>
+    </w:lvl>
+  </w:abstractNum>
+  <w:abstractNum w:abstractNumId="15">
+    <w:lvl w:ilvl="0">
+      <w:start w:val="1"/>
+      <w:numFmt w:val="bullet"/>
+      <w:lvlText w:val=""/>
+      <w:lvlJc w:val="left"/>
+      <w:pPr>
+        <w:tabs>
+          <w:tab w:val="num" w:pos="720"/>
+        </w:tabs>
+        <w:ind w:left="720" w:hanging="283"/>
+      </w:pPr>
+      <w:rPr>
+        <w:rFonts w:ascii="Symbol" w:hAnsi="Symbol" w:cs="Symbol" w:hint="default"/>
+      </w:rPr>
+    </w:lvl>
+    <w:lvl w:ilvl="1">
+      <w:start w:val="1"/>
+      <w:numFmt w:val="decimal"/>
+      <w:lvlText w:val="%2."/>
+      <w:lvlJc w:val="left"/>
+      <w:pPr>
+        <w:tabs>
+          <w:tab w:val="num" w:pos="1080"/>
+        </w:tabs>
+        <w:ind w:left="1080" w:hanging="360"/>
+      </w:pPr>
+    </w:lvl>
+    <w:lvl w:ilvl="2">
+      <w:start w:val="1"/>
+      <w:numFmt w:val="decimal"/>
+      <w:lvlText w:val="%3."/>
+      <w:lvlJc w:val="left"/>
+      <w:pPr>
+        <w:tabs>
+          <w:tab w:val="num" w:pos="1440"/>
+        </w:tabs>
+        <w:ind w:left="1440" w:hanging="360"/>
+      </w:pPr>
+    </w:lvl>
+    <w:lvl w:ilvl="3">
+      <w:start w:val="1"/>
+      <w:numFmt w:val="decimal"/>
+      <w:lvlText w:val="%4."/>
+      <w:lvlJc w:val="left"/>
+      <w:pPr>
+        <w:tabs>
+          <w:tab w:val="num" w:pos="1800"/>
+        </w:tabs>
+        <w:ind w:left="1800" w:hanging="360"/>
+      </w:pPr>
+    </w:lvl>
+    <w:lvl w:ilvl="4">
+      <w:start w:val="1"/>
+      <w:numFmt w:val="decimal"/>
+      <w:lvlText w:val="%5."/>
+      <w:lvlJc w:val="left"/>
+      <w:pPr>
+        <w:tabs>
+          <w:tab w:val="num" w:pos="2160"/>
+        </w:tabs>
+        <w:ind w:left="2160" w:hanging="360"/>
+      </w:pPr>
+    </w:lvl>
+    <w:lvl w:ilvl="5">
+      <w:start w:val="1"/>
+      <w:numFmt w:val="decimal"/>
+      <w:lvlText w:val="%6."/>
+      <w:lvlJc w:val="left"/>
+      <w:pPr>
+        <w:tabs>
+          <w:tab w:val="num" w:pos="2520"/>
+        </w:tabs>
+        <w:ind w:left="2520" w:hanging="360"/>
+      </w:pPr>
+    </w:lvl>
+    <w:lvl w:ilvl="6">
+      <w:start w:val="1"/>
+      <w:numFmt w:val="decimal"/>
+      <w:lvlText w:val="%7."/>
+      <w:lvlJc w:val="left"/>
+      <w:pPr>
+        <w:tabs>
+          <w:tab w:val="num" w:pos="2880"/>
+        </w:tabs>
+        <w:ind w:left="2880" w:hanging="360"/>
+      </w:pPr>
+    </w:lvl>
+    <w:lvl w:ilvl="7">
+      <w:start w:val="1"/>
+      <w:numFmt w:val="decimal"/>
+      <w:lvlText w:val="%8."/>
+      <w:lvlJc w:val="left"/>
+      <w:pPr>
+        <w:tabs>
+          <w:tab w:val="num" w:pos="3240"/>
+        </w:tabs>
+        <w:ind w:left="3240" w:hanging="360"/>
+      </w:pPr>
+    </w:lvl>
+    <w:lvl w:ilvl="8">
+      <w:start w:val="1"/>
+      <w:numFmt w:val="decimal"/>
+      <w:lvlText w:val="%9."/>
+      <w:lvlJc w:val="left"/>
+      <w:pPr>
+        <w:tabs>
+          <w:tab w:val="num" w:pos="3600"/>
+        </w:tabs>
+        <w:ind w:left="3600" w:hanging="360"/>
+      </w:pPr>
+    </w:lvl>
+  </w:abstractNum>
+  <w:abstractNum w:abstractNumId="16">
+    <w:lvl w:ilvl="0">
+      <w:start w:val="1"/>
+      <w:numFmt w:val="bullet"/>
+      <w:lvlText w:val=""/>
+      <w:lvlJc w:val="left"/>
+      <w:pPr>
+        <w:tabs>
+          <w:tab w:val="num" w:pos="720"/>
+        </w:tabs>
+        <w:ind w:left="720" w:hanging="283"/>
+      </w:pPr>
+      <w:rPr>
+        <w:rFonts w:ascii="Symbol" w:hAnsi="Symbol" w:cs="Symbol" w:hint="default"/>
+      </w:rPr>
+    </w:lvl>
+    <w:lvl w:ilvl="1">
+      <w:start w:val="1"/>
+      <w:numFmt w:val="decimal"/>
+      <w:lvlText w:val="%2."/>
+      <w:lvlJc w:val="left"/>
+      <w:pPr>
+        <w:tabs>
+          <w:tab w:val="num" w:pos="1080"/>
+        </w:tabs>
+        <w:ind w:left="1080" w:hanging="360"/>
+      </w:pPr>
+    </w:lvl>
+    <w:lvl w:ilvl="2">
+      <w:start w:val="1"/>
+      <w:numFmt w:val="decimal"/>
+      <w:lvlText w:val="%3."/>
+      <w:lvlJc w:val="left"/>
+      <w:pPr>
+        <w:tabs>
+          <w:tab w:val="num" w:pos="1440"/>
+        </w:tabs>
+        <w:ind w:left="1440" w:hanging="360"/>
+      </w:pPr>
+    </w:lvl>
+    <w:lvl w:ilvl="3">
+      <w:start w:val="1"/>
+      <w:numFmt w:val="decimal"/>
+      <w:lvlText w:val="%4."/>
+      <w:lvlJc w:val="left"/>
+      <w:pPr>
+        <w:tabs>
+          <w:tab w:val="num" w:pos="1800"/>
+        </w:tabs>
+        <w:ind w:left="1800" w:hanging="360"/>
+      </w:pPr>
+    </w:lvl>
+    <w:lvl w:ilvl="4">
+      <w:start w:val="1"/>
+      <w:numFmt w:val="decimal"/>
+      <w:lvlText w:val="%5."/>
+      <w:lvlJc w:val="left"/>
+      <w:pPr>
+        <w:tabs>
+          <w:tab w:val="num" w:pos="2160"/>
+        </w:tabs>
+        <w:ind w:left="2160" w:hanging="360"/>
+      </w:pPr>
+    </w:lvl>
+    <w:lvl w:ilvl="5">
+      <w:start w:val="1"/>
+      <w:numFmt w:val="decimal"/>
+      <w:lvlText w:val="%6."/>
+      <w:lvlJc w:val="left"/>
+      <w:pPr>
+        <w:tabs>
+          <w:tab w:val="num" w:pos="2520"/>
+        </w:tabs>
+        <w:ind w:left="2520" w:hanging="360"/>
+      </w:pPr>
+    </w:lvl>
+    <w:lvl w:ilvl="6">
+      <w:start w:val="1"/>
+      <w:numFmt w:val="decimal"/>
+      <w:lvlText w:val="%7."/>
+      <w:lvlJc w:val="left"/>
+      <w:pPr>
+        <w:tabs>
+          <w:tab w:val="num" w:pos="2880"/>
+        </w:tabs>
+        <w:ind w:left="2880" w:hanging="360"/>
+      </w:pPr>
+    </w:lvl>
+    <w:lvl w:ilvl="7">
+      <w:start w:val="1"/>
+      <w:numFmt w:val="decimal"/>
+      <w:lvlText w:val="%8."/>
+      <w:lvlJc w:val="left"/>
+      <w:pPr>
+        <w:tabs>
+          <w:tab w:val="num" w:pos="3240"/>
+        </w:tabs>
+        <w:ind w:left="3240" w:hanging="360"/>
+      </w:pPr>
+    </w:lvl>
+    <w:lvl w:ilvl="8">
+      <w:start w:val="1"/>
+      <w:numFmt w:val="decimal"/>
+      <w:lvlText w:val="%9."/>
+      <w:lvlJc w:val="left"/>
+      <w:pPr>
+        <w:tabs>
+          <w:tab w:val="num" w:pos="3600"/>
+        </w:tabs>
+        <w:ind w:left="3600" w:hanging="360"/>
+      </w:pPr>
+    </w:lvl>
+  </w:abstractNum>
+  <w:abstractNum w:abstractNumId="17">
+    <w:lvl w:ilvl="0">
+      <w:start w:val="1"/>
+      <w:numFmt w:val="bullet"/>
+      <w:lvlText w:val=""/>
+      <w:lvlJc w:val="left"/>
+      <w:pPr>
+        <w:tabs>
+          <w:tab w:val="num" w:pos="720"/>
+        </w:tabs>
+        <w:ind w:left="720" w:hanging="283"/>
+      </w:pPr>
+      <w:rPr>
+        <w:rFonts w:ascii="Symbol" w:hAnsi="Symbol" w:cs="Symbol" w:hint="default"/>
+      </w:rPr>
+    </w:lvl>
+    <w:lvl w:ilvl="1">
+      <w:start w:val="1"/>
+      <w:numFmt w:val="decimal"/>
+      <w:lvlText w:val="%2."/>
+      <w:lvlJc w:val="left"/>
+      <w:pPr>
+        <w:tabs>
+          <w:tab w:val="num" w:pos="1080"/>
+        </w:tabs>
+        <w:ind w:left="1080" w:hanging="360"/>
+      </w:pPr>
+    </w:lvl>
+    <w:lvl w:ilvl="2">
+      <w:start w:val="1"/>
+      <w:numFmt w:val="decimal"/>
+      <w:lvlText w:val="%3."/>
+      <w:lvlJc w:val="left"/>
+      <w:pPr>
+        <w:tabs>
+          <w:tab w:val="num" w:pos="1440"/>
+        </w:tabs>
+        <w:ind w:left="1440" w:hanging="360"/>
+      </w:pPr>
+    </w:lvl>
+    <w:lvl w:ilvl="3">
+      <w:start w:val="1"/>
+      <w:numFmt w:val="decimal"/>
+      <w:lvlText w:val="%4."/>
+      <w:lvlJc w:val="left"/>
+      <w:pPr>
+        <w:tabs>
+          <w:tab w:val="num" w:pos="1800"/>
+        </w:tabs>
+        <w:ind w:left="1800" w:hanging="360"/>
+      </w:pPr>
+    </w:lvl>
+    <w:lvl w:ilvl="4">
+      <w:start w:val="1"/>
+      <w:numFmt w:val="decimal"/>
+      <w:lvlText w:val="%5."/>
+      <w:lvlJc w:val="left"/>
+      <w:pPr>
+        <w:tabs>
+          <w:tab w:val="num" w:pos="2160"/>
+        </w:tabs>
+        <w:ind w:left="2160" w:hanging="360"/>
+      </w:pPr>
+    </w:lvl>
+    <w:lvl w:ilvl="5">
+      <w:start w:val="1"/>
+      <w:numFmt w:val="decimal"/>
+      <w:lvlText w:val="%6."/>
+      <w:lvlJc w:val="left"/>
+      <w:pPr>
+        <w:tabs>
+          <w:tab w:val="num" w:pos="2520"/>
+        </w:tabs>
+        <w:ind w:left="2520" w:hanging="360"/>
+      </w:pPr>
+    </w:lvl>
+    <w:lvl w:ilvl="6">
+      <w:start w:val="1"/>
+      <w:numFmt w:val="decimal"/>
+      <w:lvlText w:val="%7."/>
+      <w:lvlJc w:val="left"/>
+      <w:pPr>
+        <w:tabs>
+          <w:tab w:val="num" w:pos="2880"/>
+        </w:tabs>
+        <w:ind w:left="2880" w:hanging="360"/>
+      </w:pPr>
+    </w:lvl>
+    <w:lvl w:ilvl="7">
+      <w:start w:val="1"/>
+      <w:numFmt w:val="decimal"/>
+      <w:lvlText w:val="%8."/>
+      <w:lvlJc w:val="left"/>
+      <w:pPr>
+        <w:tabs>
+          <w:tab w:val="num" w:pos="3240"/>
+        </w:tabs>
+        <w:ind w:left="3240" w:hanging="360"/>
+      </w:pPr>
+    </w:lvl>
+    <w:lvl w:ilvl="8">
+      <w:start w:val="1"/>
+      <w:numFmt w:val="decimal"/>
+      <w:lvlText w:val="%9."/>
+      <w:lvlJc w:val="left"/>
+      <w:pPr>
+        <w:tabs>
+          <w:tab w:val="num" w:pos="3600"/>
+        </w:tabs>
+        <w:ind w:left="3600" w:hanging="360"/>
+      </w:pPr>
+    </w:lvl>
+  </w:abstractNum>
+  <w:abstractNum w:abstractNumId="18">
+    <w:lvl w:ilvl="0">
+      <w:start w:val="1"/>
+      <w:numFmt w:val="bullet"/>
+      <w:lvlText w:val=""/>
+      <w:lvlJc w:val="left"/>
+      <w:pPr>
+        <w:tabs>
+          <w:tab w:val="num" w:pos="720"/>
+        </w:tabs>
+        <w:ind w:left="720" w:hanging="283"/>
+      </w:pPr>
+      <w:rPr>
+        <w:rFonts w:ascii="Symbol" w:hAnsi="Symbol" w:cs="Symbol" w:hint="default"/>
+      </w:rPr>
+    </w:lvl>
+    <w:lvl w:ilvl="1">
+      <w:start w:val="1"/>
+      <w:numFmt w:val="decimal"/>
+      <w:lvlText w:val="%2."/>
+      <w:lvlJc w:val="left"/>
+      <w:pPr>
+        <w:tabs>
+          <w:tab w:val="num" w:pos="1080"/>
+        </w:tabs>
+        <w:ind w:left="1080" w:hanging="360"/>
+      </w:pPr>
+    </w:lvl>
+    <w:lvl w:ilvl="2">
+      <w:start w:val="1"/>
+      <w:numFmt w:val="decimal"/>
+      <w:lvlText w:val="%3."/>
+      <w:lvlJc w:val="left"/>
+      <w:pPr>
+        <w:tabs>
+          <w:tab w:val="num" w:pos="1440"/>
+        </w:tabs>
+        <w:ind w:left="1440" w:hanging="360"/>
+      </w:pPr>
+    </w:lvl>
+    <w:lvl w:ilvl="3">
+      <w:start w:val="1"/>
+      <w:numFmt w:val="decimal"/>
+      <w:lvlText w:val="%4."/>
+      <w:lvlJc w:val="left"/>
+      <w:pPr>
+        <w:tabs>
+          <w:tab w:val="num" w:pos="1800"/>
+        </w:tabs>
+        <w:ind w:left="1800" w:hanging="360"/>
+      </w:pPr>
+    </w:lvl>
+    <w:lvl w:ilvl="4">
+      <w:start w:val="1"/>
+      <w:numFmt w:val="decimal"/>
+      <w:lvlText w:val="%5."/>
+      <w:lvlJc w:val="left"/>
+      <w:pPr>
+        <w:tabs>
+          <w:tab w:val="num" w:pos="2160"/>
+        </w:tabs>
+        <w:ind w:left="2160" w:hanging="360"/>
+      </w:pPr>
+    </w:lvl>
+    <w:lvl w:ilvl="5">
+      <w:start w:val="1"/>
+      <w:numFmt w:val="decimal"/>
+      <w:lvlText w:val="%6."/>
+      <w:lvlJc w:val="left"/>
+      <w:pPr>
+        <w:tabs>
+          <w:tab w:val="num" w:pos="2520"/>
+        </w:tabs>
+        <w:ind w:left="2520" w:hanging="360"/>
+      </w:pPr>
+    </w:lvl>
+    <w:lvl w:ilvl="6">
+      <w:start w:val="1"/>
+      <w:numFmt w:val="decimal"/>
+      <w:lvlText w:val="%7."/>
+      <w:lvlJc w:val="left"/>
+      <w:pPr>
+        <w:tabs>
+          <w:tab w:val="num" w:pos="2880"/>
+        </w:tabs>
+        <w:ind w:left="2880" w:hanging="360"/>
+      </w:pPr>
+    </w:lvl>
+    <w:lvl w:ilvl="7">
+      <w:start w:val="1"/>
+      <w:numFmt w:val="decimal"/>
+      <w:lvlText w:val="%8."/>
+      <w:lvlJc w:val="left"/>
+      <w:pPr>
+        <w:tabs>
+          <w:tab w:val="num" w:pos="3240"/>
+        </w:tabs>
+        <w:ind w:left="3240" w:hanging="360"/>
+      </w:pPr>
+    </w:lvl>
+    <w:lvl w:ilvl="8">
+      <w:start w:val="1"/>
+      <w:numFmt w:val="decimal"/>
+      <w:lvlText w:val="%9."/>
+      <w:lvlJc w:val="left"/>
+      <w:pPr>
+        <w:tabs>
+          <w:tab w:val="num" w:pos="3600"/>
+        </w:tabs>
+        <w:ind w:left="3600" w:hanging="360"/>
+      </w:pPr>
+    </w:lvl>
+  </w:abstractNum>
+  <w:abstractNum w:abstractNumId="19">
+    <w:lvl w:ilvl="0">
+      <w:start w:val="1"/>
+      <w:numFmt w:val="bullet"/>
+      <w:lvlText w:val=""/>
+      <w:lvlJc w:val="left"/>
+      <w:pPr>
+        <w:tabs>
+          <w:tab w:val="num" w:pos="720"/>
+        </w:tabs>
+        <w:ind w:left="720" w:hanging="283"/>
+      </w:pPr>
+      <w:rPr>
+        <w:rFonts w:ascii="Symbol" w:hAnsi="Symbol" w:cs="Symbol" w:hint="default"/>
+      </w:rPr>
+    </w:lvl>
+    <w:lvl w:ilvl="1">
+      <w:start w:val="1"/>
+      <w:numFmt w:val="decimal"/>
+      <w:lvlText w:val="%2."/>
+      <w:lvlJc w:val="left"/>
+      <w:pPr>
+        <w:tabs>
+          <w:tab w:val="num" w:pos="1080"/>
+        </w:tabs>
+        <w:ind w:left="1080" w:hanging="360"/>
+      </w:pPr>
+    </w:lvl>
+    <w:lvl w:ilvl="2">
+      <w:start w:val="1"/>
+      <w:numFmt w:val="decimal"/>
+      <w:lvlText w:val="%3."/>
+      <w:lvlJc w:val="left"/>
+      <w:pPr>
+        <w:tabs>
+          <w:tab w:val="num" w:pos="1440"/>
+        </w:tabs>
+        <w:ind w:left="1440" w:hanging="360"/>
+      </w:pPr>
+    </w:lvl>
+    <w:lvl w:ilvl="3">
+      <w:start w:val="1"/>
+      <w:numFmt w:val="decimal"/>
+      <w:lvlText w:val="%4."/>
+      <w:lvlJc w:val="left"/>
+      <w:pPr>
+        <w:tabs>
+          <w:tab w:val="num" w:pos="1800"/>
+        </w:tabs>
+        <w:ind w:left="1800" w:hanging="360"/>
+      </w:pPr>
+    </w:lvl>
+    <w:lvl w:ilvl="4">
+      <w:start w:val="1"/>
+      <w:numFmt w:val="decimal"/>
+      <w:lvlText w:val="%5."/>
+      <w:lvlJc w:val="left"/>
+      <w:pPr>
+        <w:tabs>
+          <w:tab w:val="num" w:pos="2160"/>
+        </w:tabs>
+        <w:ind w:left="2160" w:hanging="360"/>
+      </w:pPr>
+    </w:lvl>
+    <w:lvl w:ilvl="5">
+      <w:start w:val="1"/>
+      <w:numFmt w:val="decimal"/>
+      <w:lvlText w:val="%6."/>
+      <w:lvlJc w:val="left"/>
+      <w:pPr>
+        <w:tabs>
+          <w:tab w:val="num" w:pos="2520"/>
+        </w:tabs>
+        <w:ind w:left="2520" w:hanging="360"/>
+      </w:pPr>
+    </w:lvl>
+    <w:lvl w:ilvl="6">
+      <w:start w:val="1"/>
+      <w:numFmt w:val="decimal"/>
+      <w:lvlText w:val="%7."/>
+      <w:lvlJc w:val="left"/>
+      <w:pPr>
+        <w:tabs>
+          <w:tab w:val="num" w:pos="2880"/>
+        </w:tabs>
+        <w:ind w:left="2880" w:hanging="360"/>
+      </w:pPr>
+    </w:lvl>
+    <w:lvl w:ilvl="7">
+      <w:start w:val="1"/>
+      <w:numFmt w:val="decimal"/>
+      <w:lvlText w:val="%8."/>
+      <w:lvlJc w:val="left"/>
+      <w:pPr>
+        <w:tabs>
+          <w:tab w:val="num" w:pos="3240"/>
+        </w:tabs>
+        <w:ind w:left="3240" w:hanging="360"/>
+      </w:pPr>
+    </w:lvl>
+    <w:lvl w:ilvl="8">
+      <w:start w:val="1"/>
+      <w:numFmt w:val="decimal"/>
+      <w:lvlText w:val="%9."/>
+      <w:lvlJc w:val="left"/>
+      <w:pPr>
+        <w:tabs>
+          <w:tab w:val="num" w:pos="3600"/>
+        </w:tabs>
+        <w:ind w:left="3600" w:hanging="360"/>
+      </w:pPr>
+    </w:lvl>
+  </w:abstractNum>
+  <w:abstractNum w:abstractNumId="20">
+    <w:lvl w:ilvl="0">
+      <w:start w:val="1"/>
+      <w:numFmt w:val="bullet"/>
+      <w:lvlText w:val=""/>
+      <w:lvlJc w:val="left"/>
+      <w:pPr>
+        <w:tabs>
+          <w:tab w:val="num" w:pos="720"/>
+        </w:tabs>
+        <w:ind w:left="720" w:hanging="283"/>
+      </w:pPr>
+      <w:rPr>
+        <w:rFonts w:ascii="Symbol" w:hAnsi="Symbol" w:cs="Symbol" w:hint="default"/>
+      </w:rPr>
+    </w:lvl>
+    <w:lvl w:ilvl="1">
+      <w:start w:val="1"/>
+      <w:numFmt w:val="decimal"/>
+      <w:lvlText w:val="%2."/>
+      <w:lvlJc w:val="left"/>
+      <w:pPr>
+        <w:tabs>
+          <w:tab w:val="num" w:pos="1080"/>
+        </w:tabs>
+        <w:ind w:left="1080" w:hanging="360"/>
+      </w:pPr>
+    </w:lvl>
+    <w:lvl w:ilvl="2">
+      <w:start w:val="1"/>
+      <w:numFmt w:val="decimal"/>
+      <w:lvlText w:val="%3."/>
+      <w:lvlJc w:val="left"/>
+      <w:pPr>
+        <w:tabs>
+          <w:tab w:val="num" w:pos="1440"/>
+        </w:tabs>
+        <w:ind w:left="1440" w:hanging="360"/>
+      </w:pPr>
+    </w:lvl>
+    <w:lvl w:ilvl="3">
+      <w:start w:val="1"/>
+      <w:numFmt w:val="decimal"/>
+      <w:lvlText w:val="%4."/>
+      <w:lvlJc w:val="left"/>
+      <w:pPr>
+        <w:tabs>
+          <w:tab w:val="num" w:pos="1800"/>
+        </w:tabs>
+        <w:ind w:left="1800" w:hanging="360"/>
+      </w:pPr>
+    </w:lvl>
+    <w:lvl w:ilvl="4">
+      <w:start w:val="1"/>
+      <w:numFmt w:val="decimal"/>
+      <w:lvlText w:val="%5."/>
+      <w:lvlJc w:val="left"/>
+      <w:pPr>
+        <w:tabs>
+          <w:tab w:val="num" w:pos="2160"/>
+        </w:tabs>
+        <w:ind w:left="2160" w:hanging="360"/>
+      </w:pPr>
+    </w:lvl>
+    <w:lvl w:ilvl="5">
+      <w:start w:val="1"/>
+      <w:numFmt w:val="decimal"/>
+      <w:lvlText w:val="%6."/>
+      <w:lvlJc w:val="left"/>
+      <w:pPr>
+        <w:tabs>
+          <w:tab w:val="num" w:pos="2520"/>
+        </w:tabs>
+        <w:ind w:left="2520" w:hanging="360"/>
+      </w:pPr>
+    </w:lvl>
+    <w:lvl w:ilvl="6">
+      <w:start w:val="1"/>
+      <w:numFmt w:val="decimal"/>
+      <w:lvlText w:val="%7."/>
+      <w:lvlJc w:val="left"/>
+      <w:pPr>
+        <w:tabs>
+          <w:tab w:val="num" w:pos="2880"/>
+        </w:tabs>
+        <w:ind w:left="2880" w:hanging="360"/>
+      </w:pPr>
+    </w:lvl>
+    <w:lvl w:ilvl="7">
+      <w:start w:val="1"/>
+      <w:numFmt w:val="decimal"/>
+      <w:lvlText w:val="%8."/>
+      <w:lvlJc w:val="left"/>
+      <w:pPr>
+        <w:tabs>
+          <w:tab w:val="num" w:pos="3240"/>
+        </w:tabs>
+        <w:ind w:left="3240" w:hanging="360"/>
+      </w:pPr>
+    </w:lvl>
+    <w:lvl w:ilvl="8">
+      <w:start w:val="1"/>
+      <w:numFmt w:val="decimal"/>
+      <w:lvlText w:val="%9."/>
+      <w:lvlJc w:val="left"/>
+      <w:pPr>
+        <w:tabs>
+          <w:tab w:val="num" w:pos="3600"/>
+        </w:tabs>
+        <w:ind w:left="3600" w:hanging="360"/>
+      </w:pPr>
+    </w:lvl>
+  </w:abstractNum>
+  <w:abstractNum w:abstractNumId="21">
+    <w:lvl w:ilvl="0">
+      <w:start w:val="1"/>
+      <w:numFmt w:val="bullet"/>
+      <w:lvlText w:val=""/>
+      <w:lvlJc w:val="left"/>
+      <w:pPr>
+        <w:tabs>
+          <w:tab w:val="num" w:pos="720"/>
+        </w:tabs>
+        <w:ind w:left="720" w:hanging="283"/>
+      </w:pPr>
+      <w:rPr>
+        <w:rFonts w:ascii="Symbol" w:hAnsi="Symbol" w:cs="Symbol" w:hint="default"/>
+      </w:rPr>
+    </w:lvl>
+    <w:lvl w:ilvl="1">
+      <w:start w:val="1"/>
+      <w:numFmt w:val="decimal"/>
+      <w:lvlText w:val="%2."/>
+      <w:lvlJc w:val="left"/>
+      <w:pPr>
+        <w:tabs>
+          <w:tab w:val="num" w:pos="1080"/>
+        </w:tabs>
+        <w:ind w:left="1080" w:hanging="360"/>
+      </w:pPr>
+    </w:lvl>
+    <w:lvl w:ilvl="2">
+      <w:start w:val="1"/>
+      <w:numFmt w:val="decimal"/>
+      <w:lvlText w:val="%3."/>
+      <w:lvlJc w:val="left"/>
+      <w:pPr>
+        <w:tabs>
+          <w:tab w:val="num" w:pos="1440"/>
+        </w:tabs>
+        <w:ind w:left="1440" w:hanging="360"/>
+      </w:pPr>
+    </w:lvl>
+    <w:lvl w:ilvl="3">
+      <w:start w:val="1"/>
+      <w:numFmt w:val="decimal"/>
+      <w:lvlText w:val="%4."/>
+      <w:lvlJc w:val="left"/>
+      <w:pPr>
+        <w:tabs>
+          <w:tab w:val="num" w:pos="1800"/>
+        </w:tabs>
+        <w:ind w:left="1800" w:hanging="360"/>
+      </w:pPr>
+    </w:lvl>
+    <w:lvl w:ilvl="4">
+      <w:start w:val="1"/>
+      <w:numFmt w:val="decimal"/>
+      <w:lvlText w:val="%5."/>
+      <w:lvlJc w:val="left"/>
+      <w:pPr>
+        <w:tabs>
+          <w:tab w:val="num" w:pos="2160"/>
+        </w:tabs>
+        <w:ind w:left="2160" w:hanging="360"/>
+      </w:pPr>
+    </w:lvl>
+    <w:lvl w:ilvl="5">
+      <w:start w:val="1"/>
+      <w:numFmt w:val="decimal"/>
+      <w:lvlText w:val="%6."/>
+      <w:lvlJc w:val="left"/>
+      <w:pPr>
+        <w:tabs>
+          <w:tab w:val="num" w:pos="2520"/>
+        </w:tabs>
+        <w:ind w:left="2520" w:hanging="360"/>
+      </w:pPr>
+    </w:lvl>
+    <w:lvl w:ilvl="6">
+      <w:start w:val="1"/>
+      <w:numFmt w:val="decimal"/>
+      <w:lvlText w:val="%7."/>
+      <w:lvlJc w:val="left"/>
+      <w:pPr>
+        <w:tabs>
+          <w:tab w:val="num" w:pos="2880"/>
+        </w:tabs>
+        <w:ind w:left="2880" w:hanging="360"/>
+      </w:pPr>
+    </w:lvl>
+    <w:lvl w:ilvl="7">
+      <w:start w:val="1"/>
+      <w:numFmt w:val="decimal"/>
+      <w:lvlText w:val="%8."/>
+      <w:lvlJc w:val="left"/>
+      <w:pPr>
+        <w:tabs>
+          <w:tab w:val="num" w:pos="3240"/>
+        </w:tabs>
+        <w:ind w:left="3240" w:hanging="360"/>
+      </w:pPr>
+    </w:lvl>
+    <w:lvl w:ilvl="8">
+      <w:start w:val="1"/>
+      <w:numFmt w:val="decimal"/>
+      <w:lvlText w:val="%9."/>
+      <w:lvlJc w:val="left"/>
+      <w:pPr>
+        <w:tabs>
+          <w:tab w:val="num" w:pos="3600"/>
+        </w:tabs>
+        <w:ind w:left="3600" w:hanging="360"/>
+      </w:pPr>
+    </w:lvl>
+  </w:abstractNum>
+  <w:abstractNum w:abstractNumId="22">
+    <w:lvl w:ilvl="0">
+      <w:start w:val="1"/>
+      <w:numFmt w:val="bullet"/>
+      <w:lvlText w:val=""/>
+      <w:lvlJc w:val="left"/>
+      <w:pPr>
+        <w:tabs>
+          <w:tab w:val="num" w:pos="709"/>
+        </w:tabs>
+        <w:ind w:left="709" w:hanging="283"/>
+      </w:pPr>
+      <w:rPr>
+        <w:rFonts w:ascii="Symbol" w:hAnsi="Symbol" w:cs="Symbol" w:hint="default"/>
+      </w:rPr>
+    </w:lvl>
+    <w:lvl w:ilvl="1">
+      <w:start w:val="1"/>
+      <w:numFmt w:val="bullet"/>
+      <w:lvlText w:val=""/>
+      <w:lvlJc w:val="left"/>
+      <w:pPr>
+        <w:tabs>
+          <w:tab w:val="num" w:pos="1418"/>
+        </w:tabs>
+        <w:ind w:left="1418" w:hanging="283"/>
+      </w:pPr>
+      <w:rPr>
+        <w:rFonts w:ascii="Symbol" w:hAnsi="Symbol" w:cs="Symbol" w:hint="default"/>
+      </w:rPr>
+    </w:lvl>
+    <w:lvl w:ilvl="2">
+      <w:start w:val="1"/>
+      <w:numFmt w:val="bullet"/>
+      <w:lvlText w:val=""/>
+      <w:lvlJc w:val="left"/>
+      <w:pPr>
+        <w:tabs>
+          <w:tab w:val="num" w:pos="2127"/>
+        </w:tabs>
+        <w:ind w:left="2127" w:hanging="283"/>
+      </w:pPr>
+      <w:rPr>
+        <w:rFonts w:ascii="Symbol" w:hAnsi="Symbol" w:cs="Symbol" w:hint="default"/>
+      </w:rPr>
+    </w:lvl>
+    <w:lvl w:ilvl="3">
+      <w:start w:val="1"/>
+      <w:numFmt w:val="bullet"/>
+      <w:lvlText w:val=""/>
+      <w:lvlJc w:val="left"/>
+      <w:pPr>
+        <w:tabs>
+          <w:tab w:val="num" w:pos="2836"/>
+        </w:tabs>
+        <w:ind w:left="2836" w:hanging="283"/>
+      </w:pPr>
+      <w:rPr>
+        <w:rFonts w:ascii="Symbol" w:hAnsi="Symbol" w:cs="Symbol" w:hint="default"/>
+      </w:rPr>
+    </w:lvl>
+    <w:lvl w:ilvl="4">
+      <w:start w:val="1"/>
+      <w:numFmt w:val="bullet"/>
+      <w:lvlText w:val=""/>
+      <w:lvlJc w:val="left"/>
+      <w:pPr>
+        <w:tabs>
+          <w:tab w:val="num" w:pos="3545"/>
+        </w:tabs>
+        <w:ind w:left="3545" w:hanging="283"/>
+      </w:pPr>
+      <w:rPr>
+        <w:rFonts w:ascii="Symbol" w:hAnsi="Symbol" w:cs="Symbol" w:hint="default"/>
+      </w:rPr>
+    </w:lvl>
+    <w:lvl w:ilvl="5">
+      <w:start w:val="1"/>
+      <w:numFmt w:val="bullet"/>
+      <w:lvlText w:val=""/>
+      <w:lvlJc w:val="left"/>
+      <w:pPr>
+        <w:tabs>
+          <w:tab w:val="num" w:pos="4254"/>
+        </w:tabs>
+        <w:ind w:left="4254" w:hanging="283"/>
+      </w:pPr>
+      <w:rPr>
+        <w:rFonts w:ascii="Symbol" w:hAnsi="Symbol" w:cs="Symbol" w:hint="default"/>
+      </w:rPr>
+    </w:lvl>
+    <w:lvl w:ilvl="6">
+      <w:start w:val="1"/>
+      <w:numFmt w:val="bullet"/>
+      <w:lvlText w:val=""/>
+      <w:lvlJc w:val="left"/>
+      <w:pPr>
+        <w:tabs>
+          <w:tab w:val="num" w:pos="4963"/>
+        </w:tabs>
+        <w:ind w:left="4963" w:hanging="283"/>
+      </w:pPr>
+      <w:rPr>
+        <w:rFonts w:ascii="Symbol" w:hAnsi="Symbol" w:cs="Symbol" w:hint="default"/>
+      </w:rPr>
+    </w:lvl>
+    <w:lvl w:ilvl="7">
+      <w:start w:val="1"/>
+      <w:numFmt w:val="bullet"/>
+      <w:lvlText w:val=""/>
+      <w:lvlJc w:val="left"/>
+      <w:pPr>
+        <w:tabs>
+          <w:tab w:val="num" w:pos="5672"/>
+        </w:tabs>
+        <w:ind w:left="5672" w:hanging="283"/>
+      </w:pPr>
+      <w:rPr>
+        <w:rFonts w:ascii="Symbol" w:hAnsi="Symbol" w:cs="Symbol" w:hint="default"/>
+      </w:rPr>
+    </w:lvl>
+    <w:lvl w:ilvl="8">
+      <w:start w:val="1"/>
+      <w:numFmt w:val="bullet"/>
+      <w:lvlText w:val=""/>
+      <w:lvlJc w:val="left"/>
+      <w:pPr>
+        <w:tabs>
+          <w:tab w:val="num" w:pos="6381"/>
+        </w:tabs>
+        <w:ind w:left="6381" w:hanging="283"/>
+      </w:pPr>
+      <w:rPr>
+        <w:rFonts w:ascii="Symbol" w:hAnsi="Symbol" w:cs="Symbol" w:hint="default"/>
+      </w:rPr>
+    </w:lvl>
+  </w:abstractNum>
+  <w:abstractNum w:abstractNumId="23">
+    <w:lvl w:ilvl="0">
+      <w:start w:val="1"/>
       <w:numFmt w:val="none"/>
       <w:suff w:val="nothing"/>
       <w:lvlText w:val=""/>
@@ -21621,6 +25339,69 @@
     <w:abstractNumId w:val="2"/>
   </w:num>
   <w:num w:numId="3">
+    <w:abstractNumId w:val="3"/>
+  </w:num>
+  <w:num w:numId="4">
+    <w:abstractNumId w:val="4"/>
+  </w:num>
+  <w:num w:numId="5">
+    <w:abstractNumId w:val="5"/>
+  </w:num>
+  <w:num w:numId="6">
+    <w:abstractNumId w:val="6"/>
+  </w:num>
+  <w:num w:numId="7">
+    <w:abstractNumId w:val="7"/>
+  </w:num>
+  <w:num w:numId="8">
+    <w:abstractNumId w:val="8"/>
+  </w:num>
+  <w:num w:numId="9">
+    <w:abstractNumId w:val="9"/>
+  </w:num>
+  <w:num w:numId="10">
+    <w:abstractNumId w:val="10"/>
+  </w:num>
+  <w:num w:numId="11">
+    <w:abstractNumId w:val="11"/>
+  </w:num>
+  <w:num w:numId="12">
+    <w:abstractNumId w:val="12"/>
+  </w:num>
+  <w:num w:numId="13">
+    <w:abstractNumId w:val="13"/>
+  </w:num>
+  <w:num w:numId="14">
+    <w:abstractNumId w:val="14"/>
+  </w:num>
+  <w:num w:numId="15">
+    <w:abstractNumId w:val="15"/>
+  </w:num>
+  <w:num w:numId="16">
+    <w:abstractNumId w:val="16"/>
+  </w:num>
+  <w:num w:numId="17">
+    <w:abstractNumId w:val="17"/>
+  </w:num>
+  <w:num w:numId="18">
+    <w:abstractNumId w:val="18"/>
+  </w:num>
+  <w:num w:numId="19">
+    <w:abstractNumId w:val="19"/>
+  </w:num>
+  <w:num w:numId="20">
+    <w:abstractNumId w:val="20"/>
+  </w:num>
+  <w:num w:numId="21">
+    <w:abstractNumId w:val="21"/>
+  </w:num>
+  <w:num w:numId="22">
+    <w:abstractNumId w:val="22"/>
+  </w:num>
+  <w:num w:numId="23">
+    <w:abstractNumId w:val="23"/>
+  </w:num>
+  <w:num w:numId="24">
     <w:abstractNumId w:val="1"/>
     <w:lvlOverride w:ilvl="0">
       <w:startOverride w:val="1"/>
@@ -21795,6 +25576,13 @@
     <w:qFormat/>
     <w:rPr>
       <w:rFonts w:ascii="Liberation Mono" w:hAnsi="Liberation Mono" w:eastAsia="Noto Sans Mono CJK SC" w:cs="Liberation Mono"/>
+    </w:rPr>
+  </w:style>
+  <w:style w:type="character" w:styleId="Bullets">
+    <w:name w:val="Bullets"/>
+    <w:qFormat/>
+    <w:rPr>
+      <w:rFonts w:ascii="OpenSymbol" w:hAnsi="OpenSymbol" w:eastAsia="OpenSymbol" w:cs="OpenSymbol"/>
     </w:rPr>
   </w:style>
   <w:style w:type="paragraph" w:styleId="Heading">
@@ -21960,6 +25748,19 @@
       <w:bCs/>
     </w:rPr>
   </w:style>
+  <w:style w:type="paragraph" w:styleId="PreformattedText">
+    <w:name w:val="Preformatted Text"/>
+    <w:basedOn w:val="Normal"/>
+    <w:qFormat/>
+    <w:pPr>
+      <w:spacing w:before="0" w:after="0"/>
+    </w:pPr>
+    <w:rPr>
+      <w:rFonts w:ascii="Liberation Mono" w:hAnsi="Liberation Mono" w:eastAsia="Noto Sans Mono CJK SC" w:cs="Liberation Mono"/>
+      <w:sz w:val="20"/>
+      <w:szCs w:val="20"/>
+    </w:rPr>
+  </w:style>
 </w:styles>
 </file>
 

</xml_diff>